<commit_message>
Revise KP: NIC 1143, 49× 4MBIR-28-TMLW, PTZ 2BPBDD-4794-20 with ST-1
Replace the unidentified 4BHNN0 cameras with the requested models, require ST-1 on all cameras, pick the cheapest RUWARE PTZ that has ST-1, and regenerate Word and Excel quotes (revision 2).

Co-authored-by: Yury1331 <Yury1331@users.noreply.github.com>
</commit_message>
<xml_diff>
--- a/kp/2026-08-14-neurostation-4bhnn0/КП-2026-08-14-001_NeuroStation_Astra_9800R_4BHNN0.docx
+++ b/kp/2026-08-14-neurostation-4bhnn0/КП-2026-08-14-001_NeuroStation_Astra_9800R_4BHNN0.docx
@@ -29,7 +29,7 @@
           <w:color w:val="1F4E79"/>
           <w:sz w:val="26"/>
         </w:rPr>
-        <w:t>№ КП-2026-08-14-001 от 14 августа 2026 г.</w:t>
+        <w:t>№ КП-2026-08-14-001, редакция 2 от 14 августа 2026 г.</w:t>
       </w:r>
     </w:p>
     <w:p>
@@ -44,7 +44,7 @@
           <w:color w:val="000000"/>
           <w:sz w:val="22"/>
         </w:rPr>
-        <w:t>Предмет: поставка видеорегистраторов TRASSIR NeuroStation Astra 9800R/128-S и цифровых камер видеонаблюдения 4BHNN0-0-0-0. Валюта — российский рубль. НДС включён в цены (ставка 22%). Срок действия цен — 14 календарных дней (до 28.08.2026).</w:t>
+        <w:t>Предмет: поставка 2 видеорегистраторов TRASSIR NeuroStation Astra 9800R/128-S и 51 камеры (1× НИЦ 1143, 49× РУВЕР 4MBIR-28-TMLW, 1× PTZ 2BPBDD-4794-20). Все камеры — со СТ-1. Валюта — российский рубль. НДС включён в цены (ставка 22%). Срок действия цен — до 28.08.2026.</w:t>
       </w:r>
     </w:p>
     <w:p>
@@ -59,7 +59,7 @@
           <w:color w:val="595959"/>
           <w:sz w:val="20"/>
         </w:rPr>
-        <w:t>Документ — ориентировочный расчёт поставки по открытым ценам на 14.08.2026. Итоговая цена, наличие и срок фиксируются в официальном КП DSSL / авторизованного дилера TRASSIR и НИЦ «Технологии».</w:t>
+        <w:t>Документ — ориентировочный расчёт по открытым ценам на 14.08.2026. Итоговая цена, наличие, срок и выдача СТ-1 на партию фиксируются в официальном КП DSSL, НИЦ «Технологии» и ООО «Айпи Плюс».</w:t>
       </w:r>
     </w:p>
     <w:tbl>
@@ -244,7 +244,7 @@
                 <w:color w:val="000000"/>
                 <w:sz w:val="20"/>
               </w:rPr>
-              <w:t>к заполнению (ориентир: дилеры TRASSIR / DSSL, НИЦ «Технологии»)</w:t>
+              <w:t>к заполнению (DSSL / TRASSIR, НИЦ «Технологии», ООО «Айпи Плюс» / РУВЕР)</w:t>
             </w:r>
           </w:p>
         </w:tc>
@@ -303,7 +303,7 @@
                 <w:color w:val="000000"/>
                 <w:sz w:val="20"/>
               </w:rPr>
-              <w:t>регистраторы: 5–15 раб. дней при наличии; камеры НИЦ: под заказ</w:t>
+              <w:t>регистраторы: 5–15 раб. дней при наличии; камеры — под заказ</w:t>
             </w:r>
           </w:p>
         </w:tc>
@@ -390,18 +390,19 @@
         <w:tblLook w:firstColumn="1" w:firstRow="1" w:lastColumn="0" w:lastRow="0" w:noHBand="0" w:noVBand="1" w:val="04A0"/>
       </w:tblPr>
       <w:tblGrid>
-        <w:gridCol w:w="1458"/>
-        <w:gridCol w:w="1458"/>
-        <w:gridCol w:w="1458"/>
-        <w:gridCol w:w="1458"/>
-        <w:gridCol w:w="1458"/>
-        <w:gridCol w:w="1458"/>
-        <w:gridCol w:w="1458"/>
+        <w:gridCol w:w="1276"/>
+        <w:gridCol w:w="1276"/>
+        <w:gridCol w:w="1276"/>
+        <w:gridCol w:w="1276"/>
+        <w:gridCol w:w="1276"/>
+        <w:gridCol w:w="1276"/>
+        <w:gridCol w:w="1276"/>
+        <w:gridCol w:w="1276"/>
       </w:tblGrid>
       <w:tr>
         <w:tc>
           <w:tcPr>
-            <w:tcW w:type="dxa" w:w="1458"/>
+            <w:tcW w:type="dxa" w:w="1276"/>
             <w:shd w:fill="1F4E79" w:val="clear"/>
             <w:tcBorders>
               <w:top w:val="single" w:sz="4" w:space="0" w:color="BFBFBF"/>
@@ -430,7 +431,7 @@
         </w:tc>
         <w:tc>
           <w:tcPr>
-            <w:tcW w:type="dxa" w:w="1458"/>
+            <w:tcW w:type="dxa" w:w="1276"/>
             <w:shd w:fill="1F4E79" w:val="clear"/>
             <w:tcBorders>
               <w:top w:val="single" w:sz="4" w:space="0" w:color="BFBFBF"/>
@@ -459,7 +460,7 @@
         </w:tc>
         <w:tc>
           <w:tcPr>
-            <w:tcW w:type="dxa" w:w="1458"/>
+            <w:tcW w:type="dxa" w:w="1276"/>
             <w:shd w:fill="1F4E79" w:val="clear"/>
             <w:tcBorders>
               <w:top w:val="single" w:sz="4" w:space="0" w:color="BFBFBF"/>
@@ -488,7 +489,36 @@
         </w:tc>
         <w:tc>
           <w:tcPr>
-            <w:tcW w:type="dxa" w:w="1458"/>
+            <w:tcW w:type="dxa" w:w="1276"/>
+            <w:shd w:fill="1F4E79" w:val="clear"/>
+            <w:tcBorders>
+              <w:top w:val="single" w:sz="4" w:space="0" w:color="BFBFBF"/>
+              <w:left w:val="single" w:sz="4" w:space="0" w:color="BFBFBF"/>
+              <w:bottom w:val="single" w:sz="4" w:space="0" w:color="BFBFBF"/>
+              <w:right w:val="single" w:sz="4" w:space="0" w:color="BFBFBF"/>
+            </w:tcBorders>
+            <w:vAlign w:val="center"/>
+          </w:tcPr>
+          <w:p>
+            <w:pPr>
+              <w:spacing w:before="40" w:after="40"/>
+              <w:jc w:val="center"/>
+            </w:pPr>
+            <w:r/>
+            <w:r>
+              <w:rPr>
+                <w:rFonts w:ascii="Times New Roman" w:hAnsi="Times New Roman" w:cs="Times New Roman" w:eastAsia="Times New Roman"/>
+                <w:b/>
+                <w:color w:val="FFFFFF"/>
+                <w:sz w:val="16"/>
+              </w:rPr>
+              <w:t>СТ-1</w:t>
+            </w:r>
+          </w:p>
+        </w:tc>
+        <w:tc>
+          <w:tcPr>
+            <w:tcW w:type="dxa" w:w="1276"/>
             <w:shd w:fill="1F4E79" w:val="clear"/>
             <w:tcBorders>
               <w:top w:val="single" w:sz="4" w:space="0" w:color="BFBFBF"/>
@@ -517,7 +547,7 @@
         </w:tc>
         <w:tc>
           <w:tcPr>
-            <w:tcW w:type="dxa" w:w="1458"/>
+            <w:tcW w:type="dxa" w:w="1276"/>
             <w:shd w:fill="1F4E79" w:val="clear"/>
             <w:tcBorders>
               <w:top w:val="single" w:sz="4" w:space="0" w:color="BFBFBF"/>
@@ -546,7 +576,7 @@
         </w:tc>
         <w:tc>
           <w:tcPr>
-            <w:tcW w:type="dxa" w:w="1458"/>
+            <w:tcW w:type="dxa" w:w="1276"/>
             <w:shd w:fill="1F4E79" w:val="clear"/>
             <w:tcBorders>
               <w:top w:val="single" w:sz="4" w:space="0" w:color="BFBFBF"/>
@@ -575,7 +605,7 @@
         </w:tc>
         <w:tc>
           <w:tcPr>
-            <w:tcW w:type="dxa" w:w="1458"/>
+            <w:tcW w:type="dxa" w:w="1276"/>
             <w:shd w:fill="1F4E79" w:val="clear"/>
             <w:tcBorders>
               <w:top w:val="single" w:sz="4" w:space="0" w:color="BFBFBF"/>
@@ -606,7 +636,7 @@
       <w:tr>
         <w:tc>
           <w:tcPr>
-            <w:tcW w:type="dxa" w:w="1458"/>
+            <w:tcW w:type="dxa" w:w="1276"/>
             <w:shd w:fill="F2F2F2" w:val="clear"/>
             <w:tcBorders>
               <w:top w:val="single" w:sz="4" w:space="0" w:color="BFBFBF"/>
@@ -635,7 +665,7 @@
         </w:tc>
         <w:tc>
           <w:tcPr>
-            <w:tcW w:type="dxa" w:w="1458"/>
+            <w:tcW w:type="dxa" w:w="1276"/>
             <w:shd w:fill="F2F2F2" w:val="clear"/>
             <w:tcBorders>
               <w:top w:val="single" w:sz="4" w:space="0" w:color="BFBFBF"/>
@@ -658,13 +688,13 @@
                 <w:color w:val="000000"/>
                 <w:sz w:val="16"/>
               </w:rPr>
-              <w:t>IP-видеорегистратор TRASSIR NeuroStation Astra 9800R/128-S, 128 кан., Astra Linux SE «Смоленск», 8×HDD 3.5" (диски не входят), 2 лицензии Neuro Detector</w:t>
+              <w:t>IP-видеорегистратор TRASSIR NeuroStation Astra 9800R/128-S, 128 кан., Astra Linux SE «Смоленск», 8×HDD (диски не входят), 2× Neuro Detector</w:t>
             </w:r>
           </w:p>
         </w:tc>
         <w:tc>
           <w:tcPr>
-            <w:tcW w:type="dxa" w:w="1458"/>
+            <w:tcW w:type="dxa" w:w="1276"/>
             <w:shd w:fill="F2F2F2" w:val="clear"/>
             <w:tcBorders>
               <w:top w:val="single" w:sz="4" w:space="0" w:color="BFBFBF"/>
@@ -693,7 +723,36 @@
         </w:tc>
         <w:tc>
           <w:tcPr>
-            <w:tcW w:type="dxa" w:w="1458"/>
+            <w:tcW w:type="dxa" w:w="1276"/>
+            <w:shd w:fill="F2F2F2" w:val="clear"/>
+            <w:tcBorders>
+              <w:top w:val="single" w:sz="4" w:space="0" w:color="BFBFBF"/>
+              <w:left w:val="single" w:sz="4" w:space="0" w:color="BFBFBF"/>
+              <w:bottom w:val="single" w:sz="4" w:space="0" w:color="BFBFBF"/>
+              <w:right w:val="single" w:sz="4" w:space="0" w:color="BFBFBF"/>
+            </w:tcBorders>
+            <w:vAlign w:val="center"/>
+          </w:tcPr>
+          <w:p>
+            <w:pPr>
+              <w:spacing w:before="40" w:after="40"/>
+              <w:jc w:val="center"/>
+            </w:pPr>
+            <w:r/>
+            <w:r>
+              <w:rPr>
+                <w:rFonts w:ascii="Times New Roman" w:hAnsi="Times New Roman" w:cs="Times New Roman" w:eastAsia="Times New Roman"/>
+                <w:b w:val="0"/>
+                <w:color w:val="000000"/>
+                <w:sz w:val="16"/>
+              </w:rPr>
+              <w:t>да</w:t>
+            </w:r>
+          </w:p>
+        </w:tc>
+        <w:tc>
+          <w:tcPr>
+            <w:tcW w:type="dxa" w:w="1276"/>
             <w:shd w:fill="F2F2F2" w:val="clear"/>
             <w:tcBorders>
               <w:top w:val="single" w:sz="4" w:space="0" w:color="BFBFBF"/>
@@ -722,7 +781,7 @@
         </w:tc>
         <w:tc>
           <w:tcPr>
-            <w:tcW w:type="dxa" w:w="1458"/>
+            <w:tcW w:type="dxa" w:w="1276"/>
             <w:shd w:fill="F2F2F2" w:val="clear"/>
             <w:tcBorders>
               <w:top w:val="single" w:sz="4" w:space="0" w:color="BFBFBF"/>
@@ -735,7 +794,7 @@
           <w:p>
             <w:pPr>
               <w:spacing w:before="40" w:after="40"/>
-              <w:jc w:val="center"/>
+              <w:jc w:val="left"/>
             </w:pPr>
             <w:r/>
             <w:r>
@@ -751,7 +810,7 @@
         </w:tc>
         <w:tc>
           <w:tcPr>
-            <w:tcW w:type="dxa" w:w="1458"/>
+            <w:tcW w:type="dxa" w:w="1276"/>
             <w:shd w:fill="F2F2F2" w:val="clear"/>
             <w:tcBorders>
               <w:top w:val="single" w:sz="4" w:space="0" w:color="BFBFBF"/>
@@ -780,7 +839,7 @@
         </w:tc>
         <w:tc>
           <w:tcPr>
-            <w:tcW w:type="dxa" w:w="1458"/>
+            <w:tcW w:type="dxa" w:w="1276"/>
             <w:shd w:fill="F2F2F2" w:val="clear"/>
             <w:tcBorders>
               <w:top w:val="single" w:sz="4" w:space="0" w:color="BFBFBF"/>
@@ -811,7 +870,7 @@
       <w:tr>
         <w:tc>
           <w:tcPr>
-            <w:tcW w:type="dxa" w:w="1458"/>
+            <w:tcW w:type="dxa" w:w="1276"/>
             <w:shd w:fill="FFFFFF" w:val="clear"/>
             <w:tcBorders>
               <w:top w:val="single" w:sz="4" w:space="0" w:color="BFBFBF"/>
@@ -840,7 +899,7 @@
         </w:tc>
         <w:tc>
           <w:tcPr>
-            <w:tcW w:type="dxa" w:w="1458"/>
+            <w:tcW w:type="dxa" w:w="1276"/>
             <w:shd w:fill="FFFFFF" w:val="clear"/>
             <w:tcBorders>
               <w:top w:val="single" w:sz="4" w:space="0" w:color="BFBFBF"/>
@@ -863,13 +922,13 @@
                 <w:color w:val="000000"/>
                 <w:sz w:val="16"/>
               </w:rPr>
-              <w:t>Камера видеонаблюдения цифровая 4 Мп, прошивка Nexus. Артикул подтвердить у НИЦ (корпус/объектив в коде не заданы)</w:t>
+              <w:t>Купольная IP 4 Мп, мотор 2.7–13.5 мм, ИК 35 м, IP66/IK10, ПО Nexus. НИЦ модель 1143</w:t>
             </w:r>
           </w:p>
         </w:tc>
         <w:tc>
           <w:tcPr>
-            <w:tcW w:type="dxa" w:w="1458"/>
+            <w:tcW w:type="dxa" w:w="1276"/>
             <w:shd w:fill="FFFFFF" w:val="clear"/>
             <w:tcBorders>
               <w:top w:val="single" w:sz="4" w:space="0" w:color="BFBFBF"/>
@@ -892,13 +951,42 @@
                 <w:color w:val="000000"/>
                 <w:sz w:val="16"/>
               </w:rPr>
-              <w:t>4BHNN0-0-0-0</w:t>
+              <w:t>4MP-DOM-2.7-13.5M Nexus</w:t>
             </w:r>
           </w:p>
         </w:tc>
         <w:tc>
           <w:tcPr>
-            <w:tcW w:type="dxa" w:w="1458"/>
+            <w:tcW w:type="dxa" w:w="1276"/>
+            <w:shd w:fill="FFFFFF" w:val="clear"/>
+            <w:tcBorders>
+              <w:top w:val="single" w:sz="4" w:space="0" w:color="BFBFBF"/>
+              <w:left w:val="single" w:sz="4" w:space="0" w:color="BFBFBF"/>
+              <w:bottom w:val="single" w:sz="4" w:space="0" w:color="BFBFBF"/>
+              <w:right w:val="single" w:sz="4" w:space="0" w:color="BFBFBF"/>
+            </w:tcBorders>
+            <w:vAlign w:val="center"/>
+          </w:tcPr>
+          <w:p>
+            <w:pPr>
+              <w:spacing w:before="40" w:after="40"/>
+              <w:jc w:val="center"/>
+            </w:pPr>
+            <w:r/>
+            <w:r>
+              <w:rPr>
+                <w:rFonts w:ascii="Times New Roman" w:hAnsi="Times New Roman" w:cs="Times New Roman" w:eastAsia="Times New Roman"/>
+                <w:b w:val="0"/>
+                <w:color w:val="000000"/>
+                <w:sz w:val="16"/>
+              </w:rPr>
+              <w:t>да</w:t>
+            </w:r>
+          </w:p>
+        </w:tc>
+        <w:tc>
+          <w:tcPr>
+            <w:tcW w:type="dxa" w:w="1276"/>
             <w:shd w:fill="FFFFFF" w:val="clear"/>
             <w:tcBorders>
               <w:top w:val="single" w:sz="4" w:space="0" w:color="BFBFBF"/>
@@ -927,7 +1015,330 @@
         </w:tc>
         <w:tc>
           <w:tcPr>
-            <w:tcW w:type="dxa" w:w="1458"/>
+            <w:tcW w:type="dxa" w:w="1276"/>
+            <w:shd w:fill="FFFFFF" w:val="clear"/>
+            <w:tcBorders>
+              <w:top w:val="single" w:sz="4" w:space="0" w:color="BFBFBF"/>
+              <w:left w:val="single" w:sz="4" w:space="0" w:color="BFBFBF"/>
+              <w:bottom w:val="single" w:sz="4" w:space="0" w:color="BFBFBF"/>
+              <w:right w:val="single" w:sz="4" w:space="0" w:color="BFBFBF"/>
+            </w:tcBorders>
+            <w:vAlign w:val="center"/>
+          </w:tcPr>
+          <w:p>
+            <w:pPr>
+              <w:spacing w:before="40" w:after="40"/>
+              <w:jc w:val="left"/>
+            </w:pPr>
+            <w:r/>
+            <w:r>
+              <w:rPr>
+                <w:rFonts w:ascii="Times New Roman" w:hAnsi="Times New Roman" w:cs="Times New Roman" w:eastAsia="Times New Roman"/>
+                <w:b w:val="0"/>
+                <w:color w:val="000000"/>
+                <w:sz w:val="16"/>
+              </w:rPr>
+              <w:t>1</w:t>
+            </w:r>
+          </w:p>
+        </w:tc>
+        <w:tc>
+          <w:tcPr>
+            <w:tcW w:type="dxa" w:w="1276"/>
+            <w:shd w:fill="FFFFFF" w:val="clear"/>
+            <w:tcBorders>
+              <w:top w:val="single" w:sz="4" w:space="0" w:color="BFBFBF"/>
+              <w:left w:val="single" w:sz="4" w:space="0" w:color="BFBFBF"/>
+              <w:bottom w:val="single" w:sz="4" w:space="0" w:color="BFBFBF"/>
+              <w:right w:val="single" w:sz="4" w:space="0" w:color="BFBFBF"/>
+            </w:tcBorders>
+            <w:vAlign w:val="center"/>
+          </w:tcPr>
+          <w:p>
+            <w:pPr>
+              <w:spacing w:before="40" w:after="40"/>
+              <w:jc w:val="right"/>
+            </w:pPr>
+            <w:r/>
+            <w:r>
+              <w:rPr>
+                <w:rFonts w:ascii="Times New Roman" w:hAnsi="Times New Roman" w:cs="Times New Roman" w:eastAsia="Times New Roman"/>
+                <w:b w:val="0"/>
+                <w:color w:val="000000"/>
+                <w:sz w:val="16"/>
+              </w:rPr>
+              <w:t>23 800</w:t>
+            </w:r>
+          </w:p>
+        </w:tc>
+        <w:tc>
+          <w:tcPr>
+            <w:tcW w:type="dxa" w:w="1276"/>
+            <w:shd w:fill="FFFFFF" w:val="clear"/>
+            <w:tcBorders>
+              <w:top w:val="single" w:sz="4" w:space="0" w:color="BFBFBF"/>
+              <w:left w:val="single" w:sz="4" w:space="0" w:color="BFBFBF"/>
+              <w:bottom w:val="single" w:sz="4" w:space="0" w:color="BFBFBF"/>
+              <w:right w:val="single" w:sz="4" w:space="0" w:color="BFBFBF"/>
+            </w:tcBorders>
+            <w:vAlign w:val="center"/>
+          </w:tcPr>
+          <w:p>
+            <w:pPr>
+              <w:spacing w:before="40" w:after="40"/>
+              <w:jc w:val="right"/>
+            </w:pPr>
+            <w:r/>
+            <w:r>
+              <w:rPr>
+                <w:rFonts w:ascii="Times New Roman" w:hAnsi="Times New Roman" w:cs="Times New Roman" w:eastAsia="Times New Roman"/>
+                <w:b w:val="0"/>
+                <w:color w:val="000000"/>
+                <w:sz w:val="16"/>
+              </w:rPr>
+              <w:t>23 800</w:t>
+            </w:r>
+          </w:p>
+        </w:tc>
+      </w:tr>
+      <w:tr>
+        <w:tc>
+          <w:tcPr>
+            <w:tcW w:type="dxa" w:w="1276"/>
+            <w:shd w:fill="F2F2F2" w:val="clear"/>
+            <w:tcBorders>
+              <w:top w:val="single" w:sz="4" w:space="0" w:color="BFBFBF"/>
+              <w:left w:val="single" w:sz="4" w:space="0" w:color="BFBFBF"/>
+              <w:bottom w:val="single" w:sz="4" w:space="0" w:color="BFBFBF"/>
+              <w:right w:val="single" w:sz="4" w:space="0" w:color="BFBFBF"/>
+            </w:tcBorders>
+            <w:vAlign w:val="center"/>
+          </w:tcPr>
+          <w:p>
+            <w:pPr>
+              <w:spacing w:before="40" w:after="40"/>
+              <w:jc w:val="center"/>
+            </w:pPr>
+            <w:r/>
+            <w:r>
+              <w:rPr>
+                <w:rFonts w:ascii="Times New Roman" w:hAnsi="Times New Roman" w:cs="Times New Roman" w:eastAsia="Times New Roman"/>
+                <w:b w:val="0"/>
+                <w:color w:val="000000"/>
+                <w:sz w:val="16"/>
+              </w:rPr>
+              <w:t>3</w:t>
+            </w:r>
+          </w:p>
+        </w:tc>
+        <w:tc>
+          <w:tcPr>
+            <w:tcW w:type="dxa" w:w="1276"/>
+            <w:shd w:fill="F2F2F2" w:val="clear"/>
+            <w:tcBorders>
+              <w:top w:val="single" w:sz="4" w:space="0" w:color="BFBFBF"/>
+              <w:left w:val="single" w:sz="4" w:space="0" w:color="BFBFBF"/>
+              <w:bottom w:val="single" w:sz="4" w:space="0" w:color="BFBFBF"/>
+              <w:right w:val="single" w:sz="4" w:space="0" w:color="BFBFBF"/>
+            </w:tcBorders>
+            <w:vAlign w:val="center"/>
+          </w:tcPr>
+          <w:p>
+            <w:pPr>
+              <w:spacing w:before="40" w:after="40"/>
+              <w:jc w:val="left"/>
+            </w:pPr>
+            <w:r/>
+            <w:r>
+              <w:rPr>
+                <w:rFonts w:ascii="Times New Roman" w:hAnsi="Times New Roman" w:cs="Times New Roman" w:eastAsia="Times New Roman"/>
+                <w:b w:val="0"/>
+                <w:color w:val="000000"/>
+                <w:sz w:val="16"/>
+              </w:rPr>
+              <w:t>Уличная цилиндрическая IP 4 Мп Mini Bullet, 2.8 мм, ИК + белый свет, микрофон. Производитель РУВЕР</w:t>
+            </w:r>
+          </w:p>
+        </w:tc>
+        <w:tc>
+          <w:tcPr>
+            <w:tcW w:type="dxa" w:w="1276"/>
+            <w:shd w:fill="F2F2F2" w:val="clear"/>
+            <w:tcBorders>
+              <w:top w:val="single" w:sz="4" w:space="0" w:color="BFBFBF"/>
+              <w:left w:val="single" w:sz="4" w:space="0" w:color="BFBFBF"/>
+              <w:bottom w:val="single" w:sz="4" w:space="0" w:color="BFBFBF"/>
+              <w:right w:val="single" w:sz="4" w:space="0" w:color="BFBFBF"/>
+            </w:tcBorders>
+            <w:vAlign w:val="center"/>
+          </w:tcPr>
+          <w:p>
+            <w:pPr>
+              <w:spacing w:before="40" w:after="40"/>
+              <w:jc w:val="left"/>
+            </w:pPr>
+            <w:r/>
+            <w:r>
+              <w:rPr>
+                <w:rFonts w:ascii="Times New Roman" w:hAnsi="Times New Roman" w:cs="Times New Roman" w:eastAsia="Times New Roman"/>
+                <w:b w:val="0"/>
+                <w:color w:val="000000"/>
+                <w:sz w:val="16"/>
+              </w:rPr>
+              <w:t>4MBIR-28-TMLW</w:t>
+            </w:r>
+          </w:p>
+        </w:tc>
+        <w:tc>
+          <w:tcPr>
+            <w:tcW w:type="dxa" w:w="1276"/>
+            <w:shd w:fill="F2F2F2" w:val="clear"/>
+            <w:tcBorders>
+              <w:top w:val="single" w:sz="4" w:space="0" w:color="BFBFBF"/>
+              <w:left w:val="single" w:sz="4" w:space="0" w:color="BFBFBF"/>
+              <w:bottom w:val="single" w:sz="4" w:space="0" w:color="BFBFBF"/>
+              <w:right w:val="single" w:sz="4" w:space="0" w:color="BFBFBF"/>
+            </w:tcBorders>
+            <w:vAlign w:val="center"/>
+          </w:tcPr>
+          <w:p>
+            <w:pPr>
+              <w:spacing w:before="40" w:after="40"/>
+              <w:jc w:val="center"/>
+            </w:pPr>
+            <w:r/>
+            <w:r>
+              <w:rPr>
+                <w:rFonts w:ascii="Times New Roman" w:hAnsi="Times New Roman" w:cs="Times New Roman" w:eastAsia="Times New Roman"/>
+                <w:b w:val="0"/>
+                <w:color w:val="000000"/>
+                <w:sz w:val="16"/>
+              </w:rPr>
+              <w:t>да</w:t>
+            </w:r>
+          </w:p>
+        </w:tc>
+        <w:tc>
+          <w:tcPr>
+            <w:tcW w:type="dxa" w:w="1276"/>
+            <w:shd w:fill="F2F2F2" w:val="clear"/>
+            <w:tcBorders>
+              <w:top w:val="single" w:sz="4" w:space="0" w:color="BFBFBF"/>
+              <w:left w:val="single" w:sz="4" w:space="0" w:color="BFBFBF"/>
+              <w:bottom w:val="single" w:sz="4" w:space="0" w:color="BFBFBF"/>
+              <w:right w:val="single" w:sz="4" w:space="0" w:color="BFBFBF"/>
+            </w:tcBorders>
+            <w:vAlign w:val="center"/>
+          </w:tcPr>
+          <w:p>
+            <w:pPr>
+              <w:spacing w:before="40" w:after="40"/>
+              <w:jc w:val="center"/>
+            </w:pPr>
+            <w:r/>
+            <w:r>
+              <w:rPr>
+                <w:rFonts w:ascii="Times New Roman" w:hAnsi="Times New Roman" w:cs="Times New Roman" w:eastAsia="Times New Roman"/>
+                <w:b w:val="0"/>
+                <w:color w:val="000000"/>
+                <w:sz w:val="16"/>
+              </w:rPr>
+              <w:t>шт.</w:t>
+            </w:r>
+          </w:p>
+        </w:tc>
+        <w:tc>
+          <w:tcPr>
+            <w:tcW w:type="dxa" w:w="1276"/>
+            <w:shd w:fill="F2F2F2" w:val="clear"/>
+            <w:tcBorders>
+              <w:top w:val="single" w:sz="4" w:space="0" w:color="BFBFBF"/>
+              <w:left w:val="single" w:sz="4" w:space="0" w:color="BFBFBF"/>
+              <w:bottom w:val="single" w:sz="4" w:space="0" w:color="BFBFBF"/>
+              <w:right w:val="single" w:sz="4" w:space="0" w:color="BFBFBF"/>
+            </w:tcBorders>
+            <w:vAlign w:val="center"/>
+          </w:tcPr>
+          <w:p>
+            <w:pPr>
+              <w:spacing w:before="40" w:after="40"/>
+              <w:jc w:val="left"/>
+            </w:pPr>
+            <w:r/>
+            <w:r>
+              <w:rPr>
+                <w:rFonts w:ascii="Times New Roman" w:hAnsi="Times New Roman" w:cs="Times New Roman" w:eastAsia="Times New Roman"/>
+                <w:b w:val="0"/>
+                <w:color w:val="000000"/>
+                <w:sz w:val="16"/>
+              </w:rPr>
+              <w:t>49</w:t>
+            </w:r>
+          </w:p>
+        </w:tc>
+        <w:tc>
+          <w:tcPr>
+            <w:tcW w:type="dxa" w:w="1276"/>
+            <w:shd w:fill="F2F2F2" w:val="clear"/>
+            <w:tcBorders>
+              <w:top w:val="single" w:sz="4" w:space="0" w:color="BFBFBF"/>
+              <w:left w:val="single" w:sz="4" w:space="0" w:color="BFBFBF"/>
+              <w:bottom w:val="single" w:sz="4" w:space="0" w:color="BFBFBF"/>
+              <w:right w:val="single" w:sz="4" w:space="0" w:color="BFBFBF"/>
+            </w:tcBorders>
+            <w:vAlign w:val="center"/>
+          </w:tcPr>
+          <w:p>
+            <w:pPr>
+              <w:spacing w:before="40" w:after="40"/>
+              <w:jc w:val="right"/>
+            </w:pPr>
+            <w:r/>
+            <w:r>
+              <w:rPr>
+                <w:rFonts w:ascii="Times New Roman" w:hAnsi="Times New Roman" w:cs="Times New Roman" w:eastAsia="Times New Roman"/>
+                <w:b w:val="0"/>
+                <w:color w:val="000000"/>
+                <w:sz w:val="16"/>
+              </w:rPr>
+              <w:t>18 500</w:t>
+            </w:r>
+          </w:p>
+        </w:tc>
+        <w:tc>
+          <w:tcPr>
+            <w:tcW w:type="dxa" w:w="1276"/>
+            <w:shd w:fill="F2F2F2" w:val="clear"/>
+            <w:tcBorders>
+              <w:top w:val="single" w:sz="4" w:space="0" w:color="BFBFBF"/>
+              <w:left w:val="single" w:sz="4" w:space="0" w:color="BFBFBF"/>
+              <w:bottom w:val="single" w:sz="4" w:space="0" w:color="BFBFBF"/>
+              <w:right w:val="single" w:sz="4" w:space="0" w:color="BFBFBF"/>
+            </w:tcBorders>
+            <w:vAlign w:val="center"/>
+          </w:tcPr>
+          <w:p>
+            <w:pPr>
+              <w:spacing w:before="40" w:after="40"/>
+              <w:jc w:val="right"/>
+            </w:pPr>
+            <w:r/>
+            <w:r>
+              <w:rPr>
+                <w:rFonts w:ascii="Times New Roman" w:hAnsi="Times New Roman" w:cs="Times New Roman" w:eastAsia="Times New Roman"/>
+                <w:b w:val="0"/>
+                <w:color w:val="000000"/>
+                <w:sz w:val="16"/>
+              </w:rPr>
+              <w:t>906 500</w:t>
+            </w:r>
+          </w:p>
+        </w:tc>
+      </w:tr>
+      <w:tr>
+        <w:tc>
+          <w:tcPr>
+            <w:tcW w:type="dxa" w:w="1276"/>
             <w:shd w:fill="FFFFFF" w:val="clear"/>
             <w:tcBorders>
               <w:top w:val="single" w:sz="4" w:space="0" w:color="BFBFBF"/>
@@ -950,13 +1361,158 @@
                 <w:color w:val="000000"/>
                 <w:sz w:val="16"/>
               </w:rPr>
-              <w:t>51</w:t>
+              <w:t>4</w:t>
             </w:r>
           </w:p>
         </w:tc>
         <w:tc>
           <w:tcPr>
-            <w:tcW w:type="dxa" w:w="1458"/>
+            <w:tcW w:type="dxa" w:w="1276"/>
+            <w:shd w:fill="FFFFFF" w:val="clear"/>
+            <w:tcBorders>
+              <w:top w:val="single" w:sz="4" w:space="0" w:color="BFBFBF"/>
+              <w:left w:val="single" w:sz="4" w:space="0" w:color="BFBFBF"/>
+              <w:bottom w:val="single" w:sz="4" w:space="0" w:color="BFBFBF"/>
+              <w:right w:val="single" w:sz="4" w:space="0" w:color="BFBFBF"/>
+            </w:tcBorders>
+            <w:vAlign w:val="center"/>
+          </w:tcPr>
+          <w:p>
+            <w:pPr>
+              <w:spacing w:before="40" w:after="40"/>
+              <w:jc w:val="left"/>
+            </w:pPr>
+            <w:r/>
+            <w:r>
+              <w:rPr>
+                <w:rFonts w:ascii="Times New Roman" w:hAnsi="Times New Roman" w:cs="Times New Roman" w:eastAsia="Times New Roman"/>
+                <w:b w:val="0"/>
+                <w:color w:val="000000"/>
+                <w:sz w:val="16"/>
+              </w:rPr>
+              <w:t>PTZ уличная 2 Мп, зум ×20 (4.7–94 мм), IP66. Самая недорогая PTZ РУВЕР с СТ-1 в серии 2 Мп</w:t>
+            </w:r>
+          </w:p>
+        </w:tc>
+        <w:tc>
+          <w:tcPr>
+            <w:tcW w:type="dxa" w:w="1276"/>
+            <w:shd w:fill="FFFFFF" w:val="clear"/>
+            <w:tcBorders>
+              <w:top w:val="single" w:sz="4" w:space="0" w:color="BFBFBF"/>
+              <w:left w:val="single" w:sz="4" w:space="0" w:color="BFBFBF"/>
+              <w:bottom w:val="single" w:sz="4" w:space="0" w:color="BFBFBF"/>
+              <w:right w:val="single" w:sz="4" w:space="0" w:color="BFBFBF"/>
+            </w:tcBorders>
+            <w:vAlign w:val="center"/>
+          </w:tcPr>
+          <w:p>
+            <w:pPr>
+              <w:spacing w:before="40" w:after="40"/>
+              <w:jc w:val="left"/>
+            </w:pPr>
+            <w:r/>
+            <w:r>
+              <w:rPr>
+                <w:rFonts w:ascii="Times New Roman" w:hAnsi="Times New Roman" w:cs="Times New Roman" w:eastAsia="Times New Roman"/>
+                <w:b w:val="0"/>
+                <w:color w:val="000000"/>
+                <w:sz w:val="16"/>
+              </w:rPr>
+              <w:t>2BPBDD-4794-20</w:t>
+            </w:r>
+          </w:p>
+        </w:tc>
+        <w:tc>
+          <w:tcPr>
+            <w:tcW w:type="dxa" w:w="1276"/>
+            <w:shd w:fill="FFFFFF" w:val="clear"/>
+            <w:tcBorders>
+              <w:top w:val="single" w:sz="4" w:space="0" w:color="BFBFBF"/>
+              <w:left w:val="single" w:sz="4" w:space="0" w:color="BFBFBF"/>
+              <w:bottom w:val="single" w:sz="4" w:space="0" w:color="BFBFBF"/>
+              <w:right w:val="single" w:sz="4" w:space="0" w:color="BFBFBF"/>
+            </w:tcBorders>
+            <w:vAlign w:val="center"/>
+          </w:tcPr>
+          <w:p>
+            <w:pPr>
+              <w:spacing w:before="40" w:after="40"/>
+              <w:jc w:val="center"/>
+            </w:pPr>
+            <w:r/>
+            <w:r>
+              <w:rPr>
+                <w:rFonts w:ascii="Times New Roman" w:hAnsi="Times New Roman" w:cs="Times New Roman" w:eastAsia="Times New Roman"/>
+                <w:b w:val="0"/>
+                <w:color w:val="000000"/>
+                <w:sz w:val="16"/>
+              </w:rPr>
+              <w:t>да</w:t>
+            </w:r>
+          </w:p>
+        </w:tc>
+        <w:tc>
+          <w:tcPr>
+            <w:tcW w:type="dxa" w:w="1276"/>
+            <w:shd w:fill="FFFFFF" w:val="clear"/>
+            <w:tcBorders>
+              <w:top w:val="single" w:sz="4" w:space="0" w:color="BFBFBF"/>
+              <w:left w:val="single" w:sz="4" w:space="0" w:color="BFBFBF"/>
+              <w:bottom w:val="single" w:sz="4" w:space="0" w:color="BFBFBF"/>
+              <w:right w:val="single" w:sz="4" w:space="0" w:color="BFBFBF"/>
+            </w:tcBorders>
+            <w:vAlign w:val="center"/>
+          </w:tcPr>
+          <w:p>
+            <w:pPr>
+              <w:spacing w:before="40" w:after="40"/>
+              <w:jc w:val="center"/>
+            </w:pPr>
+            <w:r/>
+            <w:r>
+              <w:rPr>
+                <w:rFonts w:ascii="Times New Roman" w:hAnsi="Times New Roman" w:cs="Times New Roman" w:eastAsia="Times New Roman"/>
+                <w:b w:val="0"/>
+                <w:color w:val="000000"/>
+                <w:sz w:val="16"/>
+              </w:rPr>
+              <w:t>шт.</w:t>
+            </w:r>
+          </w:p>
+        </w:tc>
+        <w:tc>
+          <w:tcPr>
+            <w:tcW w:type="dxa" w:w="1276"/>
+            <w:shd w:fill="FFFFFF" w:val="clear"/>
+            <w:tcBorders>
+              <w:top w:val="single" w:sz="4" w:space="0" w:color="BFBFBF"/>
+              <w:left w:val="single" w:sz="4" w:space="0" w:color="BFBFBF"/>
+              <w:bottom w:val="single" w:sz="4" w:space="0" w:color="BFBFBF"/>
+              <w:right w:val="single" w:sz="4" w:space="0" w:color="BFBFBF"/>
+            </w:tcBorders>
+            <w:vAlign w:val="center"/>
+          </w:tcPr>
+          <w:p>
+            <w:pPr>
+              <w:spacing w:before="40" w:after="40"/>
+              <w:jc w:val="left"/>
+            </w:pPr>
+            <w:r/>
+            <w:r>
+              <w:rPr>
+                <w:rFonts w:ascii="Times New Roman" w:hAnsi="Times New Roman" w:cs="Times New Roman" w:eastAsia="Times New Roman"/>
+                <w:b w:val="0"/>
+                <w:color w:val="000000"/>
+                <w:sz w:val="16"/>
+              </w:rPr>
+              <w:t>1</w:t>
+            </w:r>
+          </w:p>
+        </w:tc>
+        <w:tc>
+          <w:tcPr>
+            <w:tcW w:type="dxa" w:w="1276"/>
             <w:shd w:fill="FFFFFF" w:val="clear"/>
             <w:tcBorders>
               <w:top w:val="single" w:sz="4" w:space="0" w:color="BFBFBF"/>
@@ -979,13 +1535,13 @@
                 <w:color w:val="000000"/>
                 <w:sz w:val="16"/>
               </w:rPr>
-              <w:t>22 000</w:t>
+              <w:t>92 750</w:t>
             </w:r>
           </w:p>
         </w:tc>
         <w:tc>
           <w:tcPr>
-            <w:tcW w:type="dxa" w:w="1458"/>
+            <w:tcW w:type="dxa" w:w="1276"/>
             <w:shd w:fill="FFFFFF" w:val="clear"/>
             <w:tcBorders>
               <w:top w:val="single" w:sz="4" w:space="0" w:color="BFBFBF"/>
@@ -1008,7 +1564,7 @@
                 <w:color w:val="000000"/>
                 <w:sz w:val="16"/>
               </w:rPr>
-              <w:t>1 122 000</w:t>
+              <w:t>92 750</w:t>
             </w:r>
           </w:p>
         </w:tc>
@@ -1026,7 +1582,7 @@
           <w:color w:val="000000"/>
           <w:sz w:val="22"/>
         </w:rPr>
-        <w:t>Итого по запросу (позиции 1–2)</w:t>
+        <w:t>Итого по запросу (позиции 1–4). Камеры: 1+49+1 = 51 шт.</w:t>
       </w:r>
     </w:p>
     <w:tbl>
@@ -1155,7 +1711,7 @@
                 <w:color w:val="000000"/>
                 <w:sz w:val="16"/>
               </w:rPr>
-              <w:t>2 077 480</w:t>
+              <w:t>1 978 530</w:t>
             </w:r>
           </w:p>
         </w:tc>
@@ -1215,7 +1771,7 @@
                 <w:color w:val="000000"/>
                 <w:sz w:val="16"/>
               </w:rPr>
-              <w:t>374 627,54</w:t>
+              <w:t>356 784,10</w:t>
             </w:r>
           </w:p>
         </w:tc>
@@ -1275,7 +1831,7 @@
                 <w:color w:val="000000"/>
                 <w:sz w:val="16"/>
               </w:rPr>
-              <w:t>1 702 852,46</w:t>
+              <w:t>1 621 745,90</w:t>
             </w:r>
           </w:p>
         </w:tc>
@@ -1307,7 +1863,7 @@
           <w:color w:val="000000"/>
           <w:sz w:val="22"/>
         </w:rPr>
-        <w:t>Регистратор не содержит лицензий на IP-камеры и HDD. Камеры 4BHNN0 — не native TRASSIR, на каждый канал нужна лицензия AnyIP.</w:t>
+        <w:t>Регистратор не содержит лицензий на IP-камеры и HDD. Камеры НИЦ/РУВЕР — не native TRASSIR, на каждый канал нужна лицензия AnyIP.</w:t>
       </w:r>
     </w:p>
     <w:tbl>
@@ -1557,7 +2113,7 @@
                 <w:color w:val="000000"/>
                 <w:sz w:val="16"/>
               </w:rPr>
-              <w:t>3</w:t>
+              <w:t>5</w:t>
             </w:r>
           </w:p>
         </w:tc>
@@ -1748,7 +2304,7 @@
           <w:color w:val="1F4E79"/>
           <w:sz w:val="24"/>
         </w:rPr>
-        <w:t>Итого запрос + лицензии AnyIP: 2 337 070 ₽</w:t>
+        <w:t>Итого запрос + лицензии AnyIP: 2 238 120 ₽</w:t>
       </w:r>
       <w:r>
         <w:rPr>
@@ -1757,7 +2313,7 @@
           <w:color w:val="000000"/>
           <w:sz w:val="22"/>
         </w:rPr>
-        <w:t xml:space="preserve">  (в т.ч. НДС 22% — 421 438,85 ₽).</w:t>
+        <w:t xml:space="preserve">  (в т.ч. НДС 22% — 403 595,41 ₽).</w:t>
       </w:r>
     </w:p>
     <w:p>
@@ -1786,7 +2342,7 @@
           <w:color w:val="000000"/>
           <w:sz w:val="22"/>
         </w:rPr>
-        <w:t>Оценка архива: 51 камера × 4 Мп, H.265, средний битрейт 3 Мбит/с → ≈ 1,65 ТБ/сутки непрерывной записи. На 30 суток нужно ≈ 50 ТБ полезного объёма.</w:t>
+        <w:t>Оценка архива: 51 камера, в основном 4 Мп, H.265, средний битрейт 3 Мбит/с → ≈ 1,65 ТБ/сутки. На 30 суток нужно ≈ 50 ТБ полезного объёма.</w:t>
       </w:r>
     </w:p>
     <w:tbl>
@@ -2006,7 +2562,7 @@
                 <w:color w:val="000000"/>
                 <w:sz w:val="16"/>
               </w:rPr>
-              <w:t>4</w:t>
+              <w:t>6</w:t>
             </w:r>
           </w:p>
         </w:tc>
@@ -2182,7 +2738,7 @@
                 <w:color w:val="000000"/>
                 <w:sz w:val="16"/>
               </w:rPr>
-              <w:t>5</w:t>
+              <w:t>7</w:t>
             </w:r>
           </w:p>
         </w:tc>
@@ -2445,7 +3001,7 @@
                 <w:color w:val="000000"/>
                 <w:sz w:val="16"/>
               </w:rPr>
-              <w:t>Запрос (п. 1–2)</w:t>
+              <w:t>Запрос (п. 1–4)</w:t>
             </w:r>
           </w:p>
         </w:tc>
@@ -2474,7 +3030,7 @@
                 <w:color w:val="000000"/>
                 <w:sz w:val="16"/>
               </w:rPr>
-              <w:t>2 077 480</w:t>
+              <w:t>1 978 530</w:t>
             </w:r>
           </w:p>
         </w:tc>
@@ -2505,7 +3061,7 @@
                 <w:color w:val="000000"/>
                 <w:sz w:val="16"/>
               </w:rPr>
-              <w:t>Работоспособный минимум (п. 1–3)</w:t>
+              <w:t>Работоспособный минимум (п. 1–5)</w:t>
             </w:r>
           </w:p>
         </w:tc>
@@ -2534,7 +3090,7 @@
                 <w:color w:val="000000"/>
                 <w:sz w:val="16"/>
               </w:rPr>
-              <w:t>2 337 070</w:t>
+              <w:t>2 238 120</w:t>
             </w:r>
           </w:p>
         </w:tc>
@@ -2565,7 +3121,7 @@
                 <w:color w:val="000000"/>
                 <w:sz w:val="16"/>
               </w:rPr>
-              <w:t>+ архив 30 суток (п. 1–4)</w:t>
+              <w:t>+ архив 30 суток (п. 1–6)</w:t>
             </w:r>
           </w:p>
         </w:tc>
@@ -2594,7 +3150,7 @@
                 <w:color w:val="000000"/>
                 <w:sz w:val="16"/>
               </w:rPr>
-              <w:t>2 778 670</w:t>
+              <w:t>2 679 720</w:t>
             </w:r>
           </w:p>
         </w:tc>
@@ -2625,7 +3181,7 @@
                 <w:color w:val="000000"/>
                 <w:sz w:val="16"/>
               </w:rPr>
-              <w:t>+ аналитика на все камеры (п. 1–5)</w:t>
+              <w:t>+ аналитика на все камеры (п. 1–7)</w:t>
             </w:r>
           </w:p>
         </w:tc>
@@ -2654,7 +3210,7 @@
                 <w:color w:val="000000"/>
                 <w:sz w:val="16"/>
               </w:rPr>
-              <w:t>3 088 870</w:t>
+              <w:t>2 989 920</w:t>
             </w:r>
           </w:p>
         </w:tc>
@@ -2686,7 +3242,7 @@
           <w:color w:val="1F4E79"/>
           <w:sz w:val="26"/>
         </w:rPr>
-        <w:t>4. Кратко по оборудованию</w:t>
+        <w:t>4. Кратко по оборудованию и СТ-1</w:t>
       </w:r>
     </w:p>
     <w:p>
@@ -2706,7 +3262,7 @@
           <w:color w:val="000000"/>
           <w:sz w:val="22"/>
         </w:rPr>
-        <w:t>128 IP-каналов, полоса 790 Мбит/с, 8 отсеков HDD, стойка 2U, Astra Linux SE «Смоленск», реестры Минпромторга №719 / №878, СТ-1. Два регистратора на 51 камеру дают запас по каналам (256 vs 51): резерв, два объекта или рост системы. Запись можно вести на одном NVR, второй держать как горячий резерв. Цена 477 740 ₽ — открытая розница trasrussia.ru; у DSSL цена проектная.</w:t>
+        <w:t>128 IP-каналов, полоса 790 Мбит/с, 8 отсеков HDD, стойка 2U, Astra Linux SE «Смоленск», реестры Минпромторга №719 / №878, СТ-1. Цена 477 740 ₽ — открытая розница; у DSSL проектная.</w:t>
       </w:r>
     </w:p>
     <w:p>
@@ -2717,7 +3273,7 @@
           <w:color w:val="000000"/>
           <w:sz w:val="22"/>
         </w:rPr>
-        <w:t xml:space="preserve">4.2. Камера 4BHNN0-0-0-0 — 51 шт. </w:t>
+        <w:t xml:space="preserve">4.2. НИЦ модель 1143, 4MP-DOM-2.7-13.5M Nexus — 1 шт. </w:t>
       </w:r>
       <w:r>
         <w:rPr>
@@ -2726,7 +3282,47 @@
           <w:color w:val="000000"/>
           <w:sz w:val="22"/>
         </w:rPr>
-        <w:t>По коду — 4 Мп, прошивка Nexus (NN), базовая комплектация 0-0-0-0; производитель с высокой вероятностью НИЦ «Технологии». Корпус и объектив в артикуле не заданы — до заказа подтвердить: цилиндр / купол / корпусная, фикс или мотор, ИК, PoE. Цена 22 000 ₽ — ориентир опта 15–25 тыс. ₽.</w:t>
+        <w:t>Купол 4 Мп, Sony IMX335, мотор 2.7–13.5 мм, ИК до 35 м, IP66/IK10, PoE, −45…+50 °C, ПО Nexus (реестр Минцифры №12466). Изготовитель ООО «НИЦ Технологии», Россия. СТ-1 на партию — у завода. Спецификация: nic-tech.ru, модель 1143.</w:t>
+      </w:r>
+    </w:p>
+    <w:p>
+      <w:r>
+        <w:rPr>
+          <w:rFonts w:ascii="Times New Roman" w:hAnsi="Times New Roman" w:cs="Times New Roman" w:eastAsia="Times New Roman"/>
+          <w:b/>
+          <w:color w:val="000000"/>
+          <w:sz w:val="22"/>
+        </w:rPr>
+        <w:t xml:space="preserve">4.3. РУВЕР 4MBIR-28-TMLW — 49 шт. </w:t>
+      </w:r>
+      <w:r>
+        <w:rPr>
+          <w:rFonts w:ascii="Times New Roman" w:hAnsi="Times New Roman" w:cs="Times New Roman" w:eastAsia="Times New Roman"/>
+          <w:b w:val="0"/>
+          <w:color w:val="000000"/>
+          <w:sz w:val="22"/>
+        </w:rPr>
+        <w:t>Mini Bullet 4 Мп, фикс 2.8 мм, ИК + белый свет, микрофон. Производитель RUWARE, продавец ООО «Айпи Плюс». В каталоге ipplus.ru флаг СТ-1. https://www.ipplus.ru/catalog/ip-kamery/ip-kamery-4mp/4mbir-28-tmlw</w:t>
+      </w:r>
+    </w:p>
+    <w:p>
+      <w:r>
+        <w:rPr>
+          <w:rFonts w:ascii="Times New Roman" w:hAnsi="Times New Roman" w:cs="Times New Roman" w:eastAsia="Times New Roman"/>
+          <w:b/>
+          <w:color w:val="000000"/>
+          <w:sz w:val="22"/>
+        </w:rPr>
+        <w:t xml:space="preserve">4.4. PTZ РУВЕР 2BPBDD-4794-20 — 1 шт. </w:t>
+      </w:r>
+      <w:r>
+        <w:rPr>
+          <w:rFonts w:ascii="Times New Roman" w:hAnsi="Times New Roman" w:cs="Times New Roman" w:eastAsia="Times New Roman"/>
+          <w:b w:val="0"/>
+          <w:color w:val="000000"/>
+          <w:sz w:val="22"/>
+        </w:rPr>
+        <w:t>Самая недорогая поворотная камера того же производителя (РУВЕР / Айпи Плюс) с СТ-1: 2 Мп, зум ×20, 4.7–94 мм, IP66. Модели ×10 в каталоге без СТ-1 не предлагаются. https://www.ipplus.ru/catalog/ptz-kamery/ptz-kamery-2mp/2bpbdd-4794-20</w:t>
       </w:r>
     </w:p>
     <w:p>
@@ -2755,7 +3351,7 @@
           <w:color w:val="000000"/>
           <w:sz w:val="22"/>
         </w:rPr>
-        <w:t>1. Цены в рублях с НДС 22%, ориентир открытого рынка на 14.08.2026.</w:t>
+        <w:t>1. Цены в рублях с НДС 22%, ориентир открытого рынка на 14.08.2026, редакция 2.</w:t>
       </w:r>
     </w:p>
     <w:p>
@@ -2770,7 +3366,7 @@
           <w:color w:val="000000"/>
           <w:sz w:val="22"/>
         </w:rPr>
-        <w:t>2. Оплата: 100% предоплата или 70/30 — по договору.</w:t>
+        <w:t>2. В поставке камер — сертификат СТ-1 на партию и/или номер реестровой записи РЭП (ПП РФ №878).</w:t>
       </w:r>
     </w:p>
     <w:p>
@@ -2785,7 +3381,7 @@
           <w:color w:val="000000"/>
           <w:sz w:val="22"/>
         </w:rPr>
-        <w:t>3. Поставка: самовывоз со склада дилера в РФ либо доставка за счёт заказчика (тариф отдельно).</w:t>
+        <w:t>3. Оплата: 100% предоплата или 70/30 — по договору.</w:t>
       </w:r>
     </w:p>
     <w:p>
@@ -2800,7 +3396,7 @@
           <w:color w:val="000000"/>
           <w:sz w:val="22"/>
         </w:rPr>
-        <w:t>4. Гарантия: TRASSIR — по паспорту производителя (типично 3–5 лет на NVR); камеры НИЦ — уточняется (часто 3 года).</w:t>
+        <w:t>4. Поставка: самовывоз со склада дилера в РФ либо доставка за счёт заказчика.</w:t>
       </w:r>
     </w:p>
     <w:p>
@@ -2830,7 +3426,7 @@
           <w:color w:val="000000"/>
           <w:sz w:val="22"/>
         </w:rPr>
-        <w:t>6. Цена камеры 4BHNN0-0-0-0 — ориентир; фиксируется после подтверждения артикула и КП НИЦ / дилера.</w:t>
+        <w:t>6. Цены камер РУВЕР фиксируются КП ООО «Айпи Плюс»; НИЦ 1143 — КП НИЦ / дилера.</w:t>
       </w:r>
     </w:p>
     <w:p>
@@ -3019,7 +3615,7 @@
                 <w:color w:val="000000"/>
                 <w:sz w:val="16"/>
               </w:rPr>
-              <w:t>НИЦ «Технологии»</w:t>
+              <w:t>НИЦ «Технологии» (камера 1143)</w:t>
             </w:r>
           </w:p>
         </w:tc>
@@ -3049,6 +3645,66 @@
                 <w:sz w:val="16"/>
               </w:rPr>
               <w:t>nic-tech.ru, support@nic-tech.ru, 8 (800) 555-47-65</w:t>
+            </w:r>
+          </w:p>
+        </w:tc>
+      </w:tr>
+      <w:tr>
+        <w:tc>
+          <w:tcPr>
+            <w:tcW w:type="dxa" w:w="5103"/>
+            <w:shd w:fill="F2F2F2" w:val="clear"/>
+            <w:tcBorders>
+              <w:top w:val="single" w:sz="4" w:space="0" w:color="BFBFBF"/>
+              <w:left w:val="single" w:sz="4" w:space="0" w:color="BFBFBF"/>
+              <w:bottom w:val="single" w:sz="4" w:space="0" w:color="BFBFBF"/>
+              <w:right w:val="single" w:sz="4" w:space="0" w:color="BFBFBF"/>
+            </w:tcBorders>
+            <w:vAlign w:val="center"/>
+          </w:tcPr>
+          <w:p>
+            <w:pPr>
+              <w:spacing w:before="40" w:after="40"/>
+              <w:jc w:val="center"/>
+            </w:pPr>
+            <w:r/>
+            <w:r>
+              <w:rPr>
+                <w:rFonts w:ascii="Times New Roman" w:hAnsi="Times New Roman" w:cs="Times New Roman" w:eastAsia="Times New Roman"/>
+                <w:b w:val="0"/>
+                <w:color w:val="000000"/>
+                <w:sz w:val="16"/>
+              </w:rPr>
+              <w:t>ООО «Айпи Плюс» / РУВЕР (4MBIR, PTZ)</w:t>
+            </w:r>
+          </w:p>
+        </w:tc>
+        <w:tc>
+          <w:tcPr>
+            <w:tcW w:type="dxa" w:w="5103"/>
+            <w:shd w:fill="F2F2F2" w:val="clear"/>
+            <w:tcBorders>
+              <w:top w:val="single" w:sz="4" w:space="0" w:color="BFBFBF"/>
+              <w:left w:val="single" w:sz="4" w:space="0" w:color="BFBFBF"/>
+              <w:bottom w:val="single" w:sz="4" w:space="0" w:color="BFBFBF"/>
+              <w:right w:val="single" w:sz="4" w:space="0" w:color="BFBFBF"/>
+            </w:tcBorders>
+            <w:vAlign w:val="center"/>
+          </w:tcPr>
+          <w:p>
+            <w:pPr>
+              <w:spacing w:before="40" w:after="40"/>
+              <w:jc w:val="left"/>
+            </w:pPr>
+            <w:r/>
+            <w:r>
+              <w:rPr>
+                <w:rFonts w:ascii="Times New Roman" w:hAnsi="Times New Roman" w:cs="Times New Roman" w:eastAsia="Times New Roman"/>
+                <w:b w:val="0"/>
+                <w:color w:val="000000"/>
+                <w:sz w:val="16"/>
+              </w:rPr>
+              <w:t>8 804 333-73-02, info@ipplus.ru, ipplus.ru</w:t>
             </w:r>
           </w:p>
         </w:tc>

</xml_diff>

<commit_message>
Recalculate KP on DSSL/TRASSIR camera analogs with ST-1
Replace NIC 1143, RUWARE 4MBIR-28-TMLW and PTZ with TRASSIR ST-1 models TR-D3153IR2 v2 (R), TR-D2151IR3 v2 (R) and TR-D6124IR10 v3 (R). Regenerate Word and Excel as revision 3.

Co-authored-by: Yury1331 <Yury1331@users.noreply.github.com>
</commit_message>
<xml_diff>
--- a/kp/2026-08-14-neurostation-4bhnn0/КП-2026-08-14-001_NeuroStation_Astra_9800R_4BHNN0.docx
+++ b/kp/2026-08-14-neurostation-4bhnn0/КП-2026-08-14-001_NeuroStation_Astra_9800R_4BHNN0.docx
@@ -29,7 +29,7 @@
           <w:color w:val="1F4E79"/>
           <w:sz w:val="26"/>
         </w:rPr>
-        <w:t>№ КП-2026-08-14-001, редакция 2 от 14 августа 2026 г.</w:t>
+        <w:t>№ КП-2026-08-14-001, редакция 3 от 14 августа 2026 г.</w:t>
       </w:r>
     </w:p>
     <w:p>
@@ -44,7 +44,7 @@
           <w:color w:val="000000"/>
           <w:sz w:val="22"/>
         </w:rPr>
-        <w:t>Предмет: поставка 2 видеорегистраторов TRASSIR NeuroStation Astra 9800R/128-S и 51 камеры (1× НИЦ 1143, 49× РУВЕР 4MBIR-28-TMLW, 1× PTZ 2BPBDD-4794-20). Все камеры — со СТ-1. Валюта — российский рубль. НДС включён в цены (ставка 22%). Срок действия цен — до 28.08.2026.</w:t>
+        <w:t>Предмет: поставка 2 видеорегистраторов TRASSIR NeuroStation Astra 9800R/128-S и 51 камеры TRASSIR со СТ-1 (1× TR-D3153IR2 v2 (R), 49× TR-D2151IR3 v2 (R), 1× PTZ TR-D6124IR10 v3 (R)). Валюта — российский рубль. НДС включён в цены (ставка 22%). Срок действия цен — до 28.08.2026.</w:t>
       </w:r>
     </w:p>
     <w:p>
@@ -59,7 +59,7 @@
           <w:color w:val="595959"/>
           <w:sz w:val="20"/>
         </w:rPr>
-        <w:t>Документ — ориентировочный расчёт по открытым ценам на 14.08.2026. Итоговая цена, наличие, срок и выдача СТ-1 на партию фиксируются в официальном КП DSSL, НИЦ «Технологии» и ООО «Айпи Плюс».</w:t>
+        <w:t>Документ — ориентировочный расчёт по открытым ценам на 14.08.2026. Итоговая цена, наличие, срок и выдача СТ-1 на партию фиксируются в официальном КП DSSL / дилера TRASSIR.</w:t>
       </w:r>
     </w:p>
     <w:tbl>
@@ -244,7 +244,7 @@
                 <w:color w:val="000000"/>
                 <w:sz w:val="20"/>
               </w:rPr>
-              <w:t>к заполнению (DSSL / TRASSIR, НИЦ «Технологии», ООО «Айпи Плюс» / РУВЕР)</w:t>
+              <w:t>к заполнению (DSSL / авторизованный дилер TRASSIR)</w:t>
             </w:r>
           </w:p>
         </w:tc>
@@ -303,7 +303,7 @@
                 <w:color w:val="000000"/>
                 <w:sz w:val="20"/>
               </w:rPr>
-              <w:t>регистраторы: 5–15 раб. дней при наличии; камеры — под заказ</w:t>
+              <w:t>регистраторы: 5–15 раб. дней при наличии; камеры СТ-1 — проектная поставка</w:t>
             </w:r>
           </w:p>
         </w:tc>
@@ -922,7 +922,7 @@
                 <w:color w:val="000000"/>
                 <w:sz w:val="16"/>
               </w:rPr>
-              <w:t>Купольная IP 4 Мп, мотор 2.7–13.5 мм, ИК 35 м, IP66/IK10, ПО Nexus. НИЦ модель 1143</w:t>
+              <w:t>Аналог НИЦ 1143: уличный вандалостойкий купол TRASSIR 5 Мп, мотор 2.7–13.5 мм, ИК 25 м, IP66/IK10, микрофон. СТ-1 / РЭП</w:t>
             </w:r>
           </w:p>
         </w:tc>
@@ -951,7 +951,7 @@
                 <w:color w:val="000000"/>
                 <w:sz w:val="16"/>
               </w:rPr>
-              <w:t>4MP-DOM-2.7-13.5M Nexus</w:t>
+              <w:t>TR-D3153IR2 v2 (R) 2.7-13.5</w:t>
             </w:r>
           </w:p>
         </w:tc>
@@ -1067,7 +1067,7 @@
                 <w:color w:val="000000"/>
                 <w:sz w:val="16"/>
               </w:rPr>
-              <w:t>23 800</w:t>
+              <w:t>16 380</w:t>
             </w:r>
           </w:p>
         </w:tc>
@@ -1096,7 +1096,7 @@
                 <w:color w:val="000000"/>
                 <w:sz w:val="16"/>
               </w:rPr>
-              <w:t>23 800</w:t>
+              <w:t>16 380</w:t>
             </w:r>
           </w:p>
         </w:tc>
@@ -1156,7 +1156,7 @@
                 <w:color w:val="000000"/>
                 <w:sz w:val="16"/>
               </w:rPr>
-              <w:t>Уличная цилиндрическая IP 4 Мп Mini Bullet, 2.8 мм, ИК + белый свет, микрофон. Производитель РУВЕР</w:t>
+              <w:t>Аналог 4MBIR-28-TMLW: уличный цилиндр TRASSIR 5 Мп, фикс 2.8 мм, ИК 35 м, микрофон, IP67. СТ-1 / РЭП</w:t>
             </w:r>
           </w:p>
         </w:tc>
@@ -1185,7 +1185,7 @@
                 <w:color w:val="000000"/>
                 <w:sz w:val="16"/>
               </w:rPr>
-              <w:t>4MBIR-28-TMLW</w:t>
+              <w:t>TR-D2151IR3 v2 (R) 2.8</w:t>
             </w:r>
           </w:p>
         </w:tc>
@@ -1301,7 +1301,7 @@
                 <w:color w:val="000000"/>
                 <w:sz w:val="16"/>
               </w:rPr>
-              <w:t>18 500</w:t>
+              <w:t>16 800</w:t>
             </w:r>
           </w:p>
         </w:tc>
@@ -1330,7 +1330,7 @@
                 <w:color w:val="000000"/>
                 <w:sz w:val="16"/>
               </w:rPr>
-              <w:t>906 500</w:t>
+              <w:t>823 200</w:t>
             </w:r>
           </w:p>
         </w:tc>
@@ -1390,7 +1390,7 @@
                 <w:color w:val="000000"/>
                 <w:sz w:val="16"/>
               </w:rPr>
-              <w:t>PTZ уличная 2 Мп, зум ×20 (4.7–94 мм), IP66. Самая недорогая PTZ РУВЕР с СТ-1 в серии 2 Мп</w:t>
+              <w:t>Аналог PTZ: уличная поворотная TRASSIR 2 Мп, зум ×20 (4.3–86 мм), ИК 100 м, IP66/IK10. Самая недорогая PTZ TRASSIR ×20 со СТ-1</w:t>
             </w:r>
           </w:p>
         </w:tc>
@@ -1419,7 +1419,7 @@
                 <w:color w:val="000000"/>
                 <w:sz w:val="16"/>
               </w:rPr>
-              <w:t>2BPBDD-4794-20</w:t>
+              <w:t>TR-D6124IR10 v3 (R) 4.3-86</w:t>
             </w:r>
           </w:p>
         </w:tc>
@@ -1535,7 +1535,7 @@
                 <w:color w:val="000000"/>
                 <w:sz w:val="16"/>
               </w:rPr>
-              <w:t>92 750</w:t>
+              <w:t>49 770</w:t>
             </w:r>
           </w:p>
         </w:tc>
@@ -1564,7 +1564,7 @@
                 <w:color w:val="000000"/>
                 <w:sz w:val="16"/>
               </w:rPr>
-              <w:t>92 750</w:t>
+              <w:t>49 770</w:t>
             </w:r>
           </w:p>
         </w:tc>
@@ -1711,7 +1711,7 @@
                 <w:color w:val="000000"/>
                 <w:sz w:val="16"/>
               </w:rPr>
-              <w:t>1 978 530</w:t>
+              <w:t>1 844 830</w:t>
             </w:r>
           </w:p>
         </w:tc>
@@ -1771,7 +1771,7 @@
                 <w:color w:val="000000"/>
                 <w:sz w:val="16"/>
               </w:rPr>
-              <w:t>356 784,10</w:t>
+              <w:t>332 674,26</w:t>
             </w:r>
           </w:p>
         </w:tc>
@@ -1831,7 +1831,7 @@
                 <w:color w:val="000000"/>
                 <w:sz w:val="16"/>
               </w:rPr>
-              <w:t>1 621 745,90</w:t>
+              <w:t>1 512 155,74</w:t>
             </w:r>
           </w:p>
         </w:tc>
@@ -1863,7 +1863,7 @@
           <w:color w:val="000000"/>
           <w:sz w:val="22"/>
         </w:rPr>
-        <w:t>Регистратор не содержит лицензий на IP-камеры и HDD. Камеры НИЦ/РУВЕР — не native TRASSIR, на каждый канал нужна лицензия AnyIP.</w:t>
+        <w:t>Регистратор NeuroStation Astra не содержит лицензий на IP-камеры и HDD. Для Astra Linux нужна лицензия AnyIP (Astra Linux), код DSSL 95887. «ПО TRASSIR в подарок» на камерах — для обычного TRASSIR OS; применимость к Astra уточнить у DSSL.</w:t>
       </w:r>
     </w:p>
     <w:tbl>
@@ -2142,7 +2142,7 @@
                 <w:color w:val="000000"/>
                 <w:sz w:val="16"/>
               </w:rPr>
-              <w:t>Лицензия TRASSIR AnyIP (TRASSIR OS) — подключение 1 IP-камеры</w:t>
+              <w:t>Лицензия TRASSIR AnyIP (Astra Linux) — подключение 1 IP-камеры к NeuroStation Astra</w:t>
             </w:r>
           </w:p>
         </w:tc>
@@ -2171,7 +2171,7 @@
                 <w:color w:val="000000"/>
                 <w:sz w:val="16"/>
               </w:rPr>
-              <w:t>DSSL 57885</w:t>
+              <w:t>DSSL 95887</w:t>
             </w:r>
           </w:p>
         </w:tc>
@@ -2304,7 +2304,7 @@
           <w:color w:val="1F4E79"/>
           <w:sz w:val="24"/>
         </w:rPr>
-        <w:t>Итого запрос + лицензии AnyIP: 2 238 120 ₽</w:t>
+        <w:t>Итого запрос + лицензии AnyIP Astra: 2 104 420 ₽</w:t>
       </w:r>
       <w:r>
         <w:rPr>
@@ -2313,7 +2313,7 @@
           <w:color w:val="000000"/>
           <w:sz w:val="22"/>
         </w:rPr>
-        <w:t xml:space="preserve">  (в т.ч. НДС 22% — 403 595,41 ₽).</w:t>
+        <w:t xml:space="preserve">  (в т.ч. НДС 22% — 379 485,57 ₽).</w:t>
       </w:r>
     </w:p>
     <w:p>
@@ -3030,7 +3030,7 @@
                 <w:color w:val="000000"/>
                 <w:sz w:val="16"/>
               </w:rPr>
-              <w:t>1 978 530</w:t>
+              <w:t>1 844 830</w:t>
             </w:r>
           </w:p>
         </w:tc>
@@ -3090,7 +3090,7 @@
                 <w:color w:val="000000"/>
                 <w:sz w:val="16"/>
               </w:rPr>
-              <w:t>2 238 120</w:t>
+              <w:t>2 104 420</w:t>
             </w:r>
           </w:p>
         </w:tc>
@@ -3150,7 +3150,7 @@
                 <w:color w:val="000000"/>
                 <w:sz w:val="16"/>
               </w:rPr>
-              <w:t>2 679 720</w:t>
+              <w:t>2 546 020</w:t>
             </w:r>
           </w:p>
         </w:tc>
@@ -3210,7 +3210,7 @@
                 <w:color w:val="000000"/>
                 <w:sz w:val="16"/>
               </w:rPr>
-              <w:t>2 989 920</w:t>
+              <w:t>2 856 220</w:t>
             </w:r>
           </w:p>
         </w:tc>
@@ -3242,7 +3242,7 @@
           <w:color w:val="1F4E79"/>
           <w:sz w:val="26"/>
         </w:rPr>
-        <w:t>4. Кратко по оборудованию и СТ-1</w:t>
+        <w:t>4. Подбор аналогов TRASSIR и СТ-1</w:t>
       </w:r>
     </w:p>
     <w:p>
@@ -3273,7 +3273,7 @@
           <w:color w:val="000000"/>
           <w:sz w:val="22"/>
         </w:rPr>
-        <w:t xml:space="preserve">4.2. НИЦ модель 1143, 4MP-DOM-2.7-13.5M Nexus — 1 шт. </w:t>
+        <w:t xml:space="preserve">4.2. Аналог НИЦ 1143 — TR-D3153IR2 v2 (R) 2.7-13.5 — 1 шт. </w:t>
       </w:r>
       <w:r>
         <w:rPr>
@@ -3282,7 +3282,7 @@
           <w:color w:val="000000"/>
           <w:sz w:val="22"/>
         </w:rPr>
-        <w:t>Купол 4 Мп, Sony IMX335, мотор 2.7–13.5 мм, ИК до 35 м, IP66/IK10, PoE, −45…+50 °C, ПО Nexus (реестр Минцифры №12466). Изготовитель ООО «НИЦ Технологии», Россия. СТ-1 на партию — у завода. Спецификация: nic-tech.ru, модель 1143.</w:t>
+        <w:t>Уличный вандалостойкий купол 5 Мп (вместо 4 Мп: в линейке СТ-1 нет 4 Мп), мотор 2.7–13.5 мм, ИК 25 м (у 1143 — 35 м), IP66/IK10, микрофон, сборка РФ, СТ-1 / РЭП. Код DSSL 10100. Ориентир цены 16 380 ₽ — розница исполнения (D).</w:t>
       </w:r>
     </w:p>
     <w:p>
@@ -3293,7 +3293,7 @@
           <w:color w:val="000000"/>
           <w:sz w:val="22"/>
         </w:rPr>
-        <w:t xml:space="preserve">4.3. РУВЕР 4MBIR-28-TMLW — 49 шт. </w:t>
+        <w:t xml:space="preserve">4.3. Аналог 4MBIR-28-TMLW — TR-D2151IR3 v2 (R) 2.8 — 49 шт. </w:t>
       </w:r>
       <w:r>
         <w:rPr>
@@ -3302,7 +3302,7 @@
           <w:color w:val="000000"/>
           <w:sz w:val="22"/>
         </w:rPr>
-        <w:t>Mini Bullet 4 Мп, фикс 2.8 мм, ИК + белый свет, микрофон. Производитель RUWARE, продавец ООО «Айпи Плюс». В каталоге ipplus.ru флаг СТ-1. https://www.ipplus.ru/catalog/ip-kamery/ip-kamery-4mp/4mbir-28-tmlw</w:t>
+        <w:t>Уличный цилиндр 5 Мп, фикс 2.8 мм, ИК 35 м, микрофон, IP67, СТ-1 / РЭП. Код DSSL 16725. Ориентир 16 800 ₽. Отличие: нет комбинированной подсветки ИК+белый (Dual Light в СТ-1 5 Мп нет).</w:t>
       </w:r>
     </w:p>
     <w:p>
@@ -3313,7 +3313,7 @@
           <w:color w:val="000000"/>
           <w:sz w:val="22"/>
         </w:rPr>
-        <w:t xml:space="preserve">4.4. PTZ РУВЕР 2BPBDD-4794-20 — 1 шт. </w:t>
+        <w:t xml:space="preserve">4.4. Аналог PTZ — TR-D6124IR10 v3 (R) 4.3-86 — 1 шт. </w:t>
       </w:r>
       <w:r>
         <w:rPr>
@@ -3322,7 +3322,7 @@
           <w:color w:val="000000"/>
           <w:sz w:val="22"/>
         </w:rPr>
-        <w:t>Самая недорогая поворотная камера того же производителя (РУВЕР / Айпи Плюс) с СТ-1: 2 Мп, зум ×20, 4.7–94 мм, IP66. Модели ×10 в каталоге без СТ-1 не предлагаются. https://www.ipplus.ru/catalog/ptz-kamery/ptz-kamery-2mp/2bpbdd-4794-20</w:t>
+        <w:t>Самая недорогая поворотная камера TRASSIR с зумом ×20 и СТ-1: 2 Мп, 4.3–86 мм, ИК 100 м, IP66/IK10, PoE/12 В. Код DSSL 90684. Ориентир 49 770 ₽ (розница v3 / (D)).</w:t>
       </w:r>
     </w:p>
     <w:p>
@@ -3351,7 +3351,7 @@
           <w:color w:val="000000"/>
           <w:sz w:val="22"/>
         </w:rPr>
-        <w:t>1. Цены в рублях с НДС 22%, ориентир открытого рынка на 14.08.2026, редакция 2.</w:t>
+        <w:t>1. Цены в рублях с НДС 22%, ориентир открытого рынка на 14.08.2026, редакция 3. Всё оборудование — DSSL/TRASSIR.</w:t>
       </w:r>
     </w:p>
     <w:p>
@@ -3366,7 +3366,7 @@
           <w:color w:val="000000"/>
           <w:sz w:val="22"/>
         </w:rPr>
-        <w:t>2. В поставке камер — сертификат СТ-1 на партию и/или номер реестровой записи РЭП (ПП РФ №878).</w:t>
+        <w:t>2. Камеры — исполнения (R) со сертификатом СТ-1 и записью в РЭП (ПП РФ №878). Цена (R) у DSSL проектная.</w:t>
       </w:r>
     </w:p>
     <w:p>
@@ -3411,7 +3411,7 @@
           <w:color w:val="000000"/>
           <w:sz w:val="22"/>
         </w:rPr>
-        <w:t>5. Регистраторы поставляются без HDD и без лицензий AnyIP.</w:t>
+        <w:t>5. Регистраторы поставляются без HDD. Лицензии AnyIP (Astra Linux, 95887) в комплект NVR не входят.</w:t>
       </w:r>
     </w:p>
     <w:p>
@@ -3426,22 +3426,7 @@
           <w:color w:val="000000"/>
           <w:sz w:val="22"/>
         </w:rPr>
-        <w:t>6. Цены камер РУВЕР фиксируются КП ООО «Айпи Плюс»; НИЦ 1143 — КП НИЦ / дилера.</w:t>
-      </w:r>
-    </w:p>
-    <w:p>
-      <w:pPr>
-        <w:spacing w:after="40"/>
-        <w:ind w:left="283"/>
-      </w:pPr>
-      <w:r>
-        <w:rPr>
-          <w:rFonts w:ascii="Times New Roman" w:hAnsi="Times New Roman" w:cs="Times New Roman" w:eastAsia="Times New Roman"/>
-          <w:b w:val="0"/>
-          <w:color w:val="000000"/>
-          <w:sz w:val="22"/>
-        </w:rPr>
-        <w:t>7. DSSL даёт проектную цену на NeuroStation — партнёрская может быть ниже 477 740 ₽.</w:t>
+        <w:t>6. DSSL даёт проектную цену на NeuroStation и камеры СТ-1 — партнёрская может быть ниже розницы.</w:t>
       </w:r>
     </w:p>
     <w:p>
@@ -3555,7 +3540,7 @@
                 <w:color w:val="000000"/>
                 <w:sz w:val="16"/>
               </w:rPr>
-              <w:t>DSSL / TRASSIR</w:t>
+              <w:t>DSSL / TRASSIR (всё оборудование)</w:t>
             </w:r>
           </w:p>
         </w:tc>
@@ -3584,7 +3569,7 @@
                 <w:color w:val="000000"/>
                 <w:sz w:val="16"/>
               </w:rPr>
-              <w:t>8 (800) 100-91-12, dssl.ru, код товара NVR 80222</w:t>
+              <w:t>8 (800) 100-91-12, dssl.ru</w:t>
             </w:r>
           </w:p>
         </w:tc>
@@ -3615,7 +3600,7 @@
                 <w:color w:val="000000"/>
                 <w:sz w:val="16"/>
               </w:rPr>
-              <w:t>НИЦ «Технологии» (камера 1143)</w:t>
+              <w:t>NVR NeuroStation Astra 9800R/128-S</w:t>
             </w:r>
           </w:p>
         </w:tc>
@@ -3644,7 +3629,7 @@
                 <w:color w:val="000000"/>
                 <w:sz w:val="16"/>
               </w:rPr>
-              <w:t>nic-tech.ru, support@nic-tech.ru, 8 (800) 555-47-65</w:t>
+              <w:t>код 80222</w:t>
             </w:r>
           </w:p>
         </w:tc>
@@ -3675,7 +3660,7 @@
                 <w:color w:val="000000"/>
                 <w:sz w:val="16"/>
               </w:rPr>
-              <w:t>ООО «Айпи Плюс» / РУВЕР (4MBIR, PTZ)</w:t>
+              <w:t>Купол TR-D3153IR2 v2 (R)</w:t>
             </w:r>
           </w:p>
         </w:tc>
@@ -3704,7 +3689,187 @@
                 <w:color w:val="000000"/>
                 <w:sz w:val="16"/>
               </w:rPr>
-              <w:t>8 804 333-73-02, info@ipplus.ru, ipplus.ru</w:t>
+              <w:t>код 10100</w:t>
+            </w:r>
+          </w:p>
+        </w:tc>
+      </w:tr>
+      <w:tr>
+        <w:tc>
+          <w:tcPr>
+            <w:tcW w:type="dxa" w:w="5103"/>
+            <w:shd w:fill="FFFFFF" w:val="clear"/>
+            <w:tcBorders>
+              <w:top w:val="single" w:sz="4" w:space="0" w:color="BFBFBF"/>
+              <w:left w:val="single" w:sz="4" w:space="0" w:color="BFBFBF"/>
+              <w:bottom w:val="single" w:sz="4" w:space="0" w:color="BFBFBF"/>
+              <w:right w:val="single" w:sz="4" w:space="0" w:color="BFBFBF"/>
+            </w:tcBorders>
+            <w:vAlign w:val="center"/>
+          </w:tcPr>
+          <w:p>
+            <w:pPr>
+              <w:spacing w:before="40" w:after="40"/>
+              <w:jc w:val="center"/>
+            </w:pPr>
+            <w:r/>
+            <w:r>
+              <w:rPr>
+                <w:rFonts w:ascii="Times New Roman" w:hAnsi="Times New Roman" w:cs="Times New Roman" w:eastAsia="Times New Roman"/>
+                <w:b w:val="0"/>
+                <w:color w:val="000000"/>
+                <w:sz w:val="16"/>
+              </w:rPr>
+              <w:t>Цилиндр TR-D2151IR3 v2 (R)</w:t>
+            </w:r>
+          </w:p>
+        </w:tc>
+        <w:tc>
+          <w:tcPr>
+            <w:tcW w:type="dxa" w:w="5103"/>
+            <w:shd w:fill="FFFFFF" w:val="clear"/>
+            <w:tcBorders>
+              <w:top w:val="single" w:sz="4" w:space="0" w:color="BFBFBF"/>
+              <w:left w:val="single" w:sz="4" w:space="0" w:color="BFBFBF"/>
+              <w:bottom w:val="single" w:sz="4" w:space="0" w:color="BFBFBF"/>
+              <w:right w:val="single" w:sz="4" w:space="0" w:color="BFBFBF"/>
+            </w:tcBorders>
+            <w:vAlign w:val="center"/>
+          </w:tcPr>
+          <w:p>
+            <w:pPr>
+              <w:spacing w:before="40" w:after="40"/>
+              <w:jc w:val="left"/>
+            </w:pPr>
+            <w:r/>
+            <w:r>
+              <w:rPr>
+                <w:rFonts w:ascii="Times New Roman" w:hAnsi="Times New Roman" w:cs="Times New Roman" w:eastAsia="Times New Roman"/>
+                <w:b w:val="0"/>
+                <w:color w:val="000000"/>
+                <w:sz w:val="16"/>
+              </w:rPr>
+              <w:t>код 16725</w:t>
+            </w:r>
+          </w:p>
+        </w:tc>
+      </w:tr>
+      <w:tr>
+        <w:tc>
+          <w:tcPr>
+            <w:tcW w:type="dxa" w:w="5103"/>
+            <w:shd w:fill="F2F2F2" w:val="clear"/>
+            <w:tcBorders>
+              <w:top w:val="single" w:sz="4" w:space="0" w:color="BFBFBF"/>
+              <w:left w:val="single" w:sz="4" w:space="0" w:color="BFBFBF"/>
+              <w:bottom w:val="single" w:sz="4" w:space="0" w:color="BFBFBF"/>
+              <w:right w:val="single" w:sz="4" w:space="0" w:color="BFBFBF"/>
+            </w:tcBorders>
+            <w:vAlign w:val="center"/>
+          </w:tcPr>
+          <w:p>
+            <w:pPr>
+              <w:spacing w:before="40" w:after="40"/>
+              <w:jc w:val="center"/>
+            </w:pPr>
+            <w:r/>
+            <w:r>
+              <w:rPr>
+                <w:rFonts w:ascii="Times New Roman" w:hAnsi="Times New Roman" w:cs="Times New Roman" w:eastAsia="Times New Roman"/>
+                <w:b w:val="0"/>
+                <w:color w:val="000000"/>
+                <w:sz w:val="16"/>
+              </w:rPr>
+              <w:t>PTZ TR-D6124IR10 v3 (R)</w:t>
+            </w:r>
+          </w:p>
+        </w:tc>
+        <w:tc>
+          <w:tcPr>
+            <w:tcW w:type="dxa" w:w="5103"/>
+            <w:shd w:fill="F2F2F2" w:val="clear"/>
+            <w:tcBorders>
+              <w:top w:val="single" w:sz="4" w:space="0" w:color="BFBFBF"/>
+              <w:left w:val="single" w:sz="4" w:space="0" w:color="BFBFBF"/>
+              <w:bottom w:val="single" w:sz="4" w:space="0" w:color="BFBFBF"/>
+              <w:right w:val="single" w:sz="4" w:space="0" w:color="BFBFBF"/>
+            </w:tcBorders>
+            <w:vAlign w:val="center"/>
+          </w:tcPr>
+          <w:p>
+            <w:pPr>
+              <w:spacing w:before="40" w:after="40"/>
+              <w:jc w:val="left"/>
+            </w:pPr>
+            <w:r/>
+            <w:r>
+              <w:rPr>
+                <w:rFonts w:ascii="Times New Roman" w:hAnsi="Times New Roman" w:cs="Times New Roman" w:eastAsia="Times New Roman"/>
+                <w:b w:val="0"/>
+                <w:color w:val="000000"/>
+                <w:sz w:val="16"/>
+              </w:rPr>
+              <w:t>код 90684</w:t>
+            </w:r>
+          </w:p>
+        </w:tc>
+      </w:tr>
+      <w:tr>
+        <w:tc>
+          <w:tcPr>
+            <w:tcW w:type="dxa" w:w="5103"/>
+            <w:shd w:fill="FFFFFF" w:val="clear"/>
+            <w:tcBorders>
+              <w:top w:val="single" w:sz="4" w:space="0" w:color="BFBFBF"/>
+              <w:left w:val="single" w:sz="4" w:space="0" w:color="BFBFBF"/>
+              <w:bottom w:val="single" w:sz="4" w:space="0" w:color="BFBFBF"/>
+              <w:right w:val="single" w:sz="4" w:space="0" w:color="BFBFBF"/>
+            </w:tcBorders>
+            <w:vAlign w:val="center"/>
+          </w:tcPr>
+          <w:p>
+            <w:pPr>
+              <w:spacing w:before="40" w:after="40"/>
+              <w:jc w:val="center"/>
+            </w:pPr>
+            <w:r/>
+            <w:r>
+              <w:rPr>
+                <w:rFonts w:ascii="Times New Roman" w:hAnsi="Times New Roman" w:cs="Times New Roman" w:eastAsia="Times New Roman"/>
+                <w:b w:val="0"/>
+                <w:color w:val="000000"/>
+                <w:sz w:val="16"/>
+              </w:rPr>
+              <w:t>AnyIP (Astra Linux)</w:t>
+            </w:r>
+          </w:p>
+        </w:tc>
+        <w:tc>
+          <w:tcPr>
+            <w:tcW w:type="dxa" w:w="5103"/>
+            <w:shd w:fill="FFFFFF" w:val="clear"/>
+            <w:tcBorders>
+              <w:top w:val="single" w:sz="4" w:space="0" w:color="BFBFBF"/>
+              <w:left w:val="single" w:sz="4" w:space="0" w:color="BFBFBF"/>
+              <w:bottom w:val="single" w:sz="4" w:space="0" w:color="BFBFBF"/>
+              <w:right w:val="single" w:sz="4" w:space="0" w:color="BFBFBF"/>
+            </w:tcBorders>
+            <w:vAlign w:val="center"/>
+          </w:tcPr>
+          <w:p>
+            <w:pPr>
+              <w:spacing w:before="40" w:after="40"/>
+              <w:jc w:val="left"/>
+            </w:pPr>
+            <w:r/>
+            <w:r>
+              <w:rPr>
+                <w:rFonts w:ascii="Times New Roman" w:hAnsi="Times New Roman" w:cs="Times New Roman" w:eastAsia="Times New Roman"/>
+                <w:b w:val="0"/>
+                <w:color w:val="000000"/>
+                <w:sz w:val="16"/>
+              </w:rPr>
+              <w:t>код 95887</w:t>
             </w:r>
           </w:p>
         </w:tc>

</xml_diff>

<commit_message>
Align KP with two 44-FZ ETP GPB price requests for Don Rescue Center
Split the quote into procedures 998818/254364 (2× NeuroStation) and 998881/254397 (51× 4BHNN0-0-0-0), fill FGKU customer details, and set the bid deadline to 18.08.2026 00:00 MSK. Keep TRASSIR analogs only as a non-bid equivalent note.

Co-authored-by: Yury1331 <Yury1331@users.noreply.github.com>
</commit_message>
<xml_diff>
--- a/kp/2026-08-14-neurostation-4bhnn0/КП-2026-08-14-001_NeuroStation_Astra_9800R_4BHNN0.docx
+++ b/kp/2026-08-14-neurostation-4bhnn0/КП-2026-08-14-001_NeuroStation_Astra_9800R_4BHNN0.docx
@@ -29,7 +29,7 @@
           <w:color w:val="1F4E79"/>
           <w:sz w:val="26"/>
         </w:rPr>
-        <w:t>№ КП-2026-08-14-001, редакция 3 от 14 августа 2026 г.</w:t>
+        <w:t>№ КП-2026-08-14-001, редакция 4 от 14 августа 2026 г.</w:t>
       </w:r>
     </w:p>
     <w:p>
@@ -44,7 +44,7 @@
           <w:color w:val="000000"/>
           <w:sz w:val="22"/>
         </w:rPr>
-        <w:t>Предмет: поставка 2 видеорегистраторов TRASSIR NeuroStation Astra 9800R/128-S и 51 камеры TRASSIR со СТ-1 (1× TR-D3153IR2 v2 (R), 49× TR-D2151IR3 v2 (R), 1× PTZ TR-D6124IR10 v3 (R)). Валюта — российский рубль. НДС включён в цены (ставка 22%). Срок действия цен — до 28.08.2026.</w:t>
+        <w:t>Две отдельные процедуры ЭТП ГПБ, секция «Торговый портал», режим 44-ФЗ, способ — ценовой запрос. Опубликованы 12.08.2026. Срок подачи — до 18.08.2026, 00:00 МСК. НМЦ не указана. Валюта — рубль, НДС 22% включён в цены. Заявки на площадку подаются отдельно, лоты не объединять.</w:t>
       </w:r>
     </w:p>
     <w:p>
@@ -59,7 +59,7 @@
           <w:color w:val="595959"/>
           <w:sz w:val="20"/>
         </w:rPr>
-        <w:t>Документ — ориентировочный расчёт по открытым ценам на 14.08.2026. Итоговая цена, наличие, срок и выдача СТ-1 на партию фиксируются в официальном КП DSSL / дилера TRASSIR.</w:t>
+        <w:t>Ориентировочный расчёт по открытым ценам на 14.08.2026. Цена в заявке на ЭТП — ответственность участника. Карточки процедур с этой среды не открылись; состав и сроки взяты из извещения заказчика.</w:t>
       </w:r>
     </w:p>
     <w:tbl>
@@ -126,7 +126,7 @@
                 <w:color w:val="000000"/>
                 <w:sz w:val="20"/>
               </w:rPr>
-              <w:t>______________________________</w:t>
+              <w:t>ФГКУ «Донской спасательный центр МЧС России»</w:t>
             </w:r>
           </w:p>
         </w:tc>
@@ -157,7 +157,7 @@
                 <w:color w:val="000000"/>
                 <w:sz w:val="20"/>
               </w:rPr>
-              <w:t>ИНН / КПП</w:t>
+              <w:t>ИНН / КПП / ОГРН</w:t>
             </w:r>
           </w:p>
         </w:tc>
@@ -185,7 +185,125 @@
                 <w:color w:val="000000"/>
                 <w:sz w:val="20"/>
               </w:rPr>
-              <w:t>______________________________</w:t>
+              <w:t>6102006605 / 610201001 / 1026100666525</w:t>
+            </w:r>
+          </w:p>
+        </w:tc>
+      </w:tr>
+      <w:tr>
+        <w:tc>
+          <w:tcPr>
+            <w:tcW w:type="dxa" w:w="2551"/>
+            <w:shd w:fill="D6E4F0" w:val="clear"/>
+            <w:tcBorders>
+              <w:top w:val="single" w:sz="4" w:space="0" w:color="BFBFBF"/>
+              <w:left w:val="single" w:sz="4" w:space="0" w:color="BFBFBF"/>
+              <w:bottom w:val="single" w:sz="4" w:space="0" w:color="BFBFBF"/>
+              <w:right w:val="single" w:sz="4" w:space="0" w:color="BFBFBF"/>
+            </w:tcBorders>
+            <w:vAlign w:val="center"/>
+          </w:tcPr>
+          <w:p>
+            <w:pPr>
+              <w:spacing w:before="40" w:after="40"/>
+              <w:jc w:val="left"/>
+            </w:pPr>
+            <w:r/>
+            <w:r>
+              <w:rPr>
+                <w:rFonts w:ascii="Times New Roman" w:hAnsi="Times New Roman" w:cs="Times New Roman" w:eastAsia="Times New Roman"/>
+                <w:b/>
+                <w:color w:val="000000"/>
+                <w:sz w:val="20"/>
+              </w:rPr>
+              <w:t>Адрес поставки</w:t>
+            </w:r>
+          </w:p>
+        </w:tc>
+        <w:tc>
+          <w:tcPr>
+            <w:tcW w:type="dxa" w:w="7654"/>
+            <w:tcBorders>
+              <w:top w:val="single" w:sz="4" w:space="0" w:color="BFBFBF"/>
+              <w:left w:val="single" w:sz="4" w:space="0" w:color="BFBFBF"/>
+              <w:bottom w:val="single" w:sz="4" w:space="0" w:color="BFBFBF"/>
+              <w:right w:val="single" w:sz="4" w:space="0" w:color="BFBFBF"/>
+            </w:tcBorders>
+            <w:vAlign w:val="center"/>
+          </w:tcPr>
+          <w:p>
+            <w:pPr>
+              <w:spacing w:before="40" w:after="40"/>
+              <w:jc w:val="left"/>
+            </w:pPr>
+            <w:r/>
+            <w:r>
+              <w:rPr>
+                <w:rFonts w:ascii="Times New Roman" w:hAnsi="Times New Roman" w:cs="Times New Roman" w:eastAsia="Times New Roman"/>
+                <w:b w:val="0"/>
+                <w:color w:val="000000"/>
+                <w:sz w:val="20"/>
+              </w:rPr>
+              <w:t>346709, Ростовская обл., Аксайский р-н, п. Ковалевка, ул. Салютная, д. 2</w:t>
+            </w:r>
+          </w:p>
+        </w:tc>
+      </w:tr>
+      <w:tr>
+        <w:tc>
+          <w:tcPr>
+            <w:tcW w:type="dxa" w:w="2551"/>
+            <w:shd w:fill="D6E4F0" w:val="clear"/>
+            <w:tcBorders>
+              <w:top w:val="single" w:sz="4" w:space="0" w:color="BFBFBF"/>
+              <w:left w:val="single" w:sz="4" w:space="0" w:color="BFBFBF"/>
+              <w:bottom w:val="single" w:sz="4" w:space="0" w:color="BFBFBF"/>
+              <w:right w:val="single" w:sz="4" w:space="0" w:color="BFBFBF"/>
+            </w:tcBorders>
+            <w:vAlign w:val="center"/>
+          </w:tcPr>
+          <w:p>
+            <w:pPr>
+              <w:spacing w:before="40" w:after="40"/>
+              <w:jc w:val="left"/>
+            </w:pPr>
+            <w:r/>
+            <w:r>
+              <w:rPr>
+                <w:rFonts w:ascii="Times New Roman" w:hAnsi="Times New Roman" w:cs="Times New Roman" w:eastAsia="Times New Roman"/>
+                <w:b/>
+                <w:color w:val="000000"/>
+                <w:sz w:val="20"/>
+              </w:rPr>
+              <w:t>Контакт</w:t>
+            </w:r>
+          </w:p>
+        </w:tc>
+        <w:tc>
+          <w:tcPr>
+            <w:tcW w:type="dxa" w:w="7654"/>
+            <w:tcBorders>
+              <w:top w:val="single" w:sz="4" w:space="0" w:color="BFBFBF"/>
+              <w:left w:val="single" w:sz="4" w:space="0" w:color="BFBFBF"/>
+              <w:bottom w:val="single" w:sz="4" w:space="0" w:color="BFBFBF"/>
+              <w:right w:val="single" w:sz="4" w:space="0" w:color="BFBFBF"/>
+            </w:tcBorders>
+            <w:vAlign w:val="center"/>
+          </w:tcPr>
+          <w:p>
+            <w:pPr>
+              <w:spacing w:before="40" w:after="40"/>
+              <w:jc w:val="left"/>
+            </w:pPr>
+            <w:r/>
+            <w:r>
+              <w:rPr>
+                <w:rFonts w:ascii="Times New Roman" w:hAnsi="Times New Roman" w:cs="Times New Roman" w:eastAsia="Times New Roman"/>
+                <w:b w:val="0"/>
+                <w:color w:val="000000"/>
+                <w:sz w:val="20"/>
+              </w:rPr>
+              <w:t>Пахомов И.В., donsc@dsc.61.mchs.gov.ru, +7 (86350) 2-71-98</w:t>
             </w:r>
           </w:p>
         </w:tc>
@@ -275,7 +393,7 @@
                 <w:color w:val="000000"/>
                 <w:sz w:val="20"/>
               </w:rPr>
-              <w:t>Срок поставки</w:t>
+              <w:t>Срок подачи</w:t>
             </w:r>
           </w:p>
         </w:tc>
@@ -303,66 +421,7 @@
                 <w:color w:val="000000"/>
                 <w:sz w:val="20"/>
               </w:rPr>
-              <w:t>регистраторы: 5–15 раб. дней при наличии; камеры СТ-1 — проектная поставка</w:t>
-            </w:r>
-          </w:p>
-        </w:tc>
-      </w:tr>
-      <w:tr>
-        <w:tc>
-          <w:tcPr>
-            <w:tcW w:type="dxa" w:w="2551"/>
-            <w:shd w:fill="D6E4F0" w:val="clear"/>
-            <w:tcBorders>
-              <w:top w:val="single" w:sz="4" w:space="0" w:color="BFBFBF"/>
-              <w:left w:val="single" w:sz="4" w:space="0" w:color="BFBFBF"/>
-              <w:bottom w:val="single" w:sz="4" w:space="0" w:color="BFBFBF"/>
-              <w:right w:val="single" w:sz="4" w:space="0" w:color="BFBFBF"/>
-            </w:tcBorders>
-            <w:vAlign w:val="center"/>
-          </w:tcPr>
-          <w:p>
-            <w:pPr>
-              <w:spacing w:before="40" w:after="40"/>
-              <w:jc w:val="left"/>
-            </w:pPr>
-            <w:r/>
-            <w:r>
-              <w:rPr>
-                <w:rFonts w:ascii="Times New Roman" w:hAnsi="Times New Roman" w:cs="Times New Roman" w:eastAsia="Times New Roman"/>
-                <w:b/>
-                <w:color w:val="000000"/>
-                <w:sz w:val="20"/>
-              </w:rPr>
-              <w:t>Оплата</w:t>
-            </w:r>
-          </w:p>
-        </w:tc>
-        <w:tc>
-          <w:tcPr>
-            <w:tcW w:type="dxa" w:w="7654"/>
-            <w:tcBorders>
-              <w:top w:val="single" w:sz="4" w:space="0" w:color="BFBFBF"/>
-              <w:left w:val="single" w:sz="4" w:space="0" w:color="BFBFBF"/>
-              <w:bottom w:val="single" w:sz="4" w:space="0" w:color="BFBFBF"/>
-              <w:right w:val="single" w:sz="4" w:space="0" w:color="BFBFBF"/>
-            </w:tcBorders>
-            <w:vAlign w:val="center"/>
-          </w:tcPr>
-          <w:p>
-            <w:pPr>
-              <w:spacing w:before="40" w:after="40"/>
-              <w:jc w:val="left"/>
-            </w:pPr>
-            <w:r/>
-            <w:r>
-              <w:rPr>
-                <w:rFonts w:ascii="Times New Roman" w:hAnsi="Times New Roman" w:cs="Times New Roman" w:eastAsia="Times New Roman"/>
-                <w:b w:val="0"/>
-                <w:color w:val="000000"/>
-                <w:sz w:val="20"/>
-              </w:rPr>
-              <w:t>по договору (типовой ориентир: 100% предоплата или 70/30)</w:t>
+              <w:t>до 18.08.2026, 00:00 МСК</w:t>
             </w:r>
           </w:p>
         </w:tc>
@@ -379,1491 +438,7 @@
           <w:color w:val="1F4E79"/>
           <w:sz w:val="26"/>
         </w:rPr>
-        <w:t>1. Спецификация по запросу</w:t>
-      </w:r>
-    </w:p>
-    <w:tbl>
-      <w:tblPr>
-        <w:tblW w:type="auto" w:w="0"/>
-        <w:jc w:val="center"/>
-        <w:tblLayout w:type="autofit"/>
-        <w:tblLook w:firstColumn="1" w:firstRow="1" w:lastColumn="0" w:lastRow="0" w:noHBand="0" w:noVBand="1" w:val="04A0"/>
-      </w:tblPr>
-      <w:tblGrid>
-        <w:gridCol w:w="1276"/>
-        <w:gridCol w:w="1276"/>
-        <w:gridCol w:w="1276"/>
-        <w:gridCol w:w="1276"/>
-        <w:gridCol w:w="1276"/>
-        <w:gridCol w:w="1276"/>
-        <w:gridCol w:w="1276"/>
-        <w:gridCol w:w="1276"/>
-      </w:tblGrid>
-      <w:tr>
-        <w:tc>
-          <w:tcPr>
-            <w:tcW w:type="dxa" w:w="1276"/>
-            <w:shd w:fill="1F4E79" w:val="clear"/>
-            <w:tcBorders>
-              <w:top w:val="single" w:sz="4" w:space="0" w:color="BFBFBF"/>
-              <w:left w:val="single" w:sz="4" w:space="0" w:color="BFBFBF"/>
-              <w:bottom w:val="single" w:sz="4" w:space="0" w:color="BFBFBF"/>
-              <w:right w:val="single" w:sz="4" w:space="0" w:color="BFBFBF"/>
-            </w:tcBorders>
-            <w:vAlign w:val="center"/>
-          </w:tcPr>
-          <w:p>
-            <w:pPr>
-              <w:spacing w:before="40" w:after="40"/>
-              <w:jc w:val="center"/>
-            </w:pPr>
-            <w:r/>
-            <w:r>
-              <w:rPr>
-                <w:rFonts w:ascii="Times New Roman" w:hAnsi="Times New Roman" w:cs="Times New Roman" w:eastAsia="Times New Roman"/>
-                <w:b/>
-                <w:color w:val="FFFFFF"/>
-                <w:sz w:val="16"/>
-              </w:rPr>
-              <w:t>№</w:t>
-            </w:r>
-          </w:p>
-        </w:tc>
-        <w:tc>
-          <w:tcPr>
-            <w:tcW w:type="dxa" w:w="1276"/>
-            <w:shd w:fill="1F4E79" w:val="clear"/>
-            <w:tcBorders>
-              <w:top w:val="single" w:sz="4" w:space="0" w:color="BFBFBF"/>
-              <w:left w:val="single" w:sz="4" w:space="0" w:color="BFBFBF"/>
-              <w:bottom w:val="single" w:sz="4" w:space="0" w:color="BFBFBF"/>
-              <w:right w:val="single" w:sz="4" w:space="0" w:color="BFBFBF"/>
-            </w:tcBorders>
-            <w:vAlign w:val="center"/>
-          </w:tcPr>
-          <w:p>
-            <w:pPr>
-              <w:spacing w:before="40" w:after="40"/>
-              <w:jc w:val="center"/>
-            </w:pPr>
-            <w:r/>
-            <w:r>
-              <w:rPr>
-                <w:rFonts w:ascii="Times New Roman" w:hAnsi="Times New Roman" w:cs="Times New Roman" w:eastAsia="Times New Roman"/>
-                <w:b/>
-                <w:color w:val="FFFFFF"/>
-                <w:sz w:val="16"/>
-              </w:rPr>
-              <w:t>Наименование</w:t>
-            </w:r>
-          </w:p>
-        </w:tc>
-        <w:tc>
-          <w:tcPr>
-            <w:tcW w:type="dxa" w:w="1276"/>
-            <w:shd w:fill="1F4E79" w:val="clear"/>
-            <w:tcBorders>
-              <w:top w:val="single" w:sz="4" w:space="0" w:color="BFBFBF"/>
-              <w:left w:val="single" w:sz="4" w:space="0" w:color="BFBFBF"/>
-              <w:bottom w:val="single" w:sz="4" w:space="0" w:color="BFBFBF"/>
-              <w:right w:val="single" w:sz="4" w:space="0" w:color="BFBFBF"/>
-            </w:tcBorders>
-            <w:vAlign w:val="center"/>
-          </w:tcPr>
-          <w:p>
-            <w:pPr>
-              <w:spacing w:before="40" w:after="40"/>
-              <w:jc w:val="center"/>
-            </w:pPr>
-            <w:r/>
-            <w:r>
-              <w:rPr>
-                <w:rFonts w:ascii="Times New Roman" w:hAnsi="Times New Roman" w:cs="Times New Roman" w:eastAsia="Times New Roman"/>
-                <w:b/>
-                <w:color w:val="FFFFFF"/>
-                <w:sz w:val="16"/>
-              </w:rPr>
-              <w:t>Артикул</w:t>
-            </w:r>
-          </w:p>
-        </w:tc>
-        <w:tc>
-          <w:tcPr>
-            <w:tcW w:type="dxa" w:w="1276"/>
-            <w:shd w:fill="1F4E79" w:val="clear"/>
-            <w:tcBorders>
-              <w:top w:val="single" w:sz="4" w:space="0" w:color="BFBFBF"/>
-              <w:left w:val="single" w:sz="4" w:space="0" w:color="BFBFBF"/>
-              <w:bottom w:val="single" w:sz="4" w:space="0" w:color="BFBFBF"/>
-              <w:right w:val="single" w:sz="4" w:space="0" w:color="BFBFBF"/>
-            </w:tcBorders>
-            <w:vAlign w:val="center"/>
-          </w:tcPr>
-          <w:p>
-            <w:pPr>
-              <w:spacing w:before="40" w:after="40"/>
-              <w:jc w:val="center"/>
-            </w:pPr>
-            <w:r/>
-            <w:r>
-              <w:rPr>
-                <w:rFonts w:ascii="Times New Roman" w:hAnsi="Times New Roman" w:cs="Times New Roman" w:eastAsia="Times New Roman"/>
-                <w:b/>
-                <w:color w:val="FFFFFF"/>
-                <w:sz w:val="16"/>
-              </w:rPr>
-              <w:t>СТ-1</w:t>
-            </w:r>
-          </w:p>
-        </w:tc>
-        <w:tc>
-          <w:tcPr>
-            <w:tcW w:type="dxa" w:w="1276"/>
-            <w:shd w:fill="1F4E79" w:val="clear"/>
-            <w:tcBorders>
-              <w:top w:val="single" w:sz="4" w:space="0" w:color="BFBFBF"/>
-              <w:left w:val="single" w:sz="4" w:space="0" w:color="BFBFBF"/>
-              <w:bottom w:val="single" w:sz="4" w:space="0" w:color="BFBFBF"/>
-              <w:right w:val="single" w:sz="4" w:space="0" w:color="BFBFBF"/>
-            </w:tcBorders>
-            <w:vAlign w:val="center"/>
-          </w:tcPr>
-          <w:p>
-            <w:pPr>
-              <w:spacing w:before="40" w:after="40"/>
-              <w:jc w:val="center"/>
-            </w:pPr>
-            <w:r/>
-            <w:r>
-              <w:rPr>
-                <w:rFonts w:ascii="Times New Roman" w:hAnsi="Times New Roman" w:cs="Times New Roman" w:eastAsia="Times New Roman"/>
-                <w:b/>
-                <w:color w:val="FFFFFF"/>
-                <w:sz w:val="16"/>
-              </w:rPr>
-              <w:t>Ед.</w:t>
-            </w:r>
-          </w:p>
-        </w:tc>
-        <w:tc>
-          <w:tcPr>
-            <w:tcW w:type="dxa" w:w="1276"/>
-            <w:shd w:fill="1F4E79" w:val="clear"/>
-            <w:tcBorders>
-              <w:top w:val="single" w:sz="4" w:space="0" w:color="BFBFBF"/>
-              <w:left w:val="single" w:sz="4" w:space="0" w:color="BFBFBF"/>
-              <w:bottom w:val="single" w:sz="4" w:space="0" w:color="BFBFBF"/>
-              <w:right w:val="single" w:sz="4" w:space="0" w:color="BFBFBF"/>
-            </w:tcBorders>
-            <w:vAlign w:val="center"/>
-          </w:tcPr>
-          <w:p>
-            <w:pPr>
-              <w:spacing w:before="40" w:after="40"/>
-              <w:jc w:val="center"/>
-            </w:pPr>
-            <w:r/>
-            <w:r>
-              <w:rPr>
-                <w:rFonts w:ascii="Times New Roman" w:hAnsi="Times New Roman" w:cs="Times New Roman" w:eastAsia="Times New Roman"/>
-                <w:b/>
-                <w:color w:val="FFFFFF"/>
-                <w:sz w:val="16"/>
-              </w:rPr>
-              <w:t>Кол-во</w:t>
-            </w:r>
-          </w:p>
-        </w:tc>
-        <w:tc>
-          <w:tcPr>
-            <w:tcW w:type="dxa" w:w="1276"/>
-            <w:shd w:fill="1F4E79" w:val="clear"/>
-            <w:tcBorders>
-              <w:top w:val="single" w:sz="4" w:space="0" w:color="BFBFBF"/>
-              <w:left w:val="single" w:sz="4" w:space="0" w:color="BFBFBF"/>
-              <w:bottom w:val="single" w:sz="4" w:space="0" w:color="BFBFBF"/>
-              <w:right w:val="single" w:sz="4" w:space="0" w:color="BFBFBF"/>
-            </w:tcBorders>
-            <w:vAlign w:val="center"/>
-          </w:tcPr>
-          <w:p>
-            <w:pPr>
-              <w:spacing w:before="40" w:after="40"/>
-              <w:jc w:val="center"/>
-            </w:pPr>
-            <w:r/>
-            <w:r>
-              <w:rPr>
-                <w:rFonts w:ascii="Times New Roman" w:hAnsi="Times New Roman" w:cs="Times New Roman" w:eastAsia="Times New Roman"/>
-                <w:b/>
-                <w:color w:val="FFFFFF"/>
-                <w:sz w:val="16"/>
-              </w:rPr>
-              <w:t>Цена с НДС, ₽</w:t>
-            </w:r>
-          </w:p>
-        </w:tc>
-        <w:tc>
-          <w:tcPr>
-            <w:tcW w:type="dxa" w:w="1276"/>
-            <w:shd w:fill="1F4E79" w:val="clear"/>
-            <w:tcBorders>
-              <w:top w:val="single" w:sz="4" w:space="0" w:color="BFBFBF"/>
-              <w:left w:val="single" w:sz="4" w:space="0" w:color="BFBFBF"/>
-              <w:bottom w:val="single" w:sz="4" w:space="0" w:color="BFBFBF"/>
-              <w:right w:val="single" w:sz="4" w:space="0" w:color="BFBFBF"/>
-            </w:tcBorders>
-            <w:vAlign w:val="center"/>
-          </w:tcPr>
-          <w:p>
-            <w:pPr>
-              <w:spacing w:before="40" w:after="40"/>
-              <w:jc w:val="center"/>
-            </w:pPr>
-            <w:r/>
-            <w:r>
-              <w:rPr>
-                <w:rFonts w:ascii="Times New Roman" w:hAnsi="Times New Roman" w:cs="Times New Roman" w:eastAsia="Times New Roman"/>
-                <w:b/>
-                <w:color w:val="FFFFFF"/>
-                <w:sz w:val="16"/>
-              </w:rPr>
-              <w:t>Сумма с НДС, ₽</w:t>
-            </w:r>
-          </w:p>
-        </w:tc>
-      </w:tr>
-      <w:tr>
-        <w:tc>
-          <w:tcPr>
-            <w:tcW w:type="dxa" w:w="1276"/>
-            <w:shd w:fill="F2F2F2" w:val="clear"/>
-            <w:tcBorders>
-              <w:top w:val="single" w:sz="4" w:space="0" w:color="BFBFBF"/>
-              <w:left w:val="single" w:sz="4" w:space="0" w:color="BFBFBF"/>
-              <w:bottom w:val="single" w:sz="4" w:space="0" w:color="BFBFBF"/>
-              <w:right w:val="single" w:sz="4" w:space="0" w:color="BFBFBF"/>
-            </w:tcBorders>
-            <w:vAlign w:val="center"/>
-          </w:tcPr>
-          <w:p>
-            <w:pPr>
-              <w:spacing w:before="40" w:after="40"/>
-              <w:jc w:val="center"/>
-            </w:pPr>
-            <w:r/>
-            <w:r>
-              <w:rPr>
-                <w:rFonts w:ascii="Times New Roman" w:hAnsi="Times New Roman" w:cs="Times New Roman" w:eastAsia="Times New Roman"/>
-                <w:b w:val="0"/>
-                <w:color w:val="000000"/>
-                <w:sz w:val="16"/>
-              </w:rPr>
-              <w:t>1</w:t>
-            </w:r>
-          </w:p>
-        </w:tc>
-        <w:tc>
-          <w:tcPr>
-            <w:tcW w:type="dxa" w:w="1276"/>
-            <w:shd w:fill="F2F2F2" w:val="clear"/>
-            <w:tcBorders>
-              <w:top w:val="single" w:sz="4" w:space="0" w:color="BFBFBF"/>
-              <w:left w:val="single" w:sz="4" w:space="0" w:color="BFBFBF"/>
-              <w:bottom w:val="single" w:sz="4" w:space="0" w:color="BFBFBF"/>
-              <w:right w:val="single" w:sz="4" w:space="0" w:color="BFBFBF"/>
-            </w:tcBorders>
-            <w:vAlign w:val="center"/>
-          </w:tcPr>
-          <w:p>
-            <w:pPr>
-              <w:spacing w:before="40" w:after="40"/>
-              <w:jc w:val="left"/>
-            </w:pPr>
-            <w:r/>
-            <w:r>
-              <w:rPr>
-                <w:rFonts w:ascii="Times New Roman" w:hAnsi="Times New Roman" w:cs="Times New Roman" w:eastAsia="Times New Roman"/>
-                <w:b w:val="0"/>
-                <w:color w:val="000000"/>
-                <w:sz w:val="16"/>
-              </w:rPr>
-              <w:t>IP-видеорегистратор TRASSIR NeuroStation Astra 9800R/128-S, 128 кан., Astra Linux SE «Смоленск», 8×HDD (диски не входят), 2× Neuro Detector</w:t>
-            </w:r>
-          </w:p>
-        </w:tc>
-        <w:tc>
-          <w:tcPr>
-            <w:tcW w:type="dxa" w:w="1276"/>
-            <w:shd w:fill="F2F2F2" w:val="clear"/>
-            <w:tcBorders>
-              <w:top w:val="single" w:sz="4" w:space="0" w:color="BFBFBF"/>
-              <w:left w:val="single" w:sz="4" w:space="0" w:color="BFBFBF"/>
-              <w:bottom w:val="single" w:sz="4" w:space="0" w:color="BFBFBF"/>
-              <w:right w:val="single" w:sz="4" w:space="0" w:color="BFBFBF"/>
-            </w:tcBorders>
-            <w:vAlign w:val="center"/>
-          </w:tcPr>
-          <w:p>
-            <w:pPr>
-              <w:spacing w:before="40" w:after="40"/>
-              <w:jc w:val="left"/>
-            </w:pPr>
-            <w:r/>
-            <w:r>
-              <w:rPr>
-                <w:rFonts w:ascii="Times New Roman" w:hAnsi="Times New Roman" w:cs="Times New Roman" w:eastAsia="Times New Roman"/>
-                <w:b w:val="0"/>
-                <w:color w:val="000000"/>
-                <w:sz w:val="16"/>
-              </w:rPr>
-              <w:t>NeuroStation 9800R/128-S</w:t>
-            </w:r>
-          </w:p>
-        </w:tc>
-        <w:tc>
-          <w:tcPr>
-            <w:tcW w:type="dxa" w:w="1276"/>
-            <w:shd w:fill="F2F2F2" w:val="clear"/>
-            <w:tcBorders>
-              <w:top w:val="single" w:sz="4" w:space="0" w:color="BFBFBF"/>
-              <w:left w:val="single" w:sz="4" w:space="0" w:color="BFBFBF"/>
-              <w:bottom w:val="single" w:sz="4" w:space="0" w:color="BFBFBF"/>
-              <w:right w:val="single" w:sz="4" w:space="0" w:color="BFBFBF"/>
-            </w:tcBorders>
-            <w:vAlign w:val="center"/>
-          </w:tcPr>
-          <w:p>
-            <w:pPr>
-              <w:spacing w:before="40" w:after="40"/>
-              <w:jc w:val="center"/>
-            </w:pPr>
-            <w:r/>
-            <w:r>
-              <w:rPr>
-                <w:rFonts w:ascii="Times New Roman" w:hAnsi="Times New Roman" w:cs="Times New Roman" w:eastAsia="Times New Roman"/>
-                <w:b w:val="0"/>
-                <w:color w:val="000000"/>
-                <w:sz w:val="16"/>
-              </w:rPr>
-              <w:t>да</w:t>
-            </w:r>
-          </w:p>
-        </w:tc>
-        <w:tc>
-          <w:tcPr>
-            <w:tcW w:type="dxa" w:w="1276"/>
-            <w:shd w:fill="F2F2F2" w:val="clear"/>
-            <w:tcBorders>
-              <w:top w:val="single" w:sz="4" w:space="0" w:color="BFBFBF"/>
-              <w:left w:val="single" w:sz="4" w:space="0" w:color="BFBFBF"/>
-              <w:bottom w:val="single" w:sz="4" w:space="0" w:color="BFBFBF"/>
-              <w:right w:val="single" w:sz="4" w:space="0" w:color="BFBFBF"/>
-            </w:tcBorders>
-            <w:vAlign w:val="center"/>
-          </w:tcPr>
-          <w:p>
-            <w:pPr>
-              <w:spacing w:before="40" w:after="40"/>
-              <w:jc w:val="center"/>
-            </w:pPr>
-            <w:r/>
-            <w:r>
-              <w:rPr>
-                <w:rFonts w:ascii="Times New Roman" w:hAnsi="Times New Roman" w:cs="Times New Roman" w:eastAsia="Times New Roman"/>
-                <w:b w:val="0"/>
-                <w:color w:val="000000"/>
-                <w:sz w:val="16"/>
-              </w:rPr>
-              <w:t>шт.</w:t>
-            </w:r>
-          </w:p>
-        </w:tc>
-        <w:tc>
-          <w:tcPr>
-            <w:tcW w:type="dxa" w:w="1276"/>
-            <w:shd w:fill="F2F2F2" w:val="clear"/>
-            <w:tcBorders>
-              <w:top w:val="single" w:sz="4" w:space="0" w:color="BFBFBF"/>
-              <w:left w:val="single" w:sz="4" w:space="0" w:color="BFBFBF"/>
-              <w:bottom w:val="single" w:sz="4" w:space="0" w:color="BFBFBF"/>
-              <w:right w:val="single" w:sz="4" w:space="0" w:color="BFBFBF"/>
-            </w:tcBorders>
-            <w:vAlign w:val="center"/>
-          </w:tcPr>
-          <w:p>
-            <w:pPr>
-              <w:spacing w:before="40" w:after="40"/>
-              <w:jc w:val="left"/>
-            </w:pPr>
-            <w:r/>
-            <w:r>
-              <w:rPr>
-                <w:rFonts w:ascii="Times New Roman" w:hAnsi="Times New Roman" w:cs="Times New Roman" w:eastAsia="Times New Roman"/>
-                <w:b w:val="0"/>
-                <w:color w:val="000000"/>
-                <w:sz w:val="16"/>
-              </w:rPr>
-              <w:t>2</w:t>
-            </w:r>
-          </w:p>
-        </w:tc>
-        <w:tc>
-          <w:tcPr>
-            <w:tcW w:type="dxa" w:w="1276"/>
-            <w:shd w:fill="F2F2F2" w:val="clear"/>
-            <w:tcBorders>
-              <w:top w:val="single" w:sz="4" w:space="0" w:color="BFBFBF"/>
-              <w:left w:val="single" w:sz="4" w:space="0" w:color="BFBFBF"/>
-              <w:bottom w:val="single" w:sz="4" w:space="0" w:color="BFBFBF"/>
-              <w:right w:val="single" w:sz="4" w:space="0" w:color="BFBFBF"/>
-            </w:tcBorders>
-            <w:vAlign w:val="center"/>
-          </w:tcPr>
-          <w:p>
-            <w:pPr>
-              <w:spacing w:before="40" w:after="40"/>
-              <w:jc w:val="right"/>
-            </w:pPr>
-            <w:r/>
-            <w:r>
-              <w:rPr>
-                <w:rFonts w:ascii="Times New Roman" w:hAnsi="Times New Roman" w:cs="Times New Roman" w:eastAsia="Times New Roman"/>
-                <w:b w:val="0"/>
-                <w:color w:val="000000"/>
-                <w:sz w:val="16"/>
-              </w:rPr>
-              <w:t>477 740</w:t>
-            </w:r>
-          </w:p>
-        </w:tc>
-        <w:tc>
-          <w:tcPr>
-            <w:tcW w:type="dxa" w:w="1276"/>
-            <w:shd w:fill="F2F2F2" w:val="clear"/>
-            <w:tcBorders>
-              <w:top w:val="single" w:sz="4" w:space="0" w:color="BFBFBF"/>
-              <w:left w:val="single" w:sz="4" w:space="0" w:color="BFBFBF"/>
-              <w:bottom w:val="single" w:sz="4" w:space="0" w:color="BFBFBF"/>
-              <w:right w:val="single" w:sz="4" w:space="0" w:color="BFBFBF"/>
-            </w:tcBorders>
-            <w:vAlign w:val="center"/>
-          </w:tcPr>
-          <w:p>
-            <w:pPr>
-              <w:spacing w:before="40" w:after="40"/>
-              <w:jc w:val="right"/>
-            </w:pPr>
-            <w:r/>
-            <w:r>
-              <w:rPr>
-                <w:rFonts w:ascii="Times New Roman" w:hAnsi="Times New Roman" w:cs="Times New Roman" w:eastAsia="Times New Roman"/>
-                <w:b w:val="0"/>
-                <w:color w:val="000000"/>
-                <w:sz w:val="16"/>
-              </w:rPr>
-              <w:t>955 480</w:t>
-            </w:r>
-          </w:p>
-        </w:tc>
-      </w:tr>
-      <w:tr>
-        <w:tc>
-          <w:tcPr>
-            <w:tcW w:type="dxa" w:w="1276"/>
-            <w:shd w:fill="FFFFFF" w:val="clear"/>
-            <w:tcBorders>
-              <w:top w:val="single" w:sz="4" w:space="0" w:color="BFBFBF"/>
-              <w:left w:val="single" w:sz="4" w:space="0" w:color="BFBFBF"/>
-              <w:bottom w:val="single" w:sz="4" w:space="0" w:color="BFBFBF"/>
-              <w:right w:val="single" w:sz="4" w:space="0" w:color="BFBFBF"/>
-            </w:tcBorders>
-            <w:vAlign w:val="center"/>
-          </w:tcPr>
-          <w:p>
-            <w:pPr>
-              <w:spacing w:before="40" w:after="40"/>
-              <w:jc w:val="center"/>
-            </w:pPr>
-            <w:r/>
-            <w:r>
-              <w:rPr>
-                <w:rFonts w:ascii="Times New Roman" w:hAnsi="Times New Roman" w:cs="Times New Roman" w:eastAsia="Times New Roman"/>
-                <w:b w:val="0"/>
-                <w:color w:val="000000"/>
-                <w:sz w:val="16"/>
-              </w:rPr>
-              <w:t>2</w:t>
-            </w:r>
-          </w:p>
-        </w:tc>
-        <w:tc>
-          <w:tcPr>
-            <w:tcW w:type="dxa" w:w="1276"/>
-            <w:shd w:fill="FFFFFF" w:val="clear"/>
-            <w:tcBorders>
-              <w:top w:val="single" w:sz="4" w:space="0" w:color="BFBFBF"/>
-              <w:left w:val="single" w:sz="4" w:space="0" w:color="BFBFBF"/>
-              <w:bottom w:val="single" w:sz="4" w:space="0" w:color="BFBFBF"/>
-              <w:right w:val="single" w:sz="4" w:space="0" w:color="BFBFBF"/>
-            </w:tcBorders>
-            <w:vAlign w:val="center"/>
-          </w:tcPr>
-          <w:p>
-            <w:pPr>
-              <w:spacing w:before="40" w:after="40"/>
-              <w:jc w:val="left"/>
-            </w:pPr>
-            <w:r/>
-            <w:r>
-              <w:rPr>
-                <w:rFonts w:ascii="Times New Roman" w:hAnsi="Times New Roman" w:cs="Times New Roman" w:eastAsia="Times New Roman"/>
-                <w:b w:val="0"/>
-                <w:color w:val="000000"/>
-                <w:sz w:val="16"/>
-              </w:rPr>
-              <w:t>Аналог НИЦ 1143: уличный вандалостойкий купол TRASSIR 5 Мп, мотор 2.7–13.5 мм, ИК 25 м, IP66/IK10, микрофон. СТ-1 / РЭП</w:t>
-            </w:r>
-          </w:p>
-        </w:tc>
-        <w:tc>
-          <w:tcPr>
-            <w:tcW w:type="dxa" w:w="1276"/>
-            <w:shd w:fill="FFFFFF" w:val="clear"/>
-            <w:tcBorders>
-              <w:top w:val="single" w:sz="4" w:space="0" w:color="BFBFBF"/>
-              <w:left w:val="single" w:sz="4" w:space="0" w:color="BFBFBF"/>
-              <w:bottom w:val="single" w:sz="4" w:space="0" w:color="BFBFBF"/>
-              <w:right w:val="single" w:sz="4" w:space="0" w:color="BFBFBF"/>
-            </w:tcBorders>
-            <w:vAlign w:val="center"/>
-          </w:tcPr>
-          <w:p>
-            <w:pPr>
-              <w:spacing w:before="40" w:after="40"/>
-              <w:jc w:val="left"/>
-            </w:pPr>
-            <w:r/>
-            <w:r>
-              <w:rPr>
-                <w:rFonts w:ascii="Times New Roman" w:hAnsi="Times New Roman" w:cs="Times New Roman" w:eastAsia="Times New Roman"/>
-                <w:b w:val="0"/>
-                <w:color w:val="000000"/>
-                <w:sz w:val="16"/>
-              </w:rPr>
-              <w:t>TR-D3153IR2 v2 (R) 2.7-13.5</w:t>
-            </w:r>
-          </w:p>
-        </w:tc>
-        <w:tc>
-          <w:tcPr>
-            <w:tcW w:type="dxa" w:w="1276"/>
-            <w:shd w:fill="FFFFFF" w:val="clear"/>
-            <w:tcBorders>
-              <w:top w:val="single" w:sz="4" w:space="0" w:color="BFBFBF"/>
-              <w:left w:val="single" w:sz="4" w:space="0" w:color="BFBFBF"/>
-              <w:bottom w:val="single" w:sz="4" w:space="0" w:color="BFBFBF"/>
-              <w:right w:val="single" w:sz="4" w:space="0" w:color="BFBFBF"/>
-            </w:tcBorders>
-            <w:vAlign w:val="center"/>
-          </w:tcPr>
-          <w:p>
-            <w:pPr>
-              <w:spacing w:before="40" w:after="40"/>
-              <w:jc w:val="center"/>
-            </w:pPr>
-            <w:r/>
-            <w:r>
-              <w:rPr>
-                <w:rFonts w:ascii="Times New Roman" w:hAnsi="Times New Roman" w:cs="Times New Roman" w:eastAsia="Times New Roman"/>
-                <w:b w:val="0"/>
-                <w:color w:val="000000"/>
-                <w:sz w:val="16"/>
-              </w:rPr>
-              <w:t>да</w:t>
-            </w:r>
-          </w:p>
-        </w:tc>
-        <w:tc>
-          <w:tcPr>
-            <w:tcW w:type="dxa" w:w="1276"/>
-            <w:shd w:fill="FFFFFF" w:val="clear"/>
-            <w:tcBorders>
-              <w:top w:val="single" w:sz="4" w:space="0" w:color="BFBFBF"/>
-              <w:left w:val="single" w:sz="4" w:space="0" w:color="BFBFBF"/>
-              <w:bottom w:val="single" w:sz="4" w:space="0" w:color="BFBFBF"/>
-              <w:right w:val="single" w:sz="4" w:space="0" w:color="BFBFBF"/>
-            </w:tcBorders>
-            <w:vAlign w:val="center"/>
-          </w:tcPr>
-          <w:p>
-            <w:pPr>
-              <w:spacing w:before="40" w:after="40"/>
-              <w:jc w:val="center"/>
-            </w:pPr>
-            <w:r/>
-            <w:r>
-              <w:rPr>
-                <w:rFonts w:ascii="Times New Roman" w:hAnsi="Times New Roman" w:cs="Times New Roman" w:eastAsia="Times New Roman"/>
-                <w:b w:val="0"/>
-                <w:color w:val="000000"/>
-                <w:sz w:val="16"/>
-              </w:rPr>
-              <w:t>шт.</w:t>
-            </w:r>
-          </w:p>
-        </w:tc>
-        <w:tc>
-          <w:tcPr>
-            <w:tcW w:type="dxa" w:w="1276"/>
-            <w:shd w:fill="FFFFFF" w:val="clear"/>
-            <w:tcBorders>
-              <w:top w:val="single" w:sz="4" w:space="0" w:color="BFBFBF"/>
-              <w:left w:val="single" w:sz="4" w:space="0" w:color="BFBFBF"/>
-              <w:bottom w:val="single" w:sz="4" w:space="0" w:color="BFBFBF"/>
-              <w:right w:val="single" w:sz="4" w:space="0" w:color="BFBFBF"/>
-            </w:tcBorders>
-            <w:vAlign w:val="center"/>
-          </w:tcPr>
-          <w:p>
-            <w:pPr>
-              <w:spacing w:before="40" w:after="40"/>
-              <w:jc w:val="left"/>
-            </w:pPr>
-            <w:r/>
-            <w:r>
-              <w:rPr>
-                <w:rFonts w:ascii="Times New Roman" w:hAnsi="Times New Roman" w:cs="Times New Roman" w:eastAsia="Times New Roman"/>
-                <w:b w:val="0"/>
-                <w:color w:val="000000"/>
-                <w:sz w:val="16"/>
-              </w:rPr>
-              <w:t>1</w:t>
-            </w:r>
-          </w:p>
-        </w:tc>
-        <w:tc>
-          <w:tcPr>
-            <w:tcW w:type="dxa" w:w="1276"/>
-            <w:shd w:fill="FFFFFF" w:val="clear"/>
-            <w:tcBorders>
-              <w:top w:val="single" w:sz="4" w:space="0" w:color="BFBFBF"/>
-              <w:left w:val="single" w:sz="4" w:space="0" w:color="BFBFBF"/>
-              <w:bottom w:val="single" w:sz="4" w:space="0" w:color="BFBFBF"/>
-              <w:right w:val="single" w:sz="4" w:space="0" w:color="BFBFBF"/>
-            </w:tcBorders>
-            <w:vAlign w:val="center"/>
-          </w:tcPr>
-          <w:p>
-            <w:pPr>
-              <w:spacing w:before="40" w:after="40"/>
-              <w:jc w:val="right"/>
-            </w:pPr>
-            <w:r/>
-            <w:r>
-              <w:rPr>
-                <w:rFonts w:ascii="Times New Roman" w:hAnsi="Times New Roman" w:cs="Times New Roman" w:eastAsia="Times New Roman"/>
-                <w:b w:val="0"/>
-                <w:color w:val="000000"/>
-                <w:sz w:val="16"/>
-              </w:rPr>
-              <w:t>16 380</w:t>
-            </w:r>
-          </w:p>
-        </w:tc>
-        <w:tc>
-          <w:tcPr>
-            <w:tcW w:type="dxa" w:w="1276"/>
-            <w:shd w:fill="FFFFFF" w:val="clear"/>
-            <w:tcBorders>
-              <w:top w:val="single" w:sz="4" w:space="0" w:color="BFBFBF"/>
-              <w:left w:val="single" w:sz="4" w:space="0" w:color="BFBFBF"/>
-              <w:bottom w:val="single" w:sz="4" w:space="0" w:color="BFBFBF"/>
-              <w:right w:val="single" w:sz="4" w:space="0" w:color="BFBFBF"/>
-            </w:tcBorders>
-            <w:vAlign w:val="center"/>
-          </w:tcPr>
-          <w:p>
-            <w:pPr>
-              <w:spacing w:before="40" w:after="40"/>
-              <w:jc w:val="right"/>
-            </w:pPr>
-            <w:r/>
-            <w:r>
-              <w:rPr>
-                <w:rFonts w:ascii="Times New Roman" w:hAnsi="Times New Roman" w:cs="Times New Roman" w:eastAsia="Times New Roman"/>
-                <w:b w:val="0"/>
-                <w:color w:val="000000"/>
-                <w:sz w:val="16"/>
-              </w:rPr>
-              <w:t>16 380</w:t>
-            </w:r>
-          </w:p>
-        </w:tc>
-      </w:tr>
-      <w:tr>
-        <w:tc>
-          <w:tcPr>
-            <w:tcW w:type="dxa" w:w="1276"/>
-            <w:shd w:fill="F2F2F2" w:val="clear"/>
-            <w:tcBorders>
-              <w:top w:val="single" w:sz="4" w:space="0" w:color="BFBFBF"/>
-              <w:left w:val="single" w:sz="4" w:space="0" w:color="BFBFBF"/>
-              <w:bottom w:val="single" w:sz="4" w:space="0" w:color="BFBFBF"/>
-              <w:right w:val="single" w:sz="4" w:space="0" w:color="BFBFBF"/>
-            </w:tcBorders>
-            <w:vAlign w:val="center"/>
-          </w:tcPr>
-          <w:p>
-            <w:pPr>
-              <w:spacing w:before="40" w:after="40"/>
-              <w:jc w:val="center"/>
-            </w:pPr>
-            <w:r/>
-            <w:r>
-              <w:rPr>
-                <w:rFonts w:ascii="Times New Roman" w:hAnsi="Times New Roman" w:cs="Times New Roman" w:eastAsia="Times New Roman"/>
-                <w:b w:val="0"/>
-                <w:color w:val="000000"/>
-                <w:sz w:val="16"/>
-              </w:rPr>
-              <w:t>3</w:t>
-            </w:r>
-          </w:p>
-        </w:tc>
-        <w:tc>
-          <w:tcPr>
-            <w:tcW w:type="dxa" w:w="1276"/>
-            <w:shd w:fill="F2F2F2" w:val="clear"/>
-            <w:tcBorders>
-              <w:top w:val="single" w:sz="4" w:space="0" w:color="BFBFBF"/>
-              <w:left w:val="single" w:sz="4" w:space="0" w:color="BFBFBF"/>
-              <w:bottom w:val="single" w:sz="4" w:space="0" w:color="BFBFBF"/>
-              <w:right w:val="single" w:sz="4" w:space="0" w:color="BFBFBF"/>
-            </w:tcBorders>
-            <w:vAlign w:val="center"/>
-          </w:tcPr>
-          <w:p>
-            <w:pPr>
-              <w:spacing w:before="40" w:after="40"/>
-              <w:jc w:val="left"/>
-            </w:pPr>
-            <w:r/>
-            <w:r>
-              <w:rPr>
-                <w:rFonts w:ascii="Times New Roman" w:hAnsi="Times New Roman" w:cs="Times New Roman" w:eastAsia="Times New Roman"/>
-                <w:b w:val="0"/>
-                <w:color w:val="000000"/>
-                <w:sz w:val="16"/>
-              </w:rPr>
-              <w:t>Аналог 4MBIR-28-TMLW: уличный цилиндр TRASSIR 5 Мп, фикс 2.8 мм, ИК 35 м, микрофон, IP67. СТ-1 / РЭП</w:t>
-            </w:r>
-          </w:p>
-        </w:tc>
-        <w:tc>
-          <w:tcPr>
-            <w:tcW w:type="dxa" w:w="1276"/>
-            <w:shd w:fill="F2F2F2" w:val="clear"/>
-            <w:tcBorders>
-              <w:top w:val="single" w:sz="4" w:space="0" w:color="BFBFBF"/>
-              <w:left w:val="single" w:sz="4" w:space="0" w:color="BFBFBF"/>
-              <w:bottom w:val="single" w:sz="4" w:space="0" w:color="BFBFBF"/>
-              <w:right w:val="single" w:sz="4" w:space="0" w:color="BFBFBF"/>
-            </w:tcBorders>
-            <w:vAlign w:val="center"/>
-          </w:tcPr>
-          <w:p>
-            <w:pPr>
-              <w:spacing w:before="40" w:after="40"/>
-              <w:jc w:val="left"/>
-            </w:pPr>
-            <w:r/>
-            <w:r>
-              <w:rPr>
-                <w:rFonts w:ascii="Times New Roman" w:hAnsi="Times New Roman" w:cs="Times New Roman" w:eastAsia="Times New Roman"/>
-                <w:b w:val="0"/>
-                <w:color w:val="000000"/>
-                <w:sz w:val="16"/>
-              </w:rPr>
-              <w:t>TR-D2151IR3 v2 (R) 2.8</w:t>
-            </w:r>
-          </w:p>
-        </w:tc>
-        <w:tc>
-          <w:tcPr>
-            <w:tcW w:type="dxa" w:w="1276"/>
-            <w:shd w:fill="F2F2F2" w:val="clear"/>
-            <w:tcBorders>
-              <w:top w:val="single" w:sz="4" w:space="0" w:color="BFBFBF"/>
-              <w:left w:val="single" w:sz="4" w:space="0" w:color="BFBFBF"/>
-              <w:bottom w:val="single" w:sz="4" w:space="0" w:color="BFBFBF"/>
-              <w:right w:val="single" w:sz="4" w:space="0" w:color="BFBFBF"/>
-            </w:tcBorders>
-            <w:vAlign w:val="center"/>
-          </w:tcPr>
-          <w:p>
-            <w:pPr>
-              <w:spacing w:before="40" w:after="40"/>
-              <w:jc w:val="center"/>
-            </w:pPr>
-            <w:r/>
-            <w:r>
-              <w:rPr>
-                <w:rFonts w:ascii="Times New Roman" w:hAnsi="Times New Roman" w:cs="Times New Roman" w:eastAsia="Times New Roman"/>
-                <w:b w:val="0"/>
-                <w:color w:val="000000"/>
-                <w:sz w:val="16"/>
-              </w:rPr>
-              <w:t>да</w:t>
-            </w:r>
-          </w:p>
-        </w:tc>
-        <w:tc>
-          <w:tcPr>
-            <w:tcW w:type="dxa" w:w="1276"/>
-            <w:shd w:fill="F2F2F2" w:val="clear"/>
-            <w:tcBorders>
-              <w:top w:val="single" w:sz="4" w:space="0" w:color="BFBFBF"/>
-              <w:left w:val="single" w:sz="4" w:space="0" w:color="BFBFBF"/>
-              <w:bottom w:val="single" w:sz="4" w:space="0" w:color="BFBFBF"/>
-              <w:right w:val="single" w:sz="4" w:space="0" w:color="BFBFBF"/>
-            </w:tcBorders>
-            <w:vAlign w:val="center"/>
-          </w:tcPr>
-          <w:p>
-            <w:pPr>
-              <w:spacing w:before="40" w:after="40"/>
-              <w:jc w:val="center"/>
-            </w:pPr>
-            <w:r/>
-            <w:r>
-              <w:rPr>
-                <w:rFonts w:ascii="Times New Roman" w:hAnsi="Times New Roman" w:cs="Times New Roman" w:eastAsia="Times New Roman"/>
-                <w:b w:val="0"/>
-                <w:color w:val="000000"/>
-                <w:sz w:val="16"/>
-              </w:rPr>
-              <w:t>шт.</w:t>
-            </w:r>
-          </w:p>
-        </w:tc>
-        <w:tc>
-          <w:tcPr>
-            <w:tcW w:type="dxa" w:w="1276"/>
-            <w:shd w:fill="F2F2F2" w:val="clear"/>
-            <w:tcBorders>
-              <w:top w:val="single" w:sz="4" w:space="0" w:color="BFBFBF"/>
-              <w:left w:val="single" w:sz="4" w:space="0" w:color="BFBFBF"/>
-              <w:bottom w:val="single" w:sz="4" w:space="0" w:color="BFBFBF"/>
-              <w:right w:val="single" w:sz="4" w:space="0" w:color="BFBFBF"/>
-            </w:tcBorders>
-            <w:vAlign w:val="center"/>
-          </w:tcPr>
-          <w:p>
-            <w:pPr>
-              <w:spacing w:before="40" w:after="40"/>
-              <w:jc w:val="left"/>
-            </w:pPr>
-            <w:r/>
-            <w:r>
-              <w:rPr>
-                <w:rFonts w:ascii="Times New Roman" w:hAnsi="Times New Roman" w:cs="Times New Roman" w:eastAsia="Times New Roman"/>
-                <w:b w:val="0"/>
-                <w:color w:val="000000"/>
-                <w:sz w:val="16"/>
-              </w:rPr>
-              <w:t>49</w:t>
-            </w:r>
-          </w:p>
-        </w:tc>
-        <w:tc>
-          <w:tcPr>
-            <w:tcW w:type="dxa" w:w="1276"/>
-            <w:shd w:fill="F2F2F2" w:val="clear"/>
-            <w:tcBorders>
-              <w:top w:val="single" w:sz="4" w:space="0" w:color="BFBFBF"/>
-              <w:left w:val="single" w:sz="4" w:space="0" w:color="BFBFBF"/>
-              <w:bottom w:val="single" w:sz="4" w:space="0" w:color="BFBFBF"/>
-              <w:right w:val="single" w:sz="4" w:space="0" w:color="BFBFBF"/>
-            </w:tcBorders>
-            <w:vAlign w:val="center"/>
-          </w:tcPr>
-          <w:p>
-            <w:pPr>
-              <w:spacing w:before="40" w:after="40"/>
-              <w:jc w:val="right"/>
-            </w:pPr>
-            <w:r/>
-            <w:r>
-              <w:rPr>
-                <w:rFonts w:ascii="Times New Roman" w:hAnsi="Times New Roman" w:cs="Times New Roman" w:eastAsia="Times New Roman"/>
-                <w:b w:val="0"/>
-                <w:color w:val="000000"/>
-                <w:sz w:val="16"/>
-              </w:rPr>
-              <w:t>16 800</w:t>
-            </w:r>
-          </w:p>
-        </w:tc>
-        <w:tc>
-          <w:tcPr>
-            <w:tcW w:type="dxa" w:w="1276"/>
-            <w:shd w:fill="F2F2F2" w:val="clear"/>
-            <w:tcBorders>
-              <w:top w:val="single" w:sz="4" w:space="0" w:color="BFBFBF"/>
-              <w:left w:val="single" w:sz="4" w:space="0" w:color="BFBFBF"/>
-              <w:bottom w:val="single" w:sz="4" w:space="0" w:color="BFBFBF"/>
-              <w:right w:val="single" w:sz="4" w:space="0" w:color="BFBFBF"/>
-            </w:tcBorders>
-            <w:vAlign w:val="center"/>
-          </w:tcPr>
-          <w:p>
-            <w:pPr>
-              <w:spacing w:before="40" w:after="40"/>
-              <w:jc w:val="right"/>
-            </w:pPr>
-            <w:r/>
-            <w:r>
-              <w:rPr>
-                <w:rFonts w:ascii="Times New Roman" w:hAnsi="Times New Roman" w:cs="Times New Roman" w:eastAsia="Times New Roman"/>
-                <w:b w:val="0"/>
-                <w:color w:val="000000"/>
-                <w:sz w:val="16"/>
-              </w:rPr>
-              <w:t>823 200</w:t>
-            </w:r>
-          </w:p>
-        </w:tc>
-      </w:tr>
-      <w:tr>
-        <w:tc>
-          <w:tcPr>
-            <w:tcW w:type="dxa" w:w="1276"/>
-            <w:shd w:fill="FFFFFF" w:val="clear"/>
-            <w:tcBorders>
-              <w:top w:val="single" w:sz="4" w:space="0" w:color="BFBFBF"/>
-              <w:left w:val="single" w:sz="4" w:space="0" w:color="BFBFBF"/>
-              <w:bottom w:val="single" w:sz="4" w:space="0" w:color="BFBFBF"/>
-              <w:right w:val="single" w:sz="4" w:space="0" w:color="BFBFBF"/>
-            </w:tcBorders>
-            <w:vAlign w:val="center"/>
-          </w:tcPr>
-          <w:p>
-            <w:pPr>
-              <w:spacing w:before="40" w:after="40"/>
-              <w:jc w:val="center"/>
-            </w:pPr>
-            <w:r/>
-            <w:r>
-              <w:rPr>
-                <w:rFonts w:ascii="Times New Roman" w:hAnsi="Times New Roman" w:cs="Times New Roman" w:eastAsia="Times New Roman"/>
-                <w:b w:val="0"/>
-                <w:color w:val="000000"/>
-                <w:sz w:val="16"/>
-              </w:rPr>
-              <w:t>4</w:t>
-            </w:r>
-          </w:p>
-        </w:tc>
-        <w:tc>
-          <w:tcPr>
-            <w:tcW w:type="dxa" w:w="1276"/>
-            <w:shd w:fill="FFFFFF" w:val="clear"/>
-            <w:tcBorders>
-              <w:top w:val="single" w:sz="4" w:space="0" w:color="BFBFBF"/>
-              <w:left w:val="single" w:sz="4" w:space="0" w:color="BFBFBF"/>
-              <w:bottom w:val="single" w:sz="4" w:space="0" w:color="BFBFBF"/>
-              <w:right w:val="single" w:sz="4" w:space="0" w:color="BFBFBF"/>
-            </w:tcBorders>
-            <w:vAlign w:val="center"/>
-          </w:tcPr>
-          <w:p>
-            <w:pPr>
-              <w:spacing w:before="40" w:after="40"/>
-              <w:jc w:val="left"/>
-            </w:pPr>
-            <w:r/>
-            <w:r>
-              <w:rPr>
-                <w:rFonts w:ascii="Times New Roman" w:hAnsi="Times New Roman" w:cs="Times New Roman" w:eastAsia="Times New Roman"/>
-                <w:b w:val="0"/>
-                <w:color w:val="000000"/>
-                <w:sz w:val="16"/>
-              </w:rPr>
-              <w:t>Аналог PTZ: уличная поворотная TRASSIR 2 Мп, зум ×20 (4.3–86 мм), ИК 100 м, IP66/IK10. Самая недорогая PTZ TRASSIR ×20 со СТ-1</w:t>
-            </w:r>
-          </w:p>
-        </w:tc>
-        <w:tc>
-          <w:tcPr>
-            <w:tcW w:type="dxa" w:w="1276"/>
-            <w:shd w:fill="FFFFFF" w:val="clear"/>
-            <w:tcBorders>
-              <w:top w:val="single" w:sz="4" w:space="0" w:color="BFBFBF"/>
-              <w:left w:val="single" w:sz="4" w:space="0" w:color="BFBFBF"/>
-              <w:bottom w:val="single" w:sz="4" w:space="0" w:color="BFBFBF"/>
-              <w:right w:val="single" w:sz="4" w:space="0" w:color="BFBFBF"/>
-            </w:tcBorders>
-            <w:vAlign w:val="center"/>
-          </w:tcPr>
-          <w:p>
-            <w:pPr>
-              <w:spacing w:before="40" w:after="40"/>
-              <w:jc w:val="left"/>
-            </w:pPr>
-            <w:r/>
-            <w:r>
-              <w:rPr>
-                <w:rFonts w:ascii="Times New Roman" w:hAnsi="Times New Roman" w:cs="Times New Roman" w:eastAsia="Times New Roman"/>
-                <w:b w:val="0"/>
-                <w:color w:val="000000"/>
-                <w:sz w:val="16"/>
-              </w:rPr>
-              <w:t>TR-D6124IR10 v3 (R) 4.3-86</w:t>
-            </w:r>
-          </w:p>
-        </w:tc>
-        <w:tc>
-          <w:tcPr>
-            <w:tcW w:type="dxa" w:w="1276"/>
-            <w:shd w:fill="FFFFFF" w:val="clear"/>
-            <w:tcBorders>
-              <w:top w:val="single" w:sz="4" w:space="0" w:color="BFBFBF"/>
-              <w:left w:val="single" w:sz="4" w:space="0" w:color="BFBFBF"/>
-              <w:bottom w:val="single" w:sz="4" w:space="0" w:color="BFBFBF"/>
-              <w:right w:val="single" w:sz="4" w:space="0" w:color="BFBFBF"/>
-            </w:tcBorders>
-            <w:vAlign w:val="center"/>
-          </w:tcPr>
-          <w:p>
-            <w:pPr>
-              <w:spacing w:before="40" w:after="40"/>
-              <w:jc w:val="center"/>
-            </w:pPr>
-            <w:r/>
-            <w:r>
-              <w:rPr>
-                <w:rFonts w:ascii="Times New Roman" w:hAnsi="Times New Roman" w:cs="Times New Roman" w:eastAsia="Times New Roman"/>
-                <w:b w:val="0"/>
-                <w:color w:val="000000"/>
-                <w:sz w:val="16"/>
-              </w:rPr>
-              <w:t>да</w:t>
-            </w:r>
-          </w:p>
-        </w:tc>
-        <w:tc>
-          <w:tcPr>
-            <w:tcW w:type="dxa" w:w="1276"/>
-            <w:shd w:fill="FFFFFF" w:val="clear"/>
-            <w:tcBorders>
-              <w:top w:val="single" w:sz="4" w:space="0" w:color="BFBFBF"/>
-              <w:left w:val="single" w:sz="4" w:space="0" w:color="BFBFBF"/>
-              <w:bottom w:val="single" w:sz="4" w:space="0" w:color="BFBFBF"/>
-              <w:right w:val="single" w:sz="4" w:space="0" w:color="BFBFBF"/>
-            </w:tcBorders>
-            <w:vAlign w:val="center"/>
-          </w:tcPr>
-          <w:p>
-            <w:pPr>
-              <w:spacing w:before="40" w:after="40"/>
-              <w:jc w:val="center"/>
-            </w:pPr>
-            <w:r/>
-            <w:r>
-              <w:rPr>
-                <w:rFonts w:ascii="Times New Roman" w:hAnsi="Times New Roman" w:cs="Times New Roman" w:eastAsia="Times New Roman"/>
-                <w:b w:val="0"/>
-                <w:color w:val="000000"/>
-                <w:sz w:val="16"/>
-              </w:rPr>
-              <w:t>шт.</w:t>
-            </w:r>
-          </w:p>
-        </w:tc>
-        <w:tc>
-          <w:tcPr>
-            <w:tcW w:type="dxa" w:w="1276"/>
-            <w:shd w:fill="FFFFFF" w:val="clear"/>
-            <w:tcBorders>
-              <w:top w:val="single" w:sz="4" w:space="0" w:color="BFBFBF"/>
-              <w:left w:val="single" w:sz="4" w:space="0" w:color="BFBFBF"/>
-              <w:bottom w:val="single" w:sz="4" w:space="0" w:color="BFBFBF"/>
-              <w:right w:val="single" w:sz="4" w:space="0" w:color="BFBFBF"/>
-            </w:tcBorders>
-            <w:vAlign w:val="center"/>
-          </w:tcPr>
-          <w:p>
-            <w:pPr>
-              <w:spacing w:before="40" w:after="40"/>
-              <w:jc w:val="left"/>
-            </w:pPr>
-            <w:r/>
-            <w:r>
-              <w:rPr>
-                <w:rFonts w:ascii="Times New Roman" w:hAnsi="Times New Roman" w:cs="Times New Roman" w:eastAsia="Times New Roman"/>
-                <w:b w:val="0"/>
-                <w:color w:val="000000"/>
-                <w:sz w:val="16"/>
-              </w:rPr>
-              <w:t>1</w:t>
-            </w:r>
-          </w:p>
-        </w:tc>
-        <w:tc>
-          <w:tcPr>
-            <w:tcW w:type="dxa" w:w="1276"/>
-            <w:shd w:fill="FFFFFF" w:val="clear"/>
-            <w:tcBorders>
-              <w:top w:val="single" w:sz="4" w:space="0" w:color="BFBFBF"/>
-              <w:left w:val="single" w:sz="4" w:space="0" w:color="BFBFBF"/>
-              <w:bottom w:val="single" w:sz="4" w:space="0" w:color="BFBFBF"/>
-              <w:right w:val="single" w:sz="4" w:space="0" w:color="BFBFBF"/>
-            </w:tcBorders>
-            <w:vAlign w:val="center"/>
-          </w:tcPr>
-          <w:p>
-            <w:pPr>
-              <w:spacing w:before="40" w:after="40"/>
-              <w:jc w:val="right"/>
-            </w:pPr>
-            <w:r/>
-            <w:r>
-              <w:rPr>
-                <w:rFonts w:ascii="Times New Roman" w:hAnsi="Times New Roman" w:cs="Times New Roman" w:eastAsia="Times New Roman"/>
-                <w:b w:val="0"/>
-                <w:color w:val="000000"/>
-                <w:sz w:val="16"/>
-              </w:rPr>
-              <w:t>49 770</w:t>
-            </w:r>
-          </w:p>
-        </w:tc>
-        <w:tc>
-          <w:tcPr>
-            <w:tcW w:type="dxa" w:w="1276"/>
-            <w:shd w:fill="FFFFFF" w:val="clear"/>
-            <w:tcBorders>
-              <w:top w:val="single" w:sz="4" w:space="0" w:color="BFBFBF"/>
-              <w:left w:val="single" w:sz="4" w:space="0" w:color="BFBFBF"/>
-              <w:bottom w:val="single" w:sz="4" w:space="0" w:color="BFBFBF"/>
-              <w:right w:val="single" w:sz="4" w:space="0" w:color="BFBFBF"/>
-            </w:tcBorders>
-            <w:vAlign w:val="center"/>
-          </w:tcPr>
-          <w:p>
-            <w:pPr>
-              <w:spacing w:before="40" w:after="40"/>
-              <w:jc w:val="right"/>
-            </w:pPr>
-            <w:r/>
-            <w:r>
-              <w:rPr>
-                <w:rFonts w:ascii="Times New Roman" w:hAnsi="Times New Roman" w:cs="Times New Roman" w:eastAsia="Times New Roman"/>
-                <w:b w:val="0"/>
-                <w:color w:val="000000"/>
-                <w:sz w:val="16"/>
-              </w:rPr>
-              <w:t>49 770</w:t>
-            </w:r>
-          </w:p>
-        </w:tc>
-      </w:tr>
-    </w:tbl>
-    <w:p>
-      <w:pPr>
-        <w:spacing w:after="120" w:line="240" w:lineRule="auto"/>
-      </w:pPr>
-      <w:r>
-        <w:rPr>
-          <w:rFonts w:ascii="Times New Roman" w:hAnsi="Times New Roman" w:cs="Times New Roman" w:eastAsia="Times New Roman"/>
-          <w:b w:val="0"/>
-          <w:i w:val="0"/>
-          <w:color w:val="000000"/>
-          <w:sz w:val="22"/>
-        </w:rPr>
-        <w:t>Итого по запросу (позиции 1–4). Камеры: 1+49+1 = 51 шт.</w:t>
-      </w:r>
-    </w:p>
-    <w:tbl>
-      <w:tblPr>
-        <w:tblW w:type="auto" w:w="0"/>
-        <w:jc w:val="center"/>
-        <w:tblLayout w:type="autofit"/>
-        <w:tblLook w:firstColumn="1" w:firstRow="1" w:lastColumn="0" w:lastRow="0" w:noHBand="0" w:noVBand="1" w:val="04A0"/>
-      </w:tblPr>
-      <w:tblGrid>
-        <w:gridCol w:w="5103"/>
-        <w:gridCol w:w="5103"/>
-      </w:tblGrid>
-      <w:tr>
-        <w:tc>
-          <w:tcPr>
-            <w:tcW w:type="dxa" w:w="5103"/>
-            <w:shd w:fill="1F4E79" w:val="clear"/>
-            <w:tcBorders>
-              <w:top w:val="single" w:sz="4" w:space="0" w:color="BFBFBF"/>
-              <w:left w:val="single" w:sz="4" w:space="0" w:color="BFBFBF"/>
-              <w:bottom w:val="single" w:sz="4" w:space="0" w:color="BFBFBF"/>
-              <w:right w:val="single" w:sz="4" w:space="0" w:color="BFBFBF"/>
-            </w:tcBorders>
-            <w:vAlign w:val="center"/>
-          </w:tcPr>
-          <w:p>
-            <w:pPr>
-              <w:spacing w:before="40" w:after="40"/>
-              <w:jc w:val="center"/>
-            </w:pPr>
-            <w:r/>
-            <w:r>
-              <w:rPr>
-                <w:rFonts w:ascii="Times New Roman" w:hAnsi="Times New Roman" w:cs="Times New Roman" w:eastAsia="Times New Roman"/>
-                <w:b/>
-                <w:color w:val="FFFFFF"/>
-                <w:sz w:val="16"/>
-              </w:rPr>
-              <w:t>Показатель</w:t>
-            </w:r>
-          </w:p>
-        </w:tc>
-        <w:tc>
-          <w:tcPr>
-            <w:tcW w:type="dxa" w:w="5103"/>
-            <w:shd w:fill="1F4E79" w:val="clear"/>
-            <w:tcBorders>
-              <w:top w:val="single" w:sz="4" w:space="0" w:color="BFBFBF"/>
-              <w:left w:val="single" w:sz="4" w:space="0" w:color="BFBFBF"/>
-              <w:bottom w:val="single" w:sz="4" w:space="0" w:color="BFBFBF"/>
-              <w:right w:val="single" w:sz="4" w:space="0" w:color="BFBFBF"/>
-            </w:tcBorders>
-            <w:vAlign w:val="center"/>
-          </w:tcPr>
-          <w:p>
-            <w:pPr>
-              <w:spacing w:before="40" w:after="40"/>
-              <w:jc w:val="center"/>
-            </w:pPr>
-            <w:r/>
-            <w:r>
-              <w:rPr>
-                <w:rFonts w:ascii="Times New Roman" w:hAnsi="Times New Roman" w:cs="Times New Roman" w:eastAsia="Times New Roman"/>
-                <w:b/>
-                <w:color w:val="FFFFFF"/>
-                <w:sz w:val="16"/>
-              </w:rPr>
-              <w:t>Сумма, ₽</w:t>
-            </w:r>
-          </w:p>
-        </w:tc>
-      </w:tr>
-      <w:tr>
-        <w:tc>
-          <w:tcPr>
-            <w:tcW w:type="dxa" w:w="5103"/>
-            <w:shd w:fill="F2F2F2" w:val="clear"/>
-            <w:tcBorders>
-              <w:top w:val="single" w:sz="4" w:space="0" w:color="BFBFBF"/>
-              <w:left w:val="single" w:sz="4" w:space="0" w:color="BFBFBF"/>
-              <w:bottom w:val="single" w:sz="4" w:space="0" w:color="BFBFBF"/>
-              <w:right w:val="single" w:sz="4" w:space="0" w:color="BFBFBF"/>
-            </w:tcBorders>
-            <w:vAlign w:val="center"/>
-          </w:tcPr>
-          <w:p>
-            <w:pPr>
-              <w:spacing w:before="40" w:after="40"/>
-              <w:jc w:val="center"/>
-            </w:pPr>
-            <w:r/>
-            <w:r>
-              <w:rPr>
-                <w:rFonts w:ascii="Times New Roman" w:hAnsi="Times New Roman" w:cs="Times New Roman" w:eastAsia="Times New Roman"/>
-                <w:b w:val="0"/>
-                <w:color w:val="000000"/>
-                <w:sz w:val="16"/>
-              </w:rPr>
-              <w:t>Всего с НДС</w:t>
-            </w:r>
-          </w:p>
-        </w:tc>
-        <w:tc>
-          <w:tcPr>
-            <w:tcW w:type="dxa" w:w="5103"/>
-            <w:shd w:fill="F2F2F2" w:val="clear"/>
-            <w:tcBorders>
-              <w:top w:val="single" w:sz="4" w:space="0" w:color="BFBFBF"/>
-              <w:left w:val="single" w:sz="4" w:space="0" w:color="BFBFBF"/>
-              <w:bottom w:val="single" w:sz="4" w:space="0" w:color="BFBFBF"/>
-              <w:right w:val="single" w:sz="4" w:space="0" w:color="BFBFBF"/>
-            </w:tcBorders>
-            <w:vAlign w:val="center"/>
-          </w:tcPr>
-          <w:p>
-            <w:pPr>
-              <w:spacing w:before="40" w:after="40"/>
-              <w:jc w:val="right"/>
-            </w:pPr>
-            <w:r/>
-            <w:r>
-              <w:rPr>
-                <w:rFonts w:ascii="Times New Roman" w:hAnsi="Times New Roman" w:cs="Times New Roman" w:eastAsia="Times New Roman"/>
-                <w:b w:val="0"/>
-                <w:color w:val="000000"/>
-                <w:sz w:val="16"/>
-              </w:rPr>
-              <w:t>1 844 830</w:t>
-            </w:r>
-          </w:p>
-        </w:tc>
-      </w:tr>
-      <w:tr>
-        <w:tc>
-          <w:tcPr>
-            <w:tcW w:type="dxa" w:w="5103"/>
-            <w:shd w:fill="FFFFFF" w:val="clear"/>
-            <w:tcBorders>
-              <w:top w:val="single" w:sz="4" w:space="0" w:color="BFBFBF"/>
-              <w:left w:val="single" w:sz="4" w:space="0" w:color="BFBFBF"/>
-              <w:bottom w:val="single" w:sz="4" w:space="0" w:color="BFBFBF"/>
-              <w:right w:val="single" w:sz="4" w:space="0" w:color="BFBFBF"/>
-            </w:tcBorders>
-            <w:vAlign w:val="center"/>
-          </w:tcPr>
-          <w:p>
-            <w:pPr>
-              <w:spacing w:before="40" w:after="40"/>
-              <w:jc w:val="center"/>
-            </w:pPr>
-            <w:r/>
-            <w:r>
-              <w:rPr>
-                <w:rFonts w:ascii="Times New Roman" w:hAnsi="Times New Roman" w:cs="Times New Roman" w:eastAsia="Times New Roman"/>
-                <w:b w:val="0"/>
-                <w:color w:val="000000"/>
-                <w:sz w:val="16"/>
-              </w:rPr>
-              <w:t>в том числе НДС 22%</w:t>
-            </w:r>
-          </w:p>
-        </w:tc>
-        <w:tc>
-          <w:tcPr>
-            <w:tcW w:type="dxa" w:w="5103"/>
-            <w:shd w:fill="FFFFFF" w:val="clear"/>
-            <w:tcBorders>
-              <w:top w:val="single" w:sz="4" w:space="0" w:color="BFBFBF"/>
-              <w:left w:val="single" w:sz="4" w:space="0" w:color="BFBFBF"/>
-              <w:bottom w:val="single" w:sz="4" w:space="0" w:color="BFBFBF"/>
-              <w:right w:val="single" w:sz="4" w:space="0" w:color="BFBFBF"/>
-            </w:tcBorders>
-            <w:vAlign w:val="center"/>
-          </w:tcPr>
-          <w:p>
-            <w:pPr>
-              <w:spacing w:before="40" w:after="40"/>
-              <w:jc w:val="right"/>
-            </w:pPr>
-            <w:r/>
-            <w:r>
-              <w:rPr>
-                <w:rFonts w:ascii="Times New Roman" w:hAnsi="Times New Roman" w:cs="Times New Roman" w:eastAsia="Times New Roman"/>
-                <w:b w:val="0"/>
-                <w:color w:val="000000"/>
-                <w:sz w:val="16"/>
-              </w:rPr>
-              <w:t>332 674,26</w:t>
-            </w:r>
-          </w:p>
-        </w:tc>
-      </w:tr>
-      <w:tr>
-        <w:tc>
-          <w:tcPr>
-            <w:tcW w:type="dxa" w:w="5103"/>
-            <w:shd w:fill="F2F2F2" w:val="clear"/>
-            <w:tcBorders>
-              <w:top w:val="single" w:sz="4" w:space="0" w:color="BFBFBF"/>
-              <w:left w:val="single" w:sz="4" w:space="0" w:color="BFBFBF"/>
-              <w:bottom w:val="single" w:sz="4" w:space="0" w:color="BFBFBF"/>
-              <w:right w:val="single" w:sz="4" w:space="0" w:color="BFBFBF"/>
-            </w:tcBorders>
-            <w:vAlign w:val="center"/>
-          </w:tcPr>
-          <w:p>
-            <w:pPr>
-              <w:spacing w:before="40" w:after="40"/>
-              <w:jc w:val="center"/>
-            </w:pPr>
-            <w:r/>
-            <w:r>
-              <w:rPr>
-                <w:rFonts w:ascii="Times New Roman" w:hAnsi="Times New Roman" w:cs="Times New Roman" w:eastAsia="Times New Roman"/>
-                <w:b w:val="0"/>
-                <w:color w:val="000000"/>
-                <w:sz w:val="16"/>
-              </w:rPr>
-              <w:t>без НДС</w:t>
-            </w:r>
-          </w:p>
-        </w:tc>
-        <w:tc>
-          <w:tcPr>
-            <w:tcW w:type="dxa" w:w="5103"/>
-            <w:shd w:fill="F2F2F2" w:val="clear"/>
-            <w:tcBorders>
-              <w:top w:val="single" w:sz="4" w:space="0" w:color="BFBFBF"/>
-              <w:left w:val="single" w:sz="4" w:space="0" w:color="BFBFBF"/>
-              <w:bottom w:val="single" w:sz="4" w:space="0" w:color="BFBFBF"/>
-              <w:right w:val="single" w:sz="4" w:space="0" w:color="BFBFBF"/>
-            </w:tcBorders>
-            <w:vAlign w:val="center"/>
-          </w:tcPr>
-          <w:p>
-            <w:pPr>
-              <w:spacing w:before="40" w:after="40"/>
-              <w:jc w:val="right"/>
-            </w:pPr>
-            <w:r/>
-            <w:r>
-              <w:rPr>
-                <w:rFonts w:ascii="Times New Roman" w:hAnsi="Times New Roman" w:cs="Times New Roman" w:eastAsia="Times New Roman"/>
-                <w:b w:val="0"/>
-                <w:color w:val="000000"/>
-                <w:sz w:val="16"/>
-              </w:rPr>
-              <w:t>1 512 155,74</w:t>
-            </w:r>
-          </w:p>
-        </w:tc>
-      </w:tr>
-    </w:tbl>
-    <w:p>
-      <w:pPr>
-        <w:spacing w:before="240" w:after="120"/>
-      </w:pPr>
-      <w:r>
-        <w:rPr>
-          <w:rFonts w:ascii="Calibri" w:hAnsi="Calibri" w:cs="Calibri" w:eastAsia="Calibri"/>
-          <w:b/>
-          <w:color w:val="1F4E79"/>
-          <w:sz w:val="26"/>
-        </w:rPr>
-        <w:t>2. Что нужно докупить, чтобы система заработала</w:t>
-      </w:r>
-    </w:p>
-    <w:p>
-      <w:pPr>
-        <w:spacing w:after="120" w:line="240" w:lineRule="auto"/>
-      </w:pPr>
-      <w:r>
-        <w:rPr>
-          <w:rFonts w:ascii="Times New Roman" w:hAnsi="Times New Roman" w:cs="Times New Roman" w:eastAsia="Times New Roman"/>
-          <w:b w:val="0"/>
-          <w:i w:val="0"/>
-          <w:color w:val="000000"/>
-          <w:sz w:val="22"/>
-        </w:rPr>
-        <w:t>Регистратор NeuroStation Astra не содержит лицензий на IP-камеры и HDD. Для Astra Linux нужна лицензия AnyIP (Astra Linux), код DSSL 95887. «ПО TRASSIR в подарок» на камерах — для обычного TRASSIR OS; применимость к Astra уточнить у DSSL.</w:t>
+        <w:t>А. Заявка 254364 (№ ЭТП 998818) — регистраторы</w:t>
       </w:r>
     </w:p>
     <w:tbl>
@@ -1966,7 +541,7 @@
                 <w:color w:val="FFFFFF"/>
                 <w:sz w:val="16"/>
               </w:rPr>
-              <w:t>Артикул / код</w:t>
+              <w:t>Артикул</w:t>
             </w:r>
           </w:p>
         </w:tc>
@@ -2113,7 +688,7 @@
                 <w:color w:val="000000"/>
                 <w:sz w:val="16"/>
               </w:rPr>
-              <w:t>5</w:t>
+              <w:t>1</w:t>
             </w:r>
           </w:p>
         </w:tc>
@@ -2142,7 +717,7 @@
                 <w:color w:val="000000"/>
                 <w:sz w:val="16"/>
               </w:rPr>
-              <w:t>Лицензия TRASSIR AnyIP (Astra Linux) — подключение 1 IP-камеры к NeuroStation Astra</w:t>
+              <w:t>IP-видеорегистратор TRASSIR NeuroStation Astra 9800R/128-S, 128 кан., Astra Linux SE «Смоленск», 8×HDD (диски не входят), 2× Neuro Detector, СТ-1</w:t>
             </w:r>
           </w:p>
         </w:tc>
@@ -2171,7 +746,715 @@
                 <w:color w:val="000000"/>
                 <w:sz w:val="16"/>
               </w:rPr>
-              <w:t>DSSL 95887</w:t>
+              <w:t>NeuroStation 9800R/128-S</w:t>
+            </w:r>
+          </w:p>
+        </w:tc>
+        <w:tc>
+          <w:tcPr>
+            <w:tcW w:type="dxa" w:w="1458"/>
+            <w:shd w:fill="F2F2F2" w:val="clear"/>
+            <w:tcBorders>
+              <w:top w:val="single" w:sz="4" w:space="0" w:color="BFBFBF"/>
+              <w:left w:val="single" w:sz="4" w:space="0" w:color="BFBFBF"/>
+              <w:bottom w:val="single" w:sz="4" w:space="0" w:color="BFBFBF"/>
+              <w:right w:val="single" w:sz="4" w:space="0" w:color="BFBFBF"/>
+            </w:tcBorders>
+            <w:vAlign w:val="center"/>
+          </w:tcPr>
+          <w:p>
+            <w:pPr>
+              <w:spacing w:before="40" w:after="40"/>
+              <w:jc w:val="center"/>
+            </w:pPr>
+            <w:r/>
+            <w:r>
+              <w:rPr>
+                <w:rFonts w:ascii="Times New Roman" w:hAnsi="Times New Roman" w:cs="Times New Roman" w:eastAsia="Times New Roman"/>
+                <w:b w:val="0"/>
+                <w:color w:val="000000"/>
+                <w:sz w:val="16"/>
+              </w:rPr>
+              <w:t>шт.</w:t>
+            </w:r>
+          </w:p>
+        </w:tc>
+        <w:tc>
+          <w:tcPr>
+            <w:tcW w:type="dxa" w:w="1458"/>
+            <w:shd w:fill="F2F2F2" w:val="clear"/>
+            <w:tcBorders>
+              <w:top w:val="single" w:sz="4" w:space="0" w:color="BFBFBF"/>
+              <w:left w:val="single" w:sz="4" w:space="0" w:color="BFBFBF"/>
+              <w:bottom w:val="single" w:sz="4" w:space="0" w:color="BFBFBF"/>
+              <w:right w:val="single" w:sz="4" w:space="0" w:color="BFBFBF"/>
+            </w:tcBorders>
+            <w:vAlign w:val="center"/>
+          </w:tcPr>
+          <w:p>
+            <w:pPr>
+              <w:spacing w:before="40" w:after="40"/>
+              <w:jc w:val="center"/>
+            </w:pPr>
+            <w:r/>
+            <w:r>
+              <w:rPr>
+                <w:rFonts w:ascii="Times New Roman" w:hAnsi="Times New Roman" w:cs="Times New Roman" w:eastAsia="Times New Roman"/>
+                <w:b w:val="0"/>
+                <w:color w:val="000000"/>
+                <w:sz w:val="16"/>
+              </w:rPr>
+              <w:t>2</w:t>
+            </w:r>
+          </w:p>
+        </w:tc>
+        <w:tc>
+          <w:tcPr>
+            <w:tcW w:type="dxa" w:w="1458"/>
+            <w:shd w:fill="F2F2F2" w:val="clear"/>
+            <w:tcBorders>
+              <w:top w:val="single" w:sz="4" w:space="0" w:color="BFBFBF"/>
+              <w:left w:val="single" w:sz="4" w:space="0" w:color="BFBFBF"/>
+              <w:bottom w:val="single" w:sz="4" w:space="0" w:color="BFBFBF"/>
+              <w:right w:val="single" w:sz="4" w:space="0" w:color="BFBFBF"/>
+            </w:tcBorders>
+            <w:vAlign w:val="center"/>
+          </w:tcPr>
+          <w:p>
+            <w:pPr>
+              <w:spacing w:before="40" w:after="40"/>
+              <w:jc w:val="right"/>
+            </w:pPr>
+            <w:r/>
+            <w:r>
+              <w:rPr>
+                <w:rFonts w:ascii="Times New Roman" w:hAnsi="Times New Roman" w:cs="Times New Roman" w:eastAsia="Times New Roman"/>
+                <w:b w:val="0"/>
+                <w:color w:val="000000"/>
+                <w:sz w:val="16"/>
+              </w:rPr>
+              <w:t>477 740</w:t>
+            </w:r>
+          </w:p>
+        </w:tc>
+        <w:tc>
+          <w:tcPr>
+            <w:tcW w:type="dxa" w:w="1458"/>
+            <w:shd w:fill="F2F2F2" w:val="clear"/>
+            <w:tcBorders>
+              <w:top w:val="single" w:sz="4" w:space="0" w:color="BFBFBF"/>
+              <w:left w:val="single" w:sz="4" w:space="0" w:color="BFBFBF"/>
+              <w:bottom w:val="single" w:sz="4" w:space="0" w:color="BFBFBF"/>
+              <w:right w:val="single" w:sz="4" w:space="0" w:color="BFBFBF"/>
+            </w:tcBorders>
+            <w:vAlign w:val="center"/>
+          </w:tcPr>
+          <w:p>
+            <w:pPr>
+              <w:spacing w:before="40" w:after="40"/>
+              <w:jc w:val="right"/>
+            </w:pPr>
+            <w:r/>
+            <w:r>
+              <w:rPr>
+                <w:rFonts w:ascii="Times New Roman" w:hAnsi="Times New Roman" w:cs="Times New Roman" w:eastAsia="Times New Roman"/>
+                <w:b w:val="0"/>
+                <w:color w:val="000000"/>
+                <w:sz w:val="16"/>
+              </w:rPr>
+              <w:t>955 480</w:t>
+            </w:r>
+          </w:p>
+        </w:tc>
+      </w:tr>
+    </w:tbl>
+    <w:tbl>
+      <w:tblPr>
+        <w:tblW w:type="auto" w:w="0"/>
+        <w:jc w:val="center"/>
+        <w:tblLayout w:type="autofit"/>
+        <w:tblLook w:firstColumn="1" w:firstRow="1" w:lastColumn="0" w:lastRow="0" w:noHBand="0" w:noVBand="1" w:val="04A0"/>
+      </w:tblPr>
+      <w:tblGrid>
+        <w:gridCol w:w="5103"/>
+        <w:gridCol w:w="5103"/>
+      </w:tblGrid>
+      <w:tr>
+        <w:tc>
+          <w:tcPr>
+            <w:tcW w:type="dxa" w:w="5103"/>
+            <w:shd w:fill="1F4E79" w:val="clear"/>
+            <w:tcBorders>
+              <w:top w:val="single" w:sz="4" w:space="0" w:color="BFBFBF"/>
+              <w:left w:val="single" w:sz="4" w:space="0" w:color="BFBFBF"/>
+              <w:bottom w:val="single" w:sz="4" w:space="0" w:color="BFBFBF"/>
+              <w:right w:val="single" w:sz="4" w:space="0" w:color="BFBFBF"/>
+            </w:tcBorders>
+            <w:vAlign w:val="center"/>
+          </w:tcPr>
+          <w:p>
+            <w:pPr>
+              <w:spacing w:before="40" w:after="40"/>
+              <w:jc w:val="center"/>
+            </w:pPr>
+            <w:r/>
+            <w:r>
+              <w:rPr>
+                <w:rFonts w:ascii="Times New Roman" w:hAnsi="Times New Roman" w:cs="Times New Roman" w:eastAsia="Times New Roman"/>
+                <w:b/>
+                <w:color w:val="FFFFFF"/>
+                <w:sz w:val="16"/>
+              </w:rPr>
+              <w:t>Показатель</w:t>
+            </w:r>
+          </w:p>
+        </w:tc>
+        <w:tc>
+          <w:tcPr>
+            <w:tcW w:type="dxa" w:w="5103"/>
+            <w:shd w:fill="1F4E79" w:val="clear"/>
+            <w:tcBorders>
+              <w:top w:val="single" w:sz="4" w:space="0" w:color="BFBFBF"/>
+              <w:left w:val="single" w:sz="4" w:space="0" w:color="BFBFBF"/>
+              <w:bottom w:val="single" w:sz="4" w:space="0" w:color="BFBFBF"/>
+              <w:right w:val="single" w:sz="4" w:space="0" w:color="BFBFBF"/>
+            </w:tcBorders>
+            <w:vAlign w:val="center"/>
+          </w:tcPr>
+          <w:p>
+            <w:pPr>
+              <w:spacing w:before="40" w:after="40"/>
+              <w:jc w:val="center"/>
+            </w:pPr>
+            <w:r/>
+            <w:r>
+              <w:rPr>
+                <w:rFonts w:ascii="Times New Roman" w:hAnsi="Times New Roman" w:cs="Times New Roman" w:eastAsia="Times New Roman"/>
+                <w:b/>
+                <w:color w:val="FFFFFF"/>
+                <w:sz w:val="16"/>
+              </w:rPr>
+              <w:t>Сумма, ₽</w:t>
+            </w:r>
+          </w:p>
+        </w:tc>
+      </w:tr>
+      <w:tr>
+        <w:tc>
+          <w:tcPr>
+            <w:tcW w:type="dxa" w:w="5103"/>
+            <w:shd w:fill="F2F2F2" w:val="clear"/>
+            <w:tcBorders>
+              <w:top w:val="single" w:sz="4" w:space="0" w:color="BFBFBF"/>
+              <w:left w:val="single" w:sz="4" w:space="0" w:color="BFBFBF"/>
+              <w:bottom w:val="single" w:sz="4" w:space="0" w:color="BFBFBF"/>
+              <w:right w:val="single" w:sz="4" w:space="0" w:color="BFBFBF"/>
+            </w:tcBorders>
+            <w:vAlign w:val="center"/>
+          </w:tcPr>
+          <w:p>
+            <w:pPr>
+              <w:spacing w:before="40" w:after="40"/>
+              <w:jc w:val="center"/>
+            </w:pPr>
+            <w:r/>
+            <w:r>
+              <w:rPr>
+                <w:rFonts w:ascii="Times New Roman" w:hAnsi="Times New Roman" w:cs="Times New Roman" w:eastAsia="Times New Roman"/>
+                <w:b w:val="0"/>
+                <w:color w:val="000000"/>
+                <w:sz w:val="16"/>
+              </w:rPr>
+              <w:t>Всего с НДС по заявке 254364</w:t>
+            </w:r>
+          </w:p>
+        </w:tc>
+        <w:tc>
+          <w:tcPr>
+            <w:tcW w:type="dxa" w:w="5103"/>
+            <w:shd w:fill="F2F2F2" w:val="clear"/>
+            <w:tcBorders>
+              <w:top w:val="single" w:sz="4" w:space="0" w:color="BFBFBF"/>
+              <w:left w:val="single" w:sz="4" w:space="0" w:color="BFBFBF"/>
+              <w:bottom w:val="single" w:sz="4" w:space="0" w:color="BFBFBF"/>
+              <w:right w:val="single" w:sz="4" w:space="0" w:color="BFBFBF"/>
+            </w:tcBorders>
+            <w:vAlign w:val="center"/>
+          </w:tcPr>
+          <w:p>
+            <w:pPr>
+              <w:spacing w:before="40" w:after="40"/>
+              <w:jc w:val="right"/>
+            </w:pPr>
+            <w:r/>
+            <w:r>
+              <w:rPr>
+                <w:rFonts w:ascii="Times New Roman" w:hAnsi="Times New Roman" w:cs="Times New Roman" w:eastAsia="Times New Roman"/>
+                <w:b w:val="0"/>
+                <w:color w:val="000000"/>
+                <w:sz w:val="16"/>
+              </w:rPr>
+              <w:t>955 480</w:t>
+            </w:r>
+          </w:p>
+        </w:tc>
+      </w:tr>
+      <w:tr>
+        <w:tc>
+          <w:tcPr>
+            <w:tcW w:type="dxa" w:w="5103"/>
+            <w:shd w:fill="FFFFFF" w:val="clear"/>
+            <w:tcBorders>
+              <w:top w:val="single" w:sz="4" w:space="0" w:color="BFBFBF"/>
+              <w:left w:val="single" w:sz="4" w:space="0" w:color="BFBFBF"/>
+              <w:bottom w:val="single" w:sz="4" w:space="0" w:color="BFBFBF"/>
+              <w:right w:val="single" w:sz="4" w:space="0" w:color="BFBFBF"/>
+            </w:tcBorders>
+            <w:vAlign w:val="center"/>
+          </w:tcPr>
+          <w:p>
+            <w:pPr>
+              <w:spacing w:before="40" w:after="40"/>
+              <w:jc w:val="center"/>
+            </w:pPr>
+            <w:r/>
+            <w:r>
+              <w:rPr>
+                <w:rFonts w:ascii="Times New Roman" w:hAnsi="Times New Roman" w:cs="Times New Roman" w:eastAsia="Times New Roman"/>
+                <w:b w:val="0"/>
+                <w:color w:val="000000"/>
+                <w:sz w:val="16"/>
+              </w:rPr>
+              <w:t>в том числе НДС 22%</w:t>
+            </w:r>
+          </w:p>
+        </w:tc>
+        <w:tc>
+          <w:tcPr>
+            <w:tcW w:type="dxa" w:w="5103"/>
+            <w:shd w:fill="FFFFFF" w:val="clear"/>
+            <w:tcBorders>
+              <w:top w:val="single" w:sz="4" w:space="0" w:color="BFBFBF"/>
+              <w:left w:val="single" w:sz="4" w:space="0" w:color="BFBFBF"/>
+              <w:bottom w:val="single" w:sz="4" w:space="0" w:color="BFBFBF"/>
+              <w:right w:val="single" w:sz="4" w:space="0" w:color="BFBFBF"/>
+            </w:tcBorders>
+            <w:vAlign w:val="center"/>
+          </w:tcPr>
+          <w:p>
+            <w:pPr>
+              <w:spacing w:before="40" w:after="40"/>
+              <w:jc w:val="right"/>
+            </w:pPr>
+            <w:r/>
+            <w:r>
+              <w:rPr>
+                <w:rFonts w:ascii="Times New Roman" w:hAnsi="Times New Roman" w:cs="Times New Roman" w:eastAsia="Times New Roman"/>
+                <w:b w:val="0"/>
+                <w:color w:val="000000"/>
+                <w:sz w:val="16"/>
+              </w:rPr>
+              <w:t>172 299,67</w:t>
+            </w:r>
+          </w:p>
+        </w:tc>
+      </w:tr>
+      <w:tr>
+        <w:tc>
+          <w:tcPr>
+            <w:tcW w:type="dxa" w:w="5103"/>
+            <w:shd w:fill="F2F2F2" w:val="clear"/>
+            <w:tcBorders>
+              <w:top w:val="single" w:sz="4" w:space="0" w:color="BFBFBF"/>
+              <w:left w:val="single" w:sz="4" w:space="0" w:color="BFBFBF"/>
+              <w:bottom w:val="single" w:sz="4" w:space="0" w:color="BFBFBF"/>
+              <w:right w:val="single" w:sz="4" w:space="0" w:color="BFBFBF"/>
+            </w:tcBorders>
+            <w:vAlign w:val="center"/>
+          </w:tcPr>
+          <w:p>
+            <w:pPr>
+              <w:spacing w:before="40" w:after="40"/>
+              <w:jc w:val="center"/>
+            </w:pPr>
+            <w:r/>
+            <w:r>
+              <w:rPr>
+                <w:rFonts w:ascii="Times New Roman" w:hAnsi="Times New Roman" w:cs="Times New Roman" w:eastAsia="Times New Roman"/>
+                <w:b w:val="0"/>
+                <w:color w:val="000000"/>
+                <w:sz w:val="16"/>
+              </w:rPr>
+              <w:t>без НДС</w:t>
+            </w:r>
+          </w:p>
+        </w:tc>
+        <w:tc>
+          <w:tcPr>
+            <w:tcW w:type="dxa" w:w="5103"/>
+            <w:shd w:fill="F2F2F2" w:val="clear"/>
+            <w:tcBorders>
+              <w:top w:val="single" w:sz="4" w:space="0" w:color="BFBFBF"/>
+              <w:left w:val="single" w:sz="4" w:space="0" w:color="BFBFBF"/>
+              <w:bottom w:val="single" w:sz="4" w:space="0" w:color="BFBFBF"/>
+              <w:right w:val="single" w:sz="4" w:space="0" w:color="BFBFBF"/>
+            </w:tcBorders>
+            <w:vAlign w:val="center"/>
+          </w:tcPr>
+          <w:p>
+            <w:pPr>
+              <w:spacing w:before="40" w:after="40"/>
+              <w:jc w:val="right"/>
+            </w:pPr>
+            <w:r/>
+            <w:r>
+              <w:rPr>
+                <w:rFonts w:ascii="Times New Roman" w:hAnsi="Times New Roman" w:cs="Times New Roman" w:eastAsia="Times New Roman"/>
+                <w:b w:val="0"/>
+                <w:color w:val="000000"/>
+                <w:sz w:val="16"/>
+              </w:rPr>
+              <w:t>783 180,33</w:t>
+            </w:r>
+          </w:p>
+        </w:tc>
+      </w:tr>
+    </w:tbl>
+    <w:p>
+      <w:pPr>
+        <w:spacing w:before="240" w:after="120"/>
+      </w:pPr>
+      <w:r>
+        <w:rPr>
+          <w:rFonts w:ascii="Calibri" w:hAnsi="Calibri" w:cs="Calibri" w:eastAsia="Calibri"/>
+          <w:b/>
+          <w:color w:val="1F4E79"/>
+          <w:sz w:val="26"/>
+        </w:rPr>
+        <w:t>Б. Заявка 254397 (№ ЭТП 998881) — камеры 4BHNN0-0-0-0</w:t>
+      </w:r>
+    </w:p>
+    <w:p>
+      <w:pPr>
+        <w:spacing w:after="120" w:line="240" w:lineRule="auto"/>
+      </w:pPr>
+      <w:r>
+        <w:rPr>
+          <w:rFonts w:ascii="Times New Roman" w:hAnsi="Times New Roman" w:cs="Times New Roman" w:eastAsia="Times New Roman"/>
+          <w:b w:val="0"/>
+          <w:i/>
+          <w:color w:val="C00000"/>
+          <w:sz w:val="20"/>
+        </w:rPr>
+        <w:t>Предмет извещения — 51 шт. одной позиции 4BHNN0-0-0-0. По 44-ФЗ в заявку ставится артикул из извещения. Смесь «1 купол + 49 цилиндров + 1 PTZ» предмету не соответствует. Эквивалент — только если документация прямо допускает замену.</w:t>
+      </w:r>
+    </w:p>
+    <w:tbl>
+      <w:tblPr>
+        <w:tblW w:type="auto" w:w="0"/>
+        <w:jc w:val="center"/>
+        <w:tblLayout w:type="autofit"/>
+        <w:tblLook w:firstColumn="1" w:firstRow="1" w:lastColumn="0" w:lastRow="0" w:noHBand="0" w:noVBand="1" w:val="04A0"/>
+      </w:tblPr>
+      <w:tblGrid>
+        <w:gridCol w:w="1458"/>
+        <w:gridCol w:w="1458"/>
+        <w:gridCol w:w="1458"/>
+        <w:gridCol w:w="1458"/>
+        <w:gridCol w:w="1458"/>
+        <w:gridCol w:w="1458"/>
+        <w:gridCol w:w="1458"/>
+      </w:tblGrid>
+      <w:tr>
+        <w:tc>
+          <w:tcPr>
+            <w:tcW w:type="dxa" w:w="1458"/>
+            <w:shd w:fill="1F4E79" w:val="clear"/>
+            <w:tcBorders>
+              <w:top w:val="single" w:sz="4" w:space="0" w:color="BFBFBF"/>
+              <w:left w:val="single" w:sz="4" w:space="0" w:color="BFBFBF"/>
+              <w:bottom w:val="single" w:sz="4" w:space="0" w:color="BFBFBF"/>
+              <w:right w:val="single" w:sz="4" w:space="0" w:color="BFBFBF"/>
+            </w:tcBorders>
+            <w:vAlign w:val="center"/>
+          </w:tcPr>
+          <w:p>
+            <w:pPr>
+              <w:spacing w:before="40" w:after="40"/>
+              <w:jc w:val="center"/>
+            </w:pPr>
+            <w:r/>
+            <w:r>
+              <w:rPr>
+                <w:rFonts w:ascii="Times New Roman" w:hAnsi="Times New Roman" w:cs="Times New Roman" w:eastAsia="Times New Roman"/>
+                <w:b/>
+                <w:color w:val="FFFFFF"/>
+                <w:sz w:val="16"/>
+              </w:rPr>
+              <w:t>№</w:t>
+            </w:r>
+          </w:p>
+        </w:tc>
+        <w:tc>
+          <w:tcPr>
+            <w:tcW w:type="dxa" w:w="1458"/>
+            <w:shd w:fill="1F4E79" w:val="clear"/>
+            <w:tcBorders>
+              <w:top w:val="single" w:sz="4" w:space="0" w:color="BFBFBF"/>
+              <w:left w:val="single" w:sz="4" w:space="0" w:color="BFBFBF"/>
+              <w:bottom w:val="single" w:sz="4" w:space="0" w:color="BFBFBF"/>
+              <w:right w:val="single" w:sz="4" w:space="0" w:color="BFBFBF"/>
+            </w:tcBorders>
+            <w:vAlign w:val="center"/>
+          </w:tcPr>
+          <w:p>
+            <w:pPr>
+              <w:spacing w:before="40" w:after="40"/>
+              <w:jc w:val="center"/>
+            </w:pPr>
+            <w:r/>
+            <w:r>
+              <w:rPr>
+                <w:rFonts w:ascii="Times New Roman" w:hAnsi="Times New Roman" w:cs="Times New Roman" w:eastAsia="Times New Roman"/>
+                <w:b/>
+                <w:color w:val="FFFFFF"/>
+                <w:sz w:val="16"/>
+              </w:rPr>
+              <w:t>Наименование</w:t>
+            </w:r>
+          </w:p>
+        </w:tc>
+        <w:tc>
+          <w:tcPr>
+            <w:tcW w:type="dxa" w:w="1458"/>
+            <w:shd w:fill="1F4E79" w:val="clear"/>
+            <w:tcBorders>
+              <w:top w:val="single" w:sz="4" w:space="0" w:color="BFBFBF"/>
+              <w:left w:val="single" w:sz="4" w:space="0" w:color="BFBFBF"/>
+              <w:bottom w:val="single" w:sz="4" w:space="0" w:color="BFBFBF"/>
+              <w:right w:val="single" w:sz="4" w:space="0" w:color="BFBFBF"/>
+            </w:tcBorders>
+            <w:vAlign w:val="center"/>
+          </w:tcPr>
+          <w:p>
+            <w:pPr>
+              <w:spacing w:before="40" w:after="40"/>
+              <w:jc w:val="center"/>
+            </w:pPr>
+            <w:r/>
+            <w:r>
+              <w:rPr>
+                <w:rFonts w:ascii="Times New Roman" w:hAnsi="Times New Roman" w:cs="Times New Roman" w:eastAsia="Times New Roman"/>
+                <w:b/>
+                <w:color w:val="FFFFFF"/>
+                <w:sz w:val="16"/>
+              </w:rPr>
+              <w:t>Артикул</w:t>
+            </w:r>
+          </w:p>
+        </w:tc>
+        <w:tc>
+          <w:tcPr>
+            <w:tcW w:type="dxa" w:w="1458"/>
+            <w:shd w:fill="1F4E79" w:val="clear"/>
+            <w:tcBorders>
+              <w:top w:val="single" w:sz="4" w:space="0" w:color="BFBFBF"/>
+              <w:left w:val="single" w:sz="4" w:space="0" w:color="BFBFBF"/>
+              <w:bottom w:val="single" w:sz="4" w:space="0" w:color="BFBFBF"/>
+              <w:right w:val="single" w:sz="4" w:space="0" w:color="BFBFBF"/>
+            </w:tcBorders>
+            <w:vAlign w:val="center"/>
+          </w:tcPr>
+          <w:p>
+            <w:pPr>
+              <w:spacing w:before="40" w:after="40"/>
+              <w:jc w:val="center"/>
+            </w:pPr>
+            <w:r/>
+            <w:r>
+              <w:rPr>
+                <w:rFonts w:ascii="Times New Roman" w:hAnsi="Times New Roman" w:cs="Times New Roman" w:eastAsia="Times New Roman"/>
+                <w:b/>
+                <w:color w:val="FFFFFF"/>
+                <w:sz w:val="16"/>
+              </w:rPr>
+              <w:t>Ед.</w:t>
+            </w:r>
+          </w:p>
+        </w:tc>
+        <w:tc>
+          <w:tcPr>
+            <w:tcW w:type="dxa" w:w="1458"/>
+            <w:shd w:fill="1F4E79" w:val="clear"/>
+            <w:tcBorders>
+              <w:top w:val="single" w:sz="4" w:space="0" w:color="BFBFBF"/>
+              <w:left w:val="single" w:sz="4" w:space="0" w:color="BFBFBF"/>
+              <w:bottom w:val="single" w:sz="4" w:space="0" w:color="BFBFBF"/>
+              <w:right w:val="single" w:sz="4" w:space="0" w:color="BFBFBF"/>
+            </w:tcBorders>
+            <w:vAlign w:val="center"/>
+          </w:tcPr>
+          <w:p>
+            <w:pPr>
+              <w:spacing w:before="40" w:after="40"/>
+              <w:jc w:val="center"/>
+            </w:pPr>
+            <w:r/>
+            <w:r>
+              <w:rPr>
+                <w:rFonts w:ascii="Times New Roman" w:hAnsi="Times New Roman" w:cs="Times New Roman" w:eastAsia="Times New Roman"/>
+                <w:b/>
+                <w:color w:val="FFFFFF"/>
+                <w:sz w:val="16"/>
+              </w:rPr>
+              <w:t>Кол-во</w:t>
+            </w:r>
+          </w:p>
+        </w:tc>
+        <w:tc>
+          <w:tcPr>
+            <w:tcW w:type="dxa" w:w="1458"/>
+            <w:shd w:fill="1F4E79" w:val="clear"/>
+            <w:tcBorders>
+              <w:top w:val="single" w:sz="4" w:space="0" w:color="BFBFBF"/>
+              <w:left w:val="single" w:sz="4" w:space="0" w:color="BFBFBF"/>
+              <w:bottom w:val="single" w:sz="4" w:space="0" w:color="BFBFBF"/>
+              <w:right w:val="single" w:sz="4" w:space="0" w:color="BFBFBF"/>
+            </w:tcBorders>
+            <w:vAlign w:val="center"/>
+          </w:tcPr>
+          <w:p>
+            <w:pPr>
+              <w:spacing w:before="40" w:after="40"/>
+              <w:jc w:val="center"/>
+            </w:pPr>
+            <w:r/>
+            <w:r>
+              <w:rPr>
+                <w:rFonts w:ascii="Times New Roman" w:hAnsi="Times New Roman" w:cs="Times New Roman" w:eastAsia="Times New Roman"/>
+                <w:b/>
+                <w:color w:val="FFFFFF"/>
+                <w:sz w:val="16"/>
+              </w:rPr>
+              <w:t>Цена с НДС, ₽</w:t>
+            </w:r>
+          </w:p>
+        </w:tc>
+        <w:tc>
+          <w:tcPr>
+            <w:tcW w:type="dxa" w:w="1458"/>
+            <w:shd w:fill="1F4E79" w:val="clear"/>
+            <w:tcBorders>
+              <w:top w:val="single" w:sz="4" w:space="0" w:color="BFBFBF"/>
+              <w:left w:val="single" w:sz="4" w:space="0" w:color="BFBFBF"/>
+              <w:bottom w:val="single" w:sz="4" w:space="0" w:color="BFBFBF"/>
+              <w:right w:val="single" w:sz="4" w:space="0" w:color="BFBFBF"/>
+            </w:tcBorders>
+            <w:vAlign w:val="center"/>
+          </w:tcPr>
+          <w:p>
+            <w:pPr>
+              <w:spacing w:before="40" w:after="40"/>
+              <w:jc w:val="center"/>
+            </w:pPr>
+            <w:r/>
+            <w:r>
+              <w:rPr>
+                <w:rFonts w:ascii="Times New Roman" w:hAnsi="Times New Roman" w:cs="Times New Roman" w:eastAsia="Times New Roman"/>
+                <w:b/>
+                <w:color w:val="FFFFFF"/>
+                <w:sz w:val="16"/>
+              </w:rPr>
+              <w:t>Сумма с НДС, ₽</w:t>
+            </w:r>
+          </w:p>
+        </w:tc>
+      </w:tr>
+      <w:tr>
+        <w:tc>
+          <w:tcPr>
+            <w:tcW w:type="dxa" w:w="1458"/>
+            <w:shd w:fill="F2F2F2" w:val="clear"/>
+            <w:tcBorders>
+              <w:top w:val="single" w:sz="4" w:space="0" w:color="BFBFBF"/>
+              <w:left w:val="single" w:sz="4" w:space="0" w:color="BFBFBF"/>
+              <w:bottom w:val="single" w:sz="4" w:space="0" w:color="BFBFBF"/>
+              <w:right w:val="single" w:sz="4" w:space="0" w:color="BFBFBF"/>
+            </w:tcBorders>
+            <w:vAlign w:val="center"/>
+          </w:tcPr>
+          <w:p>
+            <w:pPr>
+              <w:spacing w:before="40" w:after="40"/>
+              <w:jc w:val="center"/>
+            </w:pPr>
+            <w:r/>
+            <w:r>
+              <w:rPr>
+                <w:rFonts w:ascii="Times New Roman" w:hAnsi="Times New Roman" w:cs="Times New Roman" w:eastAsia="Times New Roman"/>
+                <w:b w:val="0"/>
+                <w:color w:val="000000"/>
+                <w:sz w:val="16"/>
+              </w:rPr>
+              <w:t>1</w:t>
+            </w:r>
+          </w:p>
+        </w:tc>
+        <w:tc>
+          <w:tcPr>
+            <w:tcW w:type="dxa" w:w="1458"/>
+            <w:shd w:fill="F2F2F2" w:val="clear"/>
+            <w:tcBorders>
+              <w:top w:val="single" w:sz="4" w:space="0" w:color="BFBFBF"/>
+              <w:left w:val="single" w:sz="4" w:space="0" w:color="BFBFBF"/>
+              <w:bottom w:val="single" w:sz="4" w:space="0" w:color="BFBFBF"/>
+              <w:right w:val="single" w:sz="4" w:space="0" w:color="BFBFBF"/>
+            </w:tcBorders>
+            <w:vAlign w:val="center"/>
+          </w:tcPr>
+          <w:p>
+            <w:pPr>
+              <w:spacing w:before="40" w:after="40"/>
+              <w:jc w:val="left"/>
+            </w:pPr>
+            <w:r/>
+            <w:r>
+              <w:rPr>
+                <w:rFonts w:ascii="Times New Roman" w:hAnsi="Times New Roman" w:cs="Times New Roman" w:eastAsia="Times New Roman"/>
+                <w:b w:val="0"/>
+                <w:color w:val="000000"/>
+                <w:sz w:val="16"/>
+              </w:rPr>
+              <w:t>Камера видеонаблюдения цифровая</w:t>
+            </w:r>
+          </w:p>
+        </w:tc>
+        <w:tc>
+          <w:tcPr>
+            <w:tcW w:type="dxa" w:w="1458"/>
+            <w:shd w:fill="F2F2F2" w:val="clear"/>
+            <w:tcBorders>
+              <w:top w:val="single" w:sz="4" w:space="0" w:color="BFBFBF"/>
+              <w:left w:val="single" w:sz="4" w:space="0" w:color="BFBFBF"/>
+              <w:bottom w:val="single" w:sz="4" w:space="0" w:color="BFBFBF"/>
+              <w:right w:val="single" w:sz="4" w:space="0" w:color="BFBFBF"/>
+            </w:tcBorders>
+            <w:vAlign w:val="center"/>
+          </w:tcPr>
+          <w:p>
+            <w:pPr>
+              <w:spacing w:before="40" w:after="40"/>
+              <w:jc w:val="left"/>
+            </w:pPr>
+            <w:r/>
+            <w:r>
+              <w:rPr>
+                <w:rFonts w:ascii="Times New Roman" w:hAnsi="Times New Roman" w:cs="Times New Roman" w:eastAsia="Times New Roman"/>
+                <w:b w:val="0"/>
+                <w:color w:val="000000"/>
+                <w:sz w:val="16"/>
+              </w:rPr>
+              <w:t>4BHNN0-0-0-0</w:t>
             </w:r>
           </w:p>
         </w:tc>
@@ -2258,7 +1541,7 @@
                 <w:color w:val="000000"/>
                 <w:sz w:val="16"/>
               </w:rPr>
-              <w:t>5 090</w:t>
+              <w:t>22 000</w:t>
             </w:r>
           </w:p>
         </w:tc>
@@ -2287,64 +1570,12 @@
                 <w:color w:val="000000"/>
                 <w:sz w:val="16"/>
               </w:rPr>
-              <w:t>259 590</w:t>
+              <w:t>1 122 000</w:t>
             </w:r>
           </w:p>
         </w:tc>
       </w:tr>
     </w:tbl>
-    <w:p>
-      <w:pPr>
-        <w:spacing w:before="120"/>
-      </w:pPr>
-      <w:r>
-        <w:rPr>
-          <w:rFonts w:ascii="Calibri" w:hAnsi="Calibri" w:cs="Calibri" w:eastAsia="Calibri"/>
-          <w:b/>
-          <w:color w:val="1F4E79"/>
-          <w:sz w:val="24"/>
-        </w:rPr>
-        <w:t>Итого запрос + лицензии AnyIP Astra: 2 104 420 ₽</w:t>
-      </w:r>
-      <w:r>
-        <w:rPr>
-          <w:rFonts w:ascii="Times New Roman" w:hAnsi="Times New Roman" w:cs="Times New Roman" w:eastAsia="Times New Roman"/>
-          <w:b w:val="0"/>
-          <w:color w:val="000000"/>
-          <w:sz w:val="22"/>
-        </w:rPr>
-        <w:t xml:space="preserve">  (в т.ч. НДС 22% — 379 485,57 ₽).</w:t>
-      </w:r>
-    </w:p>
-    <w:p>
-      <w:pPr>
-        <w:spacing w:before="240" w:after="120"/>
-      </w:pPr>
-      <w:r>
-        <w:rPr>
-          <w:rFonts w:ascii="Calibri" w:hAnsi="Calibri" w:cs="Calibri" w:eastAsia="Calibri"/>
-          <w:b/>
-          <w:color w:val="1F4E79"/>
-          <w:sz w:val="26"/>
-        </w:rPr>
-        <w:t>3. Рекомендуемые опции (не в исходном запросе)</w:t>
-      </w:r>
-    </w:p>
-    <w:p>
-      <w:pPr>
-        <w:spacing w:after="120" w:line="240" w:lineRule="auto"/>
-      </w:pPr>
-      <w:r>
-        <w:rPr>
-          <w:rFonts w:ascii="Times New Roman" w:hAnsi="Times New Roman" w:cs="Times New Roman" w:eastAsia="Times New Roman"/>
-          <w:b w:val="0"/>
-          <w:i w:val="0"/>
-          <w:color w:val="000000"/>
-          <w:sz w:val="22"/>
-        </w:rPr>
-        <w:t>Оценка архива: 51 камера, в основном 4 Мп, H.265, средний битрейт 3 Мбит/с → ≈ 1,65 ТБ/сутки. На 30 суток нужно ≈ 50 ТБ полезного объёма.</w:t>
-      </w:r>
-    </w:p>
     <w:tbl>
       <w:tblPr>
         <w:tblW w:type="auto" w:w="0"/>
@@ -2353,17 +1584,13 @@
         <w:tblLook w:firstColumn="1" w:firstRow="1" w:lastColumn="0" w:lastRow="0" w:noHBand="0" w:noVBand="1" w:val="04A0"/>
       </w:tblPr>
       <w:tblGrid>
-        <w:gridCol w:w="1701"/>
-        <w:gridCol w:w="1701"/>
-        <w:gridCol w:w="1701"/>
-        <w:gridCol w:w="1701"/>
-        <w:gridCol w:w="1701"/>
-        <w:gridCol w:w="1701"/>
+        <w:gridCol w:w="5103"/>
+        <w:gridCol w:w="5103"/>
       </w:tblGrid>
       <w:tr>
         <w:tc>
           <w:tcPr>
-            <w:tcW w:type="dxa" w:w="1701"/>
+            <w:tcW w:type="dxa" w:w="5103"/>
             <w:shd w:fill="1F4E79" w:val="clear"/>
             <w:tcBorders>
               <w:top w:val="single" w:sz="4" w:space="0" w:color="BFBFBF"/>
@@ -2386,13 +1613,13 @@
                 <w:color w:val="FFFFFF"/>
                 <w:sz w:val="16"/>
               </w:rPr>
-              <w:t>№</w:t>
+              <w:t>Показатель</w:t>
             </w:r>
           </w:p>
         </w:tc>
         <w:tc>
           <w:tcPr>
-            <w:tcW w:type="dxa" w:w="1701"/>
+            <w:tcW w:type="dxa" w:w="5103"/>
             <w:shd w:fill="1F4E79" w:val="clear"/>
             <w:tcBorders>
               <w:top w:val="single" w:sz="4" w:space="0" w:color="BFBFBF"/>
@@ -2415,123 +1642,7 @@
                 <w:color w:val="FFFFFF"/>
                 <w:sz w:val="16"/>
               </w:rPr>
-              <w:t>Наименование</w:t>
-            </w:r>
-          </w:p>
-        </w:tc>
-        <w:tc>
-          <w:tcPr>
-            <w:tcW w:type="dxa" w:w="1701"/>
-            <w:shd w:fill="1F4E79" w:val="clear"/>
-            <w:tcBorders>
-              <w:top w:val="single" w:sz="4" w:space="0" w:color="BFBFBF"/>
-              <w:left w:val="single" w:sz="4" w:space="0" w:color="BFBFBF"/>
-              <w:bottom w:val="single" w:sz="4" w:space="0" w:color="BFBFBF"/>
-              <w:right w:val="single" w:sz="4" w:space="0" w:color="BFBFBF"/>
-            </w:tcBorders>
-            <w:vAlign w:val="center"/>
-          </w:tcPr>
-          <w:p>
-            <w:pPr>
-              <w:spacing w:before="40" w:after="40"/>
-              <w:jc w:val="center"/>
-            </w:pPr>
-            <w:r/>
-            <w:r>
-              <w:rPr>
-                <w:rFonts w:ascii="Times New Roman" w:hAnsi="Times New Roman" w:cs="Times New Roman" w:eastAsia="Times New Roman"/>
-                <w:b/>
-                <w:color w:val="FFFFFF"/>
-                <w:sz w:val="16"/>
-              </w:rPr>
-              <w:t>Кол-во</w:t>
-            </w:r>
-          </w:p>
-        </w:tc>
-        <w:tc>
-          <w:tcPr>
-            <w:tcW w:type="dxa" w:w="1701"/>
-            <w:shd w:fill="1F4E79" w:val="clear"/>
-            <w:tcBorders>
-              <w:top w:val="single" w:sz="4" w:space="0" w:color="BFBFBF"/>
-              <w:left w:val="single" w:sz="4" w:space="0" w:color="BFBFBF"/>
-              <w:bottom w:val="single" w:sz="4" w:space="0" w:color="BFBFBF"/>
-              <w:right w:val="single" w:sz="4" w:space="0" w:color="BFBFBF"/>
-            </w:tcBorders>
-            <w:vAlign w:val="center"/>
-          </w:tcPr>
-          <w:p>
-            <w:pPr>
-              <w:spacing w:before="40" w:after="40"/>
-              <w:jc w:val="center"/>
-            </w:pPr>
-            <w:r/>
-            <w:r>
-              <w:rPr>
-                <w:rFonts w:ascii="Times New Roman" w:hAnsi="Times New Roman" w:cs="Times New Roman" w:eastAsia="Times New Roman"/>
-                <w:b/>
-                <w:color w:val="FFFFFF"/>
-                <w:sz w:val="16"/>
-              </w:rPr>
-              <w:t>Цена с НДС, ₽</w:t>
-            </w:r>
-          </w:p>
-        </w:tc>
-        <w:tc>
-          <w:tcPr>
-            <w:tcW w:type="dxa" w:w="1701"/>
-            <w:shd w:fill="1F4E79" w:val="clear"/>
-            <w:tcBorders>
-              <w:top w:val="single" w:sz="4" w:space="0" w:color="BFBFBF"/>
-              <w:left w:val="single" w:sz="4" w:space="0" w:color="BFBFBF"/>
-              <w:bottom w:val="single" w:sz="4" w:space="0" w:color="BFBFBF"/>
-              <w:right w:val="single" w:sz="4" w:space="0" w:color="BFBFBF"/>
-            </w:tcBorders>
-            <w:vAlign w:val="center"/>
-          </w:tcPr>
-          <w:p>
-            <w:pPr>
-              <w:spacing w:before="40" w:after="40"/>
-              <w:jc w:val="center"/>
-            </w:pPr>
-            <w:r/>
-            <w:r>
-              <w:rPr>
-                <w:rFonts w:ascii="Times New Roman" w:hAnsi="Times New Roman" w:cs="Times New Roman" w:eastAsia="Times New Roman"/>
-                <w:b/>
-                <w:color w:val="FFFFFF"/>
-                <w:sz w:val="16"/>
-              </w:rPr>
-              <w:t>Сумма с НДС, ₽</w:t>
-            </w:r>
-          </w:p>
-        </w:tc>
-        <w:tc>
-          <w:tcPr>
-            <w:tcW w:type="dxa" w:w="1701"/>
-            <w:shd w:fill="1F4E79" w:val="clear"/>
-            <w:tcBorders>
-              <w:top w:val="single" w:sz="4" w:space="0" w:color="BFBFBF"/>
-              <w:left w:val="single" w:sz="4" w:space="0" w:color="BFBFBF"/>
-              <w:bottom w:val="single" w:sz="4" w:space="0" w:color="BFBFBF"/>
-              <w:right w:val="single" w:sz="4" w:space="0" w:color="BFBFBF"/>
-            </w:tcBorders>
-            <w:vAlign w:val="center"/>
-          </w:tcPr>
-          <w:p>
-            <w:pPr>
-              <w:spacing w:before="40" w:after="40"/>
-              <w:jc w:val="center"/>
-            </w:pPr>
-            <w:r/>
-            <w:r>
-              <w:rPr>
-                <w:rFonts w:ascii="Times New Roman" w:hAnsi="Times New Roman" w:cs="Times New Roman" w:eastAsia="Times New Roman"/>
-                <w:b/>
-                <w:color w:val="FFFFFF"/>
-                <w:sz w:val="16"/>
-              </w:rPr>
-              <w:t>Назначение</w:t>
+              <w:t>Сумма, ₽</w:t>
             </w:r>
           </w:p>
         </w:tc>
@@ -2539,7 +1650,7 @@
       <w:tr>
         <w:tc>
           <w:tcPr>
-            <w:tcW w:type="dxa" w:w="1701"/>
+            <w:tcW w:type="dxa" w:w="5103"/>
             <w:shd w:fill="F2F2F2" w:val="clear"/>
             <w:tcBorders>
               <w:top w:val="single" w:sz="4" w:space="0" w:color="BFBFBF"/>
@@ -2562,71 +1673,13 @@
                 <w:color w:val="000000"/>
                 <w:sz w:val="16"/>
               </w:rPr>
-              <w:t>6</w:t>
+              <w:t>Всего с НДС по заявке 254397</w:t>
             </w:r>
           </w:p>
         </w:tc>
         <w:tc>
           <w:tcPr>
-            <w:tcW w:type="dxa" w:w="1701"/>
-            <w:shd w:fill="F2F2F2" w:val="clear"/>
-            <w:tcBorders>
-              <w:top w:val="single" w:sz="4" w:space="0" w:color="BFBFBF"/>
-              <w:left w:val="single" w:sz="4" w:space="0" w:color="BFBFBF"/>
-              <w:bottom w:val="single" w:sz="4" w:space="0" w:color="BFBFBF"/>
-              <w:right w:val="single" w:sz="4" w:space="0" w:color="BFBFBF"/>
-            </w:tcBorders>
-            <w:vAlign w:val="center"/>
-          </w:tcPr>
-          <w:p>
-            <w:pPr>
-              <w:spacing w:before="40" w:after="40"/>
-              <w:jc w:val="left"/>
-            </w:pPr>
-            <w:r/>
-            <w:r>
-              <w:rPr>
-                <w:rFonts w:ascii="Times New Roman" w:hAnsi="Times New Roman" w:cs="Times New Roman" w:eastAsia="Times New Roman"/>
-                <w:b w:val="0"/>
-                <w:color w:val="000000"/>
-                <w:sz w:val="16"/>
-              </w:rPr>
-              <w:t>HDD 10 ТБ Seagate SkyHawk AI ST10000VE001 (рекомендован DSSL для NeuroStation 8-disk)</w:t>
-            </w:r>
-          </w:p>
-        </w:tc>
-        <w:tc>
-          <w:tcPr>
-            <w:tcW w:type="dxa" w:w="1701"/>
-            <w:shd w:fill="F2F2F2" w:val="clear"/>
-            <w:tcBorders>
-              <w:top w:val="single" w:sz="4" w:space="0" w:color="BFBFBF"/>
-              <w:left w:val="single" w:sz="4" w:space="0" w:color="BFBFBF"/>
-              <w:bottom w:val="single" w:sz="4" w:space="0" w:color="BFBFBF"/>
-              <w:right w:val="single" w:sz="4" w:space="0" w:color="BFBFBF"/>
-            </w:tcBorders>
-            <w:vAlign w:val="center"/>
-          </w:tcPr>
-          <w:p>
-            <w:pPr>
-              <w:spacing w:before="40" w:after="40"/>
-              <w:jc w:val="left"/>
-            </w:pPr>
-            <w:r/>
-            <w:r>
-              <w:rPr>
-                <w:rFonts w:ascii="Times New Roman" w:hAnsi="Times New Roman" w:cs="Times New Roman" w:eastAsia="Times New Roman"/>
-                <w:b w:val="0"/>
-                <w:color w:val="000000"/>
-                <w:sz w:val="16"/>
-              </w:rPr>
-              <w:t>8</w:t>
-            </w:r>
-          </w:p>
-        </w:tc>
-        <w:tc>
-          <w:tcPr>
-            <w:tcW w:type="dxa" w:w="1701"/>
+            <w:tcW w:type="dxa" w:w="5103"/>
             <w:shd w:fill="F2F2F2" w:val="clear"/>
             <w:tcBorders>
               <w:top w:val="single" w:sz="4" w:space="0" w:color="BFBFBF"/>
@@ -2649,13 +1702,104 @@
                 <w:color w:val="000000"/>
                 <w:sz w:val="16"/>
               </w:rPr>
-              <w:t>55 200</w:t>
+              <w:t>1 122 000</w:t>
+            </w:r>
+          </w:p>
+        </w:tc>
+      </w:tr>
+      <w:tr>
+        <w:tc>
+          <w:tcPr>
+            <w:tcW w:type="dxa" w:w="5103"/>
+            <w:shd w:fill="FFFFFF" w:val="clear"/>
+            <w:tcBorders>
+              <w:top w:val="single" w:sz="4" w:space="0" w:color="BFBFBF"/>
+              <w:left w:val="single" w:sz="4" w:space="0" w:color="BFBFBF"/>
+              <w:bottom w:val="single" w:sz="4" w:space="0" w:color="BFBFBF"/>
+              <w:right w:val="single" w:sz="4" w:space="0" w:color="BFBFBF"/>
+            </w:tcBorders>
+            <w:vAlign w:val="center"/>
+          </w:tcPr>
+          <w:p>
+            <w:pPr>
+              <w:spacing w:before="40" w:after="40"/>
+              <w:jc w:val="center"/>
+            </w:pPr>
+            <w:r/>
+            <w:r>
+              <w:rPr>
+                <w:rFonts w:ascii="Times New Roman" w:hAnsi="Times New Roman" w:cs="Times New Roman" w:eastAsia="Times New Roman"/>
+                <w:b w:val="0"/>
+                <w:color w:val="000000"/>
+                <w:sz w:val="16"/>
+              </w:rPr>
+              <w:t>в том числе НДС 22%</w:t>
             </w:r>
           </w:p>
         </w:tc>
         <w:tc>
           <w:tcPr>
-            <w:tcW w:type="dxa" w:w="1701"/>
+            <w:tcW w:type="dxa" w:w="5103"/>
+            <w:shd w:fill="FFFFFF" w:val="clear"/>
+            <w:tcBorders>
+              <w:top w:val="single" w:sz="4" w:space="0" w:color="BFBFBF"/>
+              <w:left w:val="single" w:sz="4" w:space="0" w:color="BFBFBF"/>
+              <w:bottom w:val="single" w:sz="4" w:space="0" w:color="BFBFBF"/>
+              <w:right w:val="single" w:sz="4" w:space="0" w:color="BFBFBF"/>
+            </w:tcBorders>
+            <w:vAlign w:val="center"/>
+          </w:tcPr>
+          <w:p>
+            <w:pPr>
+              <w:spacing w:before="40" w:after="40"/>
+              <w:jc w:val="right"/>
+            </w:pPr>
+            <w:r/>
+            <w:r>
+              <w:rPr>
+                <w:rFonts w:ascii="Times New Roman" w:hAnsi="Times New Roman" w:cs="Times New Roman" w:eastAsia="Times New Roman"/>
+                <w:b w:val="0"/>
+                <w:color w:val="000000"/>
+                <w:sz w:val="16"/>
+              </w:rPr>
+              <w:t>202 327,87</w:t>
+            </w:r>
+          </w:p>
+        </w:tc>
+      </w:tr>
+      <w:tr>
+        <w:tc>
+          <w:tcPr>
+            <w:tcW w:type="dxa" w:w="5103"/>
+            <w:shd w:fill="F2F2F2" w:val="clear"/>
+            <w:tcBorders>
+              <w:top w:val="single" w:sz="4" w:space="0" w:color="BFBFBF"/>
+              <w:left w:val="single" w:sz="4" w:space="0" w:color="BFBFBF"/>
+              <w:bottom w:val="single" w:sz="4" w:space="0" w:color="BFBFBF"/>
+              <w:right w:val="single" w:sz="4" w:space="0" w:color="BFBFBF"/>
+            </w:tcBorders>
+            <w:vAlign w:val="center"/>
+          </w:tcPr>
+          <w:p>
+            <w:pPr>
+              <w:spacing w:before="40" w:after="40"/>
+              <w:jc w:val="center"/>
+            </w:pPr>
+            <w:r/>
+            <w:r>
+              <w:rPr>
+                <w:rFonts w:ascii="Times New Roman" w:hAnsi="Times New Roman" w:cs="Times New Roman" w:eastAsia="Times New Roman"/>
+                <w:b w:val="0"/>
+                <w:color w:val="000000"/>
+                <w:sz w:val="16"/>
+              </w:rPr>
+              <w:t>без НДС</w:t>
+            </w:r>
+          </w:p>
+        </w:tc>
+        <w:tc>
+          <w:tcPr>
+            <w:tcW w:type="dxa" w:w="5103"/>
             <w:shd w:fill="F2F2F2" w:val="clear"/>
             <w:tcBorders>
               <w:top w:val="single" w:sz="4" w:space="0" w:color="BFBFBF"/>
@@ -2678,212 +1822,7 @@
                 <w:color w:val="000000"/>
                 <w:sz w:val="16"/>
               </w:rPr>
-              <w:t>441 600</w:t>
-            </w:r>
-          </w:p>
-        </w:tc>
-        <w:tc>
-          <w:tcPr>
-            <w:tcW w:type="dxa" w:w="1701"/>
-            <w:shd w:fill="F2F2F2" w:val="clear"/>
-            <w:tcBorders>
-              <w:top w:val="single" w:sz="4" w:space="0" w:color="BFBFBF"/>
-              <w:left w:val="single" w:sz="4" w:space="0" w:color="BFBFBF"/>
-              <w:bottom w:val="single" w:sz="4" w:space="0" w:color="BFBFBF"/>
-              <w:right w:val="single" w:sz="4" w:space="0" w:color="BFBFBF"/>
-            </w:tcBorders>
-            <w:vAlign w:val="center"/>
-          </w:tcPr>
-          <w:p>
-            <w:pPr>
-              <w:spacing w:before="40" w:after="40"/>
-              <w:jc w:val="left"/>
-            </w:pPr>
-            <w:r/>
-            <w:r>
-              <w:rPr>
-                <w:rFonts w:ascii="Times New Roman" w:hAnsi="Times New Roman" w:cs="Times New Roman" w:eastAsia="Times New Roman"/>
-                <w:b w:val="0"/>
-                <w:color w:val="000000"/>
-                <w:sz w:val="16"/>
-              </w:rPr>
-              <w:t>≈30 суток архива на одном NVR</w:t>
-            </w:r>
-          </w:p>
-        </w:tc>
-      </w:tr>
-      <w:tr>
-        <w:tc>
-          <w:tcPr>
-            <w:tcW w:type="dxa" w:w="1701"/>
-            <w:shd w:fill="FFFFFF" w:val="clear"/>
-            <w:tcBorders>
-              <w:top w:val="single" w:sz="4" w:space="0" w:color="BFBFBF"/>
-              <w:left w:val="single" w:sz="4" w:space="0" w:color="BFBFBF"/>
-              <w:bottom w:val="single" w:sz="4" w:space="0" w:color="BFBFBF"/>
-              <w:right w:val="single" w:sz="4" w:space="0" w:color="BFBFBF"/>
-            </w:tcBorders>
-            <w:vAlign w:val="center"/>
-          </w:tcPr>
-          <w:p>
-            <w:pPr>
-              <w:spacing w:before="40" w:after="40"/>
-              <w:jc w:val="center"/>
-            </w:pPr>
-            <w:r/>
-            <w:r>
-              <w:rPr>
-                <w:rFonts w:ascii="Times New Roman" w:hAnsi="Times New Roman" w:cs="Times New Roman" w:eastAsia="Times New Roman"/>
-                <w:b w:val="0"/>
-                <w:color w:val="000000"/>
-                <w:sz w:val="16"/>
-              </w:rPr>
-              <w:t>7</w:t>
-            </w:r>
-          </w:p>
-        </w:tc>
-        <w:tc>
-          <w:tcPr>
-            <w:tcW w:type="dxa" w:w="1701"/>
-            <w:shd w:fill="FFFFFF" w:val="clear"/>
-            <w:tcBorders>
-              <w:top w:val="single" w:sz="4" w:space="0" w:color="BFBFBF"/>
-              <w:left w:val="single" w:sz="4" w:space="0" w:color="BFBFBF"/>
-              <w:bottom w:val="single" w:sz="4" w:space="0" w:color="BFBFBF"/>
-              <w:right w:val="single" w:sz="4" w:space="0" w:color="BFBFBF"/>
-            </w:tcBorders>
-            <w:vAlign w:val="center"/>
-          </w:tcPr>
-          <w:p>
-            <w:pPr>
-              <w:spacing w:before="40" w:after="40"/>
-              <w:jc w:val="left"/>
-            </w:pPr>
-            <w:r/>
-            <w:r>
-              <w:rPr>
-                <w:rFonts w:ascii="Times New Roman" w:hAnsi="Times New Roman" w:cs="Times New Roman" w:eastAsia="Times New Roman"/>
-                <w:b w:val="0"/>
-                <w:color w:val="000000"/>
-                <w:sz w:val="16"/>
-              </w:rPr>
-              <w:t>TRASSIR Neuro Detector, доп. каналы (в 2 NVR уже 4 лицензии)</w:t>
-            </w:r>
-          </w:p>
-        </w:tc>
-        <w:tc>
-          <w:tcPr>
-            <w:tcW w:type="dxa" w:w="1701"/>
-            <w:shd w:fill="FFFFFF" w:val="clear"/>
-            <w:tcBorders>
-              <w:top w:val="single" w:sz="4" w:space="0" w:color="BFBFBF"/>
-              <w:left w:val="single" w:sz="4" w:space="0" w:color="BFBFBF"/>
-              <w:bottom w:val="single" w:sz="4" w:space="0" w:color="BFBFBF"/>
-              <w:right w:val="single" w:sz="4" w:space="0" w:color="BFBFBF"/>
-            </w:tcBorders>
-            <w:vAlign w:val="center"/>
-          </w:tcPr>
-          <w:p>
-            <w:pPr>
-              <w:spacing w:before="40" w:after="40"/>
-              <w:jc w:val="left"/>
-            </w:pPr>
-            <w:r/>
-            <w:r>
-              <w:rPr>
-                <w:rFonts w:ascii="Times New Roman" w:hAnsi="Times New Roman" w:cs="Times New Roman" w:eastAsia="Times New Roman"/>
-                <w:b w:val="0"/>
-                <w:color w:val="000000"/>
-                <w:sz w:val="16"/>
-              </w:rPr>
-              <w:t>47</w:t>
-            </w:r>
-          </w:p>
-        </w:tc>
-        <w:tc>
-          <w:tcPr>
-            <w:tcW w:type="dxa" w:w="1701"/>
-            <w:shd w:fill="FFFFFF" w:val="clear"/>
-            <w:tcBorders>
-              <w:top w:val="single" w:sz="4" w:space="0" w:color="BFBFBF"/>
-              <w:left w:val="single" w:sz="4" w:space="0" w:color="BFBFBF"/>
-              <w:bottom w:val="single" w:sz="4" w:space="0" w:color="BFBFBF"/>
-              <w:right w:val="single" w:sz="4" w:space="0" w:color="BFBFBF"/>
-            </w:tcBorders>
-            <w:vAlign w:val="center"/>
-          </w:tcPr>
-          <w:p>
-            <w:pPr>
-              <w:spacing w:before="40" w:after="40"/>
-              <w:jc w:val="right"/>
-            </w:pPr>
-            <w:r/>
-            <w:r>
-              <w:rPr>
-                <w:rFonts w:ascii="Times New Roman" w:hAnsi="Times New Roman" w:cs="Times New Roman" w:eastAsia="Times New Roman"/>
-                <w:b w:val="0"/>
-                <w:color w:val="000000"/>
-                <w:sz w:val="16"/>
-              </w:rPr>
-              <w:t>6 600</w:t>
-            </w:r>
-          </w:p>
-        </w:tc>
-        <w:tc>
-          <w:tcPr>
-            <w:tcW w:type="dxa" w:w="1701"/>
-            <w:shd w:fill="FFFFFF" w:val="clear"/>
-            <w:tcBorders>
-              <w:top w:val="single" w:sz="4" w:space="0" w:color="BFBFBF"/>
-              <w:left w:val="single" w:sz="4" w:space="0" w:color="BFBFBF"/>
-              <w:bottom w:val="single" w:sz="4" w:space="0" w:color="BFBFBF"/>
-              <w:right w:val="single" w:sz="4" w:space="0" w:color="BFBFBF"/>
-            </w:tcBorders>
-            <w:vAlign w:val="center"/>
-          </w:tcPr>
-          <w:p>
-            <w:pPr>
-              <w:spacing w:before="40" w:after="40"/>
-              <w:jc w:val="right"/>
-            </w:pPr>
-            <w:r/>
-            <w:r>
-              <w:rPr>
-                <w:rFonts w:ascii="Times New Roman" w:hAnsi="Times New Roman" w:cs="Times New Roman" w:eastAsia="Times New Roman"/>
-                <w:b w:val="0"/>
-                <w:color w:val="000000"/>
-                <w:sz w:val="16"/>
-              </w:rPr>
-              <w:t>310 200</w:t>
-            </w:r>
-          </w:p>
-        </w:tc>
-        <w:tc>
-          <w:tcPr>
-            <w:tcW w:type="dxa" w:w="1701"/>
-            <w:shd w:fill="FFFFFF" w:val="clear"/>
-            <w:tcBorders>
-              <w:top w:val="single" w:sz="4" w:space="0" w:color="BFBFBF"/>
-              <w:left w:val="single" w:sz="4" w:space="0" w:color="BFBFBF"/>
-              <w:bottom w:val="single" w:sz="4" w:space="0" w:color="BFBFBF"/>
-              <w:right w:val="single" w:sz="4" w:space="0" w:color="BFBFBF"/>
-            </w:tcBorders>
-            <w:vAlign w:val="center"/>
-          </w:tcPr>
-          <w:p>
-            <w:pPr>
-              <w:spacing w:before="40" w:after="40"/>
-              <w:jc w:val="left"/>
-            </w:pPr>
-            <w:r/>
-            <w:r>
-              <w:rPr>
-                <w:rFonts w:ascii="Times New Roman" w:hAnsi="Times New Roman" w:cs="Times New Roman" w:eastAsia="Times New Roman"/>
-                <w:b w:val="0"/>
-                <w:color w:val="000000"/>
-                <w:sz w:val="16"/>
-              </w:rPr>
-              <w:t>аналитика на все 51 камеру</w:t>
+              <w:t>919 672,13</w:t>
             </w:r>
           </w:p>
         </w:tc>
@@ -2899,9 +1838,23 @@
           <w:b w:val="0"/>
           <w:i w:val="0"/>
           <w:color w:val="000000"/>
-          <w:sz w:val="22"/>
+          <w:sz w:val="20"/>
         </w:rPr>
-        <w:t>Сводка комплектов</w:t>
+        <w:t>Артикул в открытых каталогах не найден; 22 000 ₽ — ориентир 4 Мп. Подтвердить у DSSL/НИЦ до подачи. Если допущен эквивалент: 51× TR-D2151IR3 v2 (R) 2.8 × 16 800 ₽ = 856 800 ₽.</w:t>
+      </w:r>
+    </w:p>
+    <w:p>
+      <w:pPr>
+        <w:spacing w:before="240" w:after="120"/>
+      </w:pPr>
+      <w:r>
+        <w:rPr>
+          <w:rFonts w:ascii="Calibri" w:hAnsi="Calibri" w:cs="Calibri" w:eastAsia="Calibri"/>
+          <w:b/>
+          <w:color w:val="1F4E79"/>
+          <w:sz w:val="26"/>
+        </w:rPr>
+        <w:t>Справочно: обе заявки</w:t>
       </w:r>
     </w:p>
     <w:tbl>
@@ -3001,7 +1954,7 @@
                 <w:color w:val="000000"/>
                 <w:sz w:val="16"/>
               </w:rPr>
-              <w:t>Запрос (п. 1–4)</w:t>
+              <w:t>Заявка 254364 (2 NVR)</w:t>
             </w:r>
           </w:p>
         </w:tc>
@@ -3030,7 +1983,7 @@
                 <w:color w:val="000000"/>
                 <w:sz w:val="16"/>
               </w:rPr>
-              <w:t>1 844 830</w:t>
+              <w:t>955 480</w:t>
             </w:r>
           </w:p>
         </w:tc>
@@ -3061,7 +2014,7 @@
                 <w:color w:val="000000"/>
                 <w:sz w:val="16"/>
               </w:rPr>
-              <w:t>Работоспособный минимум (п. 1–5)</w:t>
+              <w:t>Заявка 254397 (51 камера 4BHNN0)</w:t>
             </w:r>
           </w:p>
         </w:tc>
@@ -3090,7 +2043,7 @@
                 <w:color w:val="000000"/>
                 <w:sz w:val="16"/>
               </w:rPr>
-              <w:t>2 104 420</w:t>
+              <w:t>1 122 000</w:t>
             </w:r>
           </w:p>
         </w:tc>
@@ -3121,7 +2074,7 @@
                 <w:color w:val="000000"/>
                 <w:sz w:val="16"/>
               </w:rPr>
-              <w:t>+ архив 30 суток (п. 1–6)</w:t>
+              <w:t>Сумма двух заявок (не объединять на ЭТП)</w:t>
             </w:r>
           </w:p>
         </w:tc>
@@ -3150,7 +2103,168 @@
                 <w:color w:val="000000"/>
                 <w:sz w:val="16"/>
               </w:rPr>
-              <w:t>2 546 020</w:t>
+              <w:t>2 077 480</w:t>
+            </w:r>
+          </w:p>
+        </w:tc>
+      </w:tr>
+    </w:tbl>
+    <w:p>
+      <w:pPr>
+        <w:spacing w:before="240" w:after="120"/>
+      </w:pPr>
+      <w:r>
+        <w:rPr>
+          <w:rFonts w:ascii="Calibri" w:hAnsi="Calibri" w:cs="Calibri" w:eastAsia="Calibri"/>
+          <w:b/>
+          <w:color w:val="1F4E79"/>
+          <w:sz w:val="26"/>
+        </w:rPr>
+        <w:t>В. Не входит в извещения</w:t>
+      </w:r>
+    </w:p>
+    <w:p>
+      <w:pPr>
+        <w:spacing w:after="120" w:line="240" w:lineRule="auto"/>
+      </w:pPr>
+      <w:r>
+        <w:rPr>
+          <w:rFonts w:ascii="Times New Roman" w:hAnsi="Times New Roman" w:cs="Times New Roman" w:eastAsia="Times New Roman"/>
+          <w:b w:val="0"/>
+          <w:i w:val="0"/>
+          <w:color w:val="000000"/>
+          <w:sz w:val="22"/>
+        </w:rPr>
+        <w:t>Регистратор поставляется без лицензий на камеры и без HDD. Эти позиции нельзя дописать в ценовой запрос, если их нет в спецификации. Без AnyIP Astra Linux (DSSL 95887) NVR не запишет 51 камеру.</w:t>
+      </w:r>
+    </w:p>
+    <w:tbl>
+      <w:tblPr>
+        <w:tblW w:type="auto" w:w="0"/>
+        <w:jc w:val="center"/>
+        <w:tblLayout w:type="autofit"/>
+        <w:tblLook w:firstColumn="1" w:firstRow="1" w:lastColumn="0" w:lastRow="0" w:noHBand="0" w:noVBand="1" w:val="04A0"/>
+      </w:tblPr>
+      <w:tblGrid>
+        <w:gridCol w:w="2551"/>
+        <w:gridCol w:w="2551"/>
+        <w:gridCol w:w="2551"/>
+        <w:gridCol w:w="2551"/>
+      </w:tblGrid>
+      <w:tr>
+        <w:tc>
+          <w:tcPr>
+            <w:tcW w:type="dxa" w:w="2551"/>
+            <w:shd w:fill="1F4E79" w:val="clear"/>
+            <w:tcBorders>
+              <w:top w:val="single" w:sz="4" w:space="0" w:color="BFBFBF"/>
+              <w:left w:val="single" w:sz="4" w:space="0" w:color="BFBFBF"/>
+              <w:bottom w:val="single" w:sz="4" w:space="0" w:color="BFBFBF"/>
+              <w:right w:val="single" w:sz="4" w:space="0" w:color="BFBFBF"/>
+            </w:tcBorders>
+            <w:vAlign w:val="center"/>
+          </w:tcPr>
+          <w:p>
+            <w:pPr>
+              <w:spacing w:before="40" w:after="40"/>
+              <w:jc w:val="center"/>
+            </w:pPr>
+            <w:r/>
+            <w:r>
+              <w:rPr>
+                <w:rFonts w:ascii="Times New Roman" w:hAnsi="Times New Roman" w:cs="Times New Roman" w:eastAsia="Times New Roman"/>
+                <w:b/>
+                <w:color w:val="FFFFFF"/>
+                <w:sz w:val="16"/>
+              </w:rPr>
+              <w:t>Наименование</w:t>
+            </w:r>
+          </w:p>
+        </w:tc>
+        <w:tc>
+          <w:tcPr>
+            <w:tcW w:type="dxa" w:w="2551"/>
+            <w:shd w:fill="1F4E79" w:val="clear"/>
+            <w:tcBorders>
+              <w:top w:val="single" w:sz="4" w:space="0" w:color="BFBFBF"/>
+              <w:left w:val="single" w:sz="4" w:space="0" w:color="BFBFBF"/>
+              <w:bottom w:val="single" w:sz="4" w:space="0" w:color="BFBFBF"/>
+              <w:right w:val="single" w:sz="4" w:space="0" w:color="BFBFBF"/>
+            </w:tcBorders>
+            <w:vAlign w:val="center"/>
+          </w:tcPr>
+          <w:p>
+            <w:pPr>
+              <w:spacing w:before="40" w:after="40"/>
+              <w:jc w:val="center"/>
+            </w:pPr>
+            <w:r/>
+            <w:r>
+              <w:rPr>
+                <w:rFonts w:ascii="Times New Roman" w:hAnsi="Times New Roman" w:cs="Times New Roman" w:eastAsia="Times New Roman"/>
+                <w:b/>
+                <w:color w:val="FFFFFF"/>
+                <w:sz w:val="16"/>
+              </w:rPr>
+              <w:t>Кол-во</w:t>
+            </w:r>
+          </w:p>
+        </w:tc>
+        <w:tc>
+          <w:tcPr>
+            <w:tcW w:type="dxa" w:w="2551"/>
+            <w:shd w:fill="1F4E79" w:val="clear"/>
+            <w:tcBorders>
+              <w:top w:val="single" w:sz="4" w:space="0" w:color="BFBFBF"/>
+              <w:left w:val="single" w:sz="4" w:space="0" w:color="BFBFBF"/>
+              <w:bottom w:val="single" w:sz="4" w:space="0" w:color="BFBFBF"/>
+              <w:right w:val="single" w:sz="4" w:space="0" w:color="BFBFBF"/>
+            </w:tcBorders>
+            <w:vAlign w:val="center"/>
+          </w:tcPr>
+          <w:p>
+            <w:pPr>
+              <w:spacing w:before="40" w:after="40"/>
+              <w:jc w:val="center"/>
+            </w:pPr>
+            <w:r/>
+            <w:r>
+              <w:rPr>
+                <w:rFonts w:ascii="Times New Roman" w:hAnsi="Times New Roman" w:cs="Times New Roman" w:eastAsia="Times New Roman"/>
+                <w:b/>
+                <w:color w:val="FFFFFF"/>
+                <w:sz w:val="16"/>
+              </w:rPr>
+              <w:t>Цена с НДС, ₽</w:t>
+            </w:r>
+          </w:p>
+        </w:tc>
+        <w:tc>
+          <w:tcPr>
+            <w:tcW w:type="dxa" w:w="2551"/>
+            <w:shd w:fill="1F4E79" w:val="clear"/>
+            <w:tcBorders>
+              <w:top w:val="single" w:sz="4" w:space="0" w:color="BFBFBF"/>
+              <w:left w:val="single" w:sz="4" w:space="0" w:color="BFBFBF"/>
+              <w:bottom w:val="single" w:sz="4" w:space="0" w:color="BFBFBF"/>
+              <w:right w:val="single" w:sz="4" w:space="0" w:color="BFBFBF"/>
+            </w:tcBorders>
+            <w:vAlign w:val="center"/>
+          </w:tcPr>
+          <w:p>
+            <w:pPr>
+              <w:spacing w:before="40" w:after="40"/>
+              <w:jc w:val="center"/>
+            </w:pPr>
+            <w:r/>
+            <w:r>
+              <w:rPr>
+                <w:rFonts w:ascii="Times New Roman" w:hAnsi="Times New Roman" w:cs="Times New Roman" w:eastAsia="Times New Roman"/>
+                <w:b/>
+                <w:color w:val="FFFFFF"/>
+                <w:sz w:val="16"/>
+              </w:rPr>
+              <w:t>Сумма с НДС, ₽</w:t>
             </w:r>
           </w:p>
         </w:tc>
@@ -3158,7 +2272,125 @@
       <w:tr>
         <w:tc>
           <w:tcPr>
-            <w:tcW w:type="dxa" w:w="5103"/>
+            <w:tcW w:type="dxa" w:w="2551"/>
+            <w:shd w:fill="F2F2F2" w:val="clear"/>
+            <w:tcBorders>
+              <w:top w:val="single" w:sz="4" w:space="0" w:color="BFBFBF"/>
+              <w:left w:val="single" w:sz="4" w:space="0" w:color="BFBFBF"/>
+              <w:bottom w:val="single" w:sz="4" w:space="0" w:color="BFBFBF"/>
+              <w:right w:val="single" w:sz="4" w:space="0" w:color="BFBFBF"/>
+            </w:tcBorders>
+            <w:vAlign w:val="center"/>
+          </w:tcPr>
+          <w:p>
+            <w:pPr>
+              <w:spacing w:before="40" w:after="40"/>
+              <w:jc w:val="center"/>
+            </w:pPr>
+            <w:r/>
+            <w:r>
+              <w:rPr>
+                <w:rFonts w:ascii="Times New Roman" w:hAnsi="Times New Roman" w:cs="Times New Roman" w:eastAsia="Times New Roman"/>
+                <w:b w:val="0"/>
+                <w:color w:val="000000"/>
+                <w:sz w:val="16"/>
+              </w:rPr>
+              <w:t>Лицензия TRASSIR AnyIP (Astra Linux), DSSL 95887</w:t>
+            </w:r>
+          </w:p>
+        </w:tc>
+        <w:tc>
+          <w:tcPr>
+            <w:tcW w:type="dxa" w:w="2551"/>
+            <w:shd w:fill="F2F2F2" w:val="clear"/>
+            <w:tcBorders>
+              <w:top w:val="single" w:sz="4" w:space="0" w:color="BFBFBF"/>
+              <w:left w:val="single" w:sz="4" w:space="0" w:color="BFBFBF"/>
+              <w:bottom w:val="single" w:sz="4" w:space="0" w:color="BFBFBF"/>
+              <w:right w:val="single" w:sz="4" w:space="0" w:color="BFBFBF"/>
+            </w:tcBorders>
+            <w:vAlign w:val="center"/>
+          </w:tcPr>
+          <w:p>
+            <w:pPr>
+              <w:spacing w:before="40" w:after="40"/>
+              <w:jc w:val="left"/>
+            </w:pPr>
+            <w:r/>
+            <w:r>
+              <w:rPr>
+                <w:rFonts w:ascii="Times New Roman" w:hAnsi="Times New Roman" w:cs="Times New Roman" w:eastAsia="Times New Roman"/>
+                <w:b w:val="0"/>
+                <w:color w:val="000000"/>
+                <w:sz w:val="16"/>
+              </w:rPr>
+              <w:t>51</w:t>
+            </w:r>
+          </w:p>
+        </w:tc>
+        <w:tc>
+          <w:tcPr>
+            <w:tcW w:type="dxa" w:w="2551"/>
+            <w:shd w:fill="F2F2F2" w:val="clear"/>
+            <w:tcBorders>
+              <w:top w:val="single" w:sz="4" w:space="0" w:color="BFBFBF"/>
+              <w:left w:val="single" w:sz="4" w:space="0" w:color="BFBFBF"/>
+              <w:bottom w:val="single" w:sz="4" w:space="0" w:color="BFBFBF"/>
+              <w:right w:val="single" w:sz="4" w:space="0" w:color="BFBFBF"/>
+            </w:tcBorders>
+            <w:vAlign w:val="center"/>
+          </w:tcPr>
+          <w:p>
+            <w:pPr>
+              <w:spacing w:before="40" w:after="40"/>
+              <w:jc w:val="right"/>
+            </w:pPr>
+            <w:r/>
+            <w:r>
+              <w:rPr>
+                <w:rFonts w:ascii="Times New Roman" w:hAnsi="Times New Roman" w:cs="Times New Roman" w:eastAsia="Times New Roman"/>
+                <w:b w:val="0"/>
+                <w:color w:val="000000"/>
+                <w:sz w:val="16"/>
+              </w:rPr>
+              <w:t>5 090</w:t>
+            </w:r>
+          </w:p>
+        </w:tc>
+        <w:tc>
+          <w:tcPr>
+            <w:tcW w:type="dxa" w:w="2551"/>
+            <w:shd w:fill="F2F2F2" w:val="clear"/>
+            <w:tcBorders>
+              <w:top w:val="single" w:sz="4" w:space="0" w:color="BFBFBF"/>
+              <w:left w:val="single" w:sz="4" w:space="0" w:color="BFBFBF"/>
+              <w:bottom w:val="single" w:sz="4" w:space="0" w:color="BFBFBF"/>
+              <w:right w:val="single" w:sz="4" w:space="0" w:color="BFBFBF"/>
+            </w:tcBorders>
+            <w:vAlign w:val="center"/>
+          </w:tcPr>
+          <w:p>
+            <w:pPr>
+              <w:spacing w:before="40" w:after="40"/>
+              <w:jc w:val="right"/>
+            </w:pPr>
+            <w:r/>
+            <w:r>
+              <w:rPr>
+                <w:rFonts w:ascii="Times New Roman" w:hAnsi="Times New Roman" w:cs="Times New Roman" w:eastAsia="Times New Roman"/>
+                <w:b w:val="0"/>
+                <w:color w:val="000000"/>
+                <w:sz w:val="16"/>
+              </w:rPr>
+              <w:t>259 590</w:t>
+            </w:r>
+          </w:p>
+        </w:tc>
+      </w:tr>
+      <w:tr>
+        <w:tc>
+          <w:tcPr>
+            <w:tcW w:type="dxa" w:w="2551"/>
             <w:shd w:fill="FFFFFF" w:val="clear"/>
             <w:tcBorders>
               <w:top w:val="single" w:sz="4" w:space="0" w:color="BFBFBF"/>
@@ -3181,13 +2413,42 @@
                 <w:color w:val="000000"/>
                 <w:sz w:val="16"/>
               </w:rPr>
-              <w:t>+ аналитика на все камеры (п. 1–7)</w:t>
+              <w:t>HDD 10 ТБ SkyHawk AI ST10000VE001</w:t>
             </w:r>
           </w:p>
         </w:tc>
         <w:tc>
           <w:tcPr>
-            <w:tcW w:type="dxa" w:w="5103"/>
+            <w:tcW w:type="dxa" w:w="2551"/>
+            <w:shd w:fill="FFFFFF" w:val="clear"/>
+            <w:tcBorders>
+              <w:top w:val="single" w:sz="4" w:space="0" w:color="BFBFBF"/>
+              <w:left w:val="single" w:sz="4" w:space="0" w:color="BFBFBF"/>
+              <w:bottom w:val="single" w:sz="4" w:space="0" w:color="BFBFBF"/>
+              <w:right w:val="single" w:sz="4" w:space="0" w:color="BFBFBF"/>
+            </w:tcBorders>
+            <w:vAlign w:val="center"/>
+          </w:tcPr>
+          <w:p>
+            <w:pPr>
+              <w:spacing w:before="40" w:after="40"/>
+              <w:jc w:val="left"/>
+            </w:pPr>
+            <w:r/>
+            <w:r>
+              <w:rPr>
+                <w:rFonts w:ascii="Times New Roman" w:hAnsi="Times New Roman" w:cs="Times New Roman" w:eastAsia="Times New Roman"/>
+                <w:b w:val="0"/>
+                <w:color w:val="000000"/>
+                <w:sz w:val="16"/>
+              </w:rPr>
+              <w:t>8</w:t>
+            </w:r>
+          </w:p>
+        </w:tc>
+        <w:tc>
+          <w:tcPr>
+            <w:tcW w:type="dxa" w:w="2551"/>
             <w:shd w:fill="FFFFFF" w:val="clear"/>
             <w:tcBorders>
               <w:top w:val="single" w:sz="4" w:space="0" w:color="BFBFBF"/>
@@ -3210,27 +2471,159 @@
                 <w:color w:val="000000"/>
                 <w:sz w:val="16"/>
               </w:rPr>
-              <w:t>2 856 220</w:t>
+              <w:t>55 200</w:t>
+            </w:r>
+          </w:p>
+        </w:tc>
+        <w:tc>
+          <w:tcPr>
+            <w:tcW w:type="dxa" w:w="2551"/>
+            <w:shd w:fill="FFFFFF" w:val="clear"/>
+            <w:tcBorders>
+              <w:top w:val="single" w:sz="4" w:space="0" w:color="BFBFBF"/>
+              <w:left w:val="single" w:sz="4" w:space="0" w:color="BFBFBF"/>
+              <w:bottom w:val="single" w:sz="4" w:space="0" w:color="BFBFBF"/>
+              <w:right w:val="single" w:sz="4" w:space="0" w:color="BFBFBF"/>
+            </w:tcBorders>
+            <w:vAlign w:val="center"/>
+          </w:tcPr>
+          <w:p>
+            <w:pPr>
+              <w:spacing w:before="40" w:after="40"/>
+              <w:jc w:val="right"/>
+            </w:pPr>
+            <w:r/>
+            <w:r>
+              <w:rPr>
+                <w:rFonts w:ascii="Times New Roman" w:hAnsi="Times New Roman" w:cs="Times New Roman" w:eastAsia="Times New Roman"/>
+                <w:b w:val="0"/>
+                <w:color w:val="000000"/>
+                <w:sz w:val="16"/>
+              </w:rPr>
+              <w:t>441 600</w:t>
+            </w:r>
+          </w:p>
+        </w:tc>
+      </w:tr>
+      <w:tr>
+        <w:tc>
+          <w:tcPr>
+            <w:tcW w:type="dxa" w:w="2551"/>
+            <w:shd w:fill="F2F2F2" w:val="clear"/>
+            <w:tcBorders>
+              <w:top w:val="single" w:sz="4" w:space="0" w:color="BFBFBF"/>
+              <w:left w:val="single" w:sz="4" w:space="0" w:color="BFBFBF"/>
+              <w:bottom w:val="single" w:sz="4" w:space="0" w:color="BFBFBF"/>
+              <w:right w:val="single" w:sz="4" w:space="0" w:color="BFBFBF"/>
+            </w:tcBorders>
+            <w:vAlign w:val="center"/>
+          </w:tcPr>
+          <w:p>
+            <w:pPr>
+              <w:spacing w:before="40" w:after="40"/>
+              <w:jc w:val="center"/>
+            </w:pPr>
+            <w:r/>
+            <w:r>
+              <w:rPr>
+                <w:rFonts w:ascii="Times New Roman" w:hAnsi="Times New Roman" w:cs="Times New Roman" w:eastAsia="Times New Roman"/>
+                <w:b w:val="0"/>
+                <w:color w:val="000000"/>
+                <w:sz w:val="16"/>
+              </w:rPr>
+              <w:t>Neuro Detector, доп. каналы (в 2 NVR уже 4)</w:t>
+            </w:r>
+          </w:p>
+        </w:tc>
+        <w:tc>
+          <w:tcPr>
+            <w:tcW w:type="dxa" w:w="2551"/>
+            <w:shd w:fill="F2F2F2" w:val="clear"/>
+            <w:tcBorders>
+              <w:top w:val="single" w:sz="4" w:space="0" w:color="BFBFBF"/>
+              <w:left w:val="single" w:sz="4" w:space="0" w:color="BFBFBF"/>
+              <w:bottom w:val="single" w:sz="4" w:space="0" w:color="BFBFBF"/>
+              <w:right w:val="single" w:sz="4" w:space="0" w:color="BFBFBF"/>
+            </w:tcBorders>
+            <w:vAlign w:val="center"/>
+          </w:tcPr>
+          <w:p>
+            <w:pPr>
+              <w:spacing w:before="40" w:after="40"/>
+              <w:jc w:val="left"/>
+            </w:pPr>
+            <w:r/>
+            <w:r>
+              <w:rPr>
+                <w:rFonts w:ascii="Times New Roman" w:hAnsi="Times New Roman" w:cs="Times New Roman" w:eastAsia="Times New Roman"/>
+                <w:b w:val="0"/>
+                <w:color w:val="000000"/>
+                <w:sz w:val="16"/>
+              </w:rPr>
+              <w:t>47</w:t>
+            </w:r>
+          </w:p>
+        </w:tc>
+        <w:tc>
+          <w:tcPr>
+            <w:tcW w:type="dxa" w:w="2551"/>
+            <w:shd w:fill="F2F2F2" w:val="clear"/>
+            <w:tcBorders>
+              <w:top w:val="single" w:sz="4" w:space="0" w:color="BFBFBF"/>
+              <w:left w:val="single" w:sz="4" w:space="0" w:color="BFBFBF"/>
+              <w:bottom w:val="single" w:sz="4" w:space="0" w:color="BFBFBF"/>
+              <w:right w:val="single" w:sz="4" w:space="0" w:color="BFBFBF"/>
+            </w:tcBorders>
+            <w:vAlign w:val="center"/>
+          </w:tcPr>
+          <w:p>
+            <w:pPr>
+              <w:spacing w:before="40" w:after="40"/>
+              <w:jc w:val="right"/>
+            </w:pPr>
+            <w:r/>
+            <w:r>
+              <w:rPr>
+                <w:rFonts w:ascii="Times New Roman" w:hAnsi="Times New Roman" w:cs="Times New Roman" w:eastAsia="Times New Roman"/>
+                <w:b w:val="0"/>
+                <w:color w:val="000000"/>
+                <w:sz w:val="16"/>
+              </w:rPr>
+              <w:t>6 600</w:t>
+            </w:r>
+          </w:p>
+        </w:tc>
+        <w:tc>
+          <w:tcPr>
+            <w:tcW w:type="dxa" w:w="2551"/>
+            <w:shd w:fill="F2F2F2" w:val="clear"/>
+            <w:tcBorders>
+              <w:top w:val="single" w:sz="4" w:space="0" w:color="BFBFBF"/>
+              <w:left w:val="single" w:sz="4" w:space="0" w:color="BFBFBF"/>
+              <w:bottom w:val="single" w:sz="4" w:space="0" w:color="BFBFBF"/>
+              <w:right w:val="single" w:sz="4" w:space="0" w:color="BFBFBF"/>
+            </w:tcBorders>
+            <w:vAlign w:val="center"/>
+          </w:tcPr>
+          <w:p>
+            <w:pPr>
+              <w:spacing w:before="40" w:after="40"/>
+              <w:jc w:val="right"/>
+            </w:pPr>
+            <w:r/>
+            <w:r>
+              <w:rPr>
+                <w:rFonts w:ascii="Times New Roman" w:hAnsi="Times New Roman" w:cs="Times New Roman" w:eastAsia="Times New Roman"/>
+                <w:b w:val="0"/>
+                <w:color w:val="000000"/>
+                <w:sz w:val="16"/>
+              </w:rPr>
+              <w:t>310 200</w:t>
             </w:r>
           </w:p>
         </w:tc>
       </w:tr>
     </w:tbl>
-    <w:p>
-      <w:pPr>
-        <w:spacing w:after="120" w:line="240" w:lineRule="auto"/>
-      </w:pPr>
-      <w:r>
-        <w:rPr>
-          <w:rFonts w:ascii="Times New Roman" w:hAnsi="Times New Roman" w:cs="Times New Roman" w:eastAsia="Times New Roman"/>
-          <w:b w:val="0"/>
-          <w:i/>
-          <w:color w:val="595959"/>
-          <w:sz w:val="20"/>
-        </w:rPr>
-        <w:t>В расчёт не входят: PoE-коммутаторы, СКС, шкаф 19", ИБП, мониторы, пуско-наладка, доставка (если не самовывоз).</w:t>
-      </w:r>
-    </w:p>
     <w:p>
       <w:pPr>
         <w:spacing w:before="240" w:after="120"/>
@@ -3242,101 +2635,7 @@
           <w:color w:val="1F4E79"/>
           <w:sz w:val="26"/>
         </w:rPr>
-        <w:t>4. Подбор аналогов TRASSIR и СТ-1</w:t>
-      </w:r>
-    </w:p>
-    <w:p>
-      <w:r>
-        <w:rPr>
-          <w:rFonts w:ascii="Times New Roman" w:hAnsi="Times New Roman" w:cs="Times New Roman" w:eastAsia="Times New Roman"/>
-          <w:b/>
-          <w:color w:val="000000"/>
-          <w:sz w:val="22"/>
-        </w:rPr>
-        <w:t xml:space="preserve">4.1. TRASSIR NeuroStation Astra 9800R/128-S — 2 шт. </w:t>
-      </w:r>
-      <w:r>
-        <w:rPr>
-          <w:rFonts w:ascii="Times New Roman" w:hAnsi="Times New Roman" w:cs="Times New Roman" w:eastAsia="Times New Roman"/>
-          <w:b w:val="0"/>
-          <w:color w:val="000000"/>
-          <w:sz w:val="22"/>
-        </w:rPr>
-        <w:t>128 IP-каналов, полоса 790 Мбит/с, 8 отсеков HDD, стойка 2U, Astra Linux SE «Смоленск», реестры Минпромторга №719 / №878, СТ-1. Цена 477 740 ₽ — открытая розница; у DSSL проектная.</w:t>
-      </w:r>
-    </w:p>
-    <w:p>
-      <w:r>
-        <w:rPr>
-          <w:rFonts w:ascii="Times New Roman" w:hAnsi="Times New Roman" w:cs="Times New Roman" w:eastAsia="Times New Roman"/>
-          <w:b/>
-          <w:color w:val="000000"/>
-          <w:sz w:val="22"/>
-        </w:rPr>
-        <w:t xml:space="preserve">4.2. Аналог НИЦ 1143 — TR-D3153IR2 v2 (R) 2.7-13.5 — 1 шт. </w:t>
-      </w:r>
-      <w:r>
-        <w:rPr>
-          <w:rFonts w:ascii="Times New Roman" w:hAnsi="Times New Roman" w:cs="Times New Roman" w:eastAsia="Times New Roman"/>
-          <w:b w:val="0"/>
-          <w:color w:val="000000"/>
-          <w:sz w:val="22"/>
-        </w:rPr>
-        <w:t>Уличный вандалостойкий купол 5 Мп (вместо 4 Мп: в линейке СТ-1 нет 4 Мп), мотор 2.7–13.5 мм, ИК 25 м (у 1143 — 35 м), IP66/IK10, микрофон, сборка РФ, СТ-1 / РЭП. Код DSSL 10100. Ориентир цены 16 380 ₽ — розница исполнения (D).</w:t>
-      </w:r>
-    </w:p>
-    <w:p>
-      <w:r>
-        <w:rPr>
-          <w:rFonts w:ascii="Times New Roman" w:hAnsi="Times New Roman" w:cs="Times New Roman" w:eastAsia="Times New Roman"/>
-          <w:b/>
-          <w:color w:val="000000"/>
-          <w:sz w:val="22"/>
-        </w:rPr>
-        <w:t xml:space="preserve">4.3. Аналог 4MBIR-28-TMLW — TR-D2151IR3 v2 (R) 2.8 — 49 шт. </w:t>
-      </w:r>
-      <w:r>
-        <w:rPr>
-          <w:rFonts w:ascii="Times New Roman" w:hAnsi="Times New Roman" w:cs="Times New Roman" w:eastAsia="Times New Roman"/>
-          <w:b w:val="0"/>
-          <w:color w:val="000000"/>
-          <w:sz w:val="22"/>
-        </w:rPr>
-        <w:t>Уличный цилиндр 5 Мп, фикс 2.8 мм, ИК 35 м, микрофон, IP67, СТ-1 / РЭП. Код DSSL 16725. Ориентир 16 800 ₽. Отличие: нет комбинированной подсветки ИК+белый (Dual Light в СТ-1 5 Мп нет).</w:t>
-      </w:r>
-    </w:p>
-    <w:p>
-      <w:r>
-        <w:rPr>
-          <w:rFonts w:ascii="Times New Roman" w:hAnsi="Times New Roman" w:cs="Times New Roman" w:eastAsia="Times New Roman"/>
-          <w:b/>
-          <w:color w:val="000000"/>
-          <w:sz w:val="22"/>
-        </w:rPr>
-        <w:t xml:space="preserve">4.4. Аналог PTZ — TR-D6124IR10 v3 (R) 4.3-86 — 1 шт. </w:t>
-      </w:r>
-      <w:r>
-        <w:rPr>
-          <w:rFonts w:ascii="Times New Roman" w:hAnsi="Times New Roman" w:cs="Times New Roman" w:eastAsia="Times New Roman"/>
-          <w:b w:val="0"/>
-          <w:color w:val="000000"/>
-          <w:sz w:val="22"/>
-        </w:rPr>
-        <w:t>Самая недорогая поворотная камера TRASSIR с зумом ×20 и СТ-1: 2 Мп, 4.3–86 мм, ИК 100 м, IP66/IK10, PoE/12 В. Код DSSL 90684. Ориентир 49 770 ₽ (розница v3 / (D)).</w:t>
-      </w:r>
-    </w:p>
-    <w:p>
-      <w:pPr>
-        <w:spacing w:before="240" w:after="120"/>
-      </w:pPr>
-      <w:r>
-        <w:rPr>
-          <w:rFonts w:ascii="Calibri" w:hAnsi="Calibri" w:cs="Calibri" w:eastAsia="Calibri"/>
-          <w:b/>
-          <w:color w:val="1F4E79"/>
-          <w:sz w:val="26"/>
-        </w:rPr>
-        <w:t>5. Условия (типовые, к согласованию)</w:t>
+        <w:t>Условия подачи</w:t>
       </w:r>
     </w:p>
     <w:p>
@@ -3351,7 +2650,7 @@
           <w:color w:val="000000"/>
           <w:sz w:val="22"/>
         </w:rPr>
-        <w:t>1. Цены в рублях с НДС 22%, ориентир открытого рынка на 14.08.2026, редакция 3. Всё оборудование — DSSL/TRASSIR.</w:t>
+        <w:t>1. Подать две ценовые заявки на ЭТП ГПБ до 18.08.2026, 00:00 МСК.</w:t>
       </w:r>
     </w:p>
     <w:p>
@@ -3366,7 +2665,7 @@
           <w:color w:val="000000"/>
           <w:sz w:val="22"/>
         </w:rPr>
-        <w:t>2. Камеры — исполнения (R) со сертификатом СТ-1 и записью в РЭП (ПП РФ №878). Цена (R) у DSSL проектная.</w:t>
+        <w:t>2. НМЦ не указана. Ориентир участника; демпинг без расчёта себестоимости не закладывать.</w:t>
       </w:r>
     </w:p>
     <w:p>
@@ -3381,7 +2680,7 @@
           <w:color w:val="000000"/>
           <w:sz w:val="22"/>
         </w:rPr>
-        <w:t>3. Оплата: 100% предоплата или 70/30 — по договору.</w:t>
+        <w:t>3. Соответствие предмету извещения обязательно (44-ФЗ).</w:t>
       </w:r>
     </w:p>
     <w:p>
@@ -3396,7 +2695,7 @@
           <w:color w:val="000000"/>
           <w:sz w:val="22"/>
         </w:rPr>
-        <w:t>4. Поставка: самовывоз со склада дилера в РФ либо доставка за счёт заказчика.</w:t>
+        <w:t>4. Поставка: 346709, п. Ковалевка, ул. Салютная, д. 2. Срок — по документации процедуры.</w:t>
       </w:r>
     </w:p>
     <w:p>
@@ -3411,7 +2710,7 @@
           <w:color w:val="000000"/>
           <w:sz w:val="22"/>
         </w:rPr>
-        <w:t>5. Регистраторы поставляются без HDD. Лицензии AnyIP (Astra Linux, 95887) в комплект NVR не входят.</w:t>
+        <w:t>5. Оплата — по 44-ФЗ и контракту ФГКУ, не коммерческая предоплата 70/30.</w:t>
       </w:r>
     </w:p>
     <w:p>
@@ -3426,7 +2725,7 @@
           <w:color w:val="000000"/>
           <w:sz w:val="22"/>
         </w:rPr>
-        <w:t>6. DSSL даёт проектную цену на NeuroStation и камеры СТ-1 — партнёрская может быть ниже розницы.</w:t>
+        <w:t>6. Цена NVR 477 740 ₽ — открытая розница; у DSSL может быть ниже.</w:t>
       </w:r>
     </w:p>
     <w:p>
@@ -3440,7 +2739,7 @@
           <w:color w:val="1F4E79"/>
           <w:sz w:val="26"/>
         </w:rPr>
-        <w:t>6. Контакты для официального КП</w:t>
+        <w:t>Контакты</w:t>
       </w:r>
     </w:p>
     <w:tbl>
@@ -3540,7 +2839,7 @@
                 <w:color w:val="000000"/>
                 <w:sz w:val="16"/>
               </w:rPr>
-              <w:t>DSSL / TRASSIR (всё оборудование)</w:t>
+              <w:t>Заказчик</w:t>
             </w:r>
           </w:p>
         </w:tc>
@@ -3569,7 +2868,7 @@
                 <w:color w:val="000000"/>
                 <w:sz w:val="16"/>
               </w:rPr>
-              <w:t>8 (800) 100-91-12, dssl.ru</w:t>
+              <w:t>Пахомов И.В., donsc@dsc.61.mchs.gov.ru, +7 (86350) 2-71-98</w:t>
             </w:r>
           </w:p>
         </w:tc>
@@ -3600,7 +2899,7 @@
                 <w:color w:val="000000"/>
                 <w:sz w:val="16"/>
               </w:rPr>
-              <w:t>NVR NeuroStation Astra 9800R/128-S</w:t>
+              <w:t>DSSL / TRASSIR</w:t>
             </w:r>
           </w:p>
         </w:tc>
@@ -3629,247 +2928,7 @@
                 <w:color w:val="000000"/>
                 <w:sz w:val="16"/>
               </w:rPr>
-              <w:t>код 80222</w:t>
-            </w:r>
-          </w:p>
-        </w:tc>
-      </w:tr>
-      <w:tr>
-        <w:tc>
-          <w:tcPr>
-            <w:tcW w:type="dxa" w:w="5103"/>
-            <w:shd w:fill="F2F2F2" w:val="clear"/>
-            <w:tcBorders>
-              <w:top w:val="single" w:sz="4" w:space="0" w:color="BFBFBF"/>
-              <w:left w:val="single" w:sz="4" w:space="0" w:color="BFBFBF"/>
-              <w:bottom w:val="single" w:sz="4" w:space="0" w:color="BFBFBF"/>
-              <w:right w:val="single" w:sz="4" w:space="0" w:color="BFBFBF"/>
-            </w:tcBorders>
-            <w:vAlign w:val="center"/>
-          </w:tcPr>
-          <w:p>
-            <w:pPr>
-              <w:spacing w:before="40" w:after="40"/>
-              <w:jc w:val="center"/>
-            </w:pPr>
-            <w:r/>
-            <w:r>
-              <w:rPr>
-                <w:rFonts w:ascii="Times New Roman" w:hAnsi="Times New Roman" w:cs="Times New Roman" w:eastAsia="Times New Roman"/>
-                <w:b w:val="0"/>
-                <w:color w:val="000000"/>
-                <w:sz w:val="16"/>
-              </w:rPr>
-              <w:t>Купол TR-D3153IR2 v2 (R)</w:t>
-            </w:r>
-          </w:p>
-        </w:tc>
-        <w:tc>
-          <w:tcPr>
-            <w:tcW w:type="dxa" w:w="5103"/>
-            <w:shd w:fill="F2F2F2" w:val="clear"/>
-            <w:tcBorders>
-              <w:top w:val="single" w:sz="4" w:space="0" w:color="BFBFBF"/>
-              <w:left w:val="single" w:sz="4" w:space="0" w:color="BFBFBF"/>
-              <w:bottom w:val="single" w:sz="4" w:space="0" w:color="BFBFBF"/>
-              <w:right w:val="single" w:sz="4" w:space="0" w:color="BFBFBF"/>
-            </w:tcBorders>
-            <w:vAlign w:val="center"/>
-          </w:tcPr>
-          <w:p>
-            <w:pPr>
-              <w:spacing w:before="40" w:after="40"/>
-              <w:jc w:val="left"/>
-            </w:pPr>
-            <w:r/>
-            <w:r>
-              <w:rPr>
-                <w:rFonts w:ascii="Times New Roman" w:hAnsi="Times New Roman" w:cs="Times New Roman" w:eastAsia="Times New Roman"/>
-                <w:b w:val="0"/>
-                <w:color w:val="000000"/>
-                <w:sz w:val="16"/>
-              </w:rPr>
-              <w:t>код 10100</w:t>
-            </w:r>
-          </w:p>
-        </w:tc>
-      </w:tr>
-      <w:tr>
-        <w:tc>
-          <w:tcPr>
-            <w:tcW w:type="dxa" w:w="5103"/>
-            <w:shd w:fill="FFFFFF" w:val="clear"/>
-            <w:tcBorders>
-              <w:top w:val="single" w:sz="4" w:space="0" w:color="BFBFBF"/>
-              <w:left w:val="single" w:sz="4" w:space="0" w:color="BFBFBF"/>
-              <w:bottom w:val="single" w:sz="4" w:space="0" w:color="BFBFBF"/>
-              <w:right w:val="single" w:sz="4" w:space="0" w:color="BFBFBF"/>
-            </w:tcBorders>
-            <w:vAlign w:val="center"/>
-          </w:tcPr>
-          <w:p>
-            <w:pPr>
-              <w:spacing w:before="40" w:after="40"/>
-              <w:jc w:val="center"/>
-            </w:pPr>
-            <w:r/>
-            <w:r>
-              <w:rPr>
-                <w:rFonts w:ascii="Times New Roman" w:hAnsi="Times New Roman" w:cs="Times New Roman" w:eastAsia="Times New Roman"/>
-                <w:b w:val="0"/>
-                <w:color w:val="000000"/>
-                <w:sz w:val="16"/>
-              </w:rPr>
-              <w:t>Цилиндр TR-D2151IR3 v2 (R)</w:t>
-            </w:r>
-          </w:p>
-        </w:tc>
-        <w:tc>
-          <w:tcPr>
-            <w:tcW w:type="dxa" w:w="5103"/>
-            <w:shd w:fill="FFFFFF" w:val="clear"/>
-            <w:tcBorders>
-              <w:top w:val="single" w:sz="4" w:space="0" w:color="BFBFBF"/>
-              <w:left w:val="single" w:sz="4" w:space="0" w:color="BFBFBF"/>
-              <w:bottom w:val="single" w:sz="4" w:space="0" w:color="BFBFBF"/>
-              <w:right w:val="single" w:sz="4" w:space="0" w:color="BFBFBF"/>
-            </w:tcBorders>
-            <w:vAlign w:val="center"/>
-          </w:tcPr>
-          <w:p>
-            <w:pPr>
-              <w:spacing w:before="40" w:after="40"/>
-              <w:jc w:val="left"/>
-            </w:pPr>
-            <w:r/>
-            <w:r>
-              <w:rPr>
-                <w:rFonts w:ascii="Times New Roman" w:hAnsi="Times New Roman" w:cs="Times New Roman" w:eastAsia="Times New Roman"/>
-                <w:b w:val="0"/>
-                <w:color w:val="000000"/>
-                <w:sz w:val="16"/>
-              </w:rPr>
-              <w:t>код 16725</w:t>
-            </w:r>
-          </w:p>
-        </w:tc>
-      </w:tr>
-      <w:tr>
-        <w:tc>
-          <w:tcPr>
-            <w:tcW w:type="dxa" w:w="5103"/>
-            <w:shd w:fill="F2F2F2" w:val="clear"/>
-            <w:tcBorders>
-              <w:top w:val="single" w:sz="4" w:space="0" w:color="BFBFBF"/>
-              <w:left w:val="single" w:sz="4" w:space="0" w:color="BFBFBF"/>
-              <w:bottom w:val="single" w:sz="4" w:space="0" w:color="BFBFBF"/>
-              <w:right w:val="single" w:sz="4" w:space="0" w:color="BFBFBF"/>
-            </w:tcBorders>
-            <w:vAlign w:val="center"/>
-          </w:tcPr>
-          <w:p>
-            <w:pPr>
-              <w:spacing w:before="40" w:after="40"/>
-              <w:jc w:val="center"/>
-            </w:pPr>
-            <w:r/>
-            <w:r>
-              <w:rPr>
-                <w:rFonts w:ascii="Times New Roman" w:hAnsi="Times New Roman" w:cs="Times New Roman" w:eastAsia="Times New Roman"/>
-                <w:b w:val="0"/>
-                <w:color w:val="000000"/>
-                <w:sz w:val="16"/>
-              </w:rPr>
-              <w:t>PTZ TR-D6124IR10 v3 (R)</w:t>
-            </w:r>
-          </w:p>
-        </w:tc>
-        <w:tc>
-          <w:tcPr>
-            <w:tcW w:type="dxa" w:w="5103"/>
-            <w:shd w:fill="F2F2F2" w:val="clear"/>
-            <w:tcBorders>
-              <w:top w:val="single" w:sz="4" w:space="0" w:color="BFBFBF"/>
-              <w:left w:val="single" w:sz="4" w:space="0" w:color="BFBFBF"/>
-              <w:bottom w:val="single" w:sz="4" w:space="0" w:color="BFBFBF"/>
-              <w:right w:val="single" w:sz="4" w:space="0" w:color="BFBFBF"/>
-            </w:tcBorders>
-            <w:vAlign w:val="center"/>
-          </w:tcPr>
-          <w:p>
-            <w:pPr>
-              <w:spacing w:before="40" w:after="40"/>
-              <w:jc w:val="left"/>
-            </w:pPr>
-            <w:r/>
-            <w:r>
-              <w:rPr>
-                <w:rFonts w:ascii="Times New Roman" w:hAnsi="Times New Roman" w:cs="Times New Roman" w:eastAsia="Times New Roman"/>
-                <w:b w:val="0"/>
-                <w:color w:val="000000"/>
-                <w:sz w:val="16"/>
-              </w:rPr>
-              <w:t>код 90684</w:t>
-            </w:r>
-          </w:p>
-        </w:tc>
-      </w:tr>
-      <w:tr>
-        <w:tc>
-          <w:tcPr>
-            <w:tcW w:type="dxa" w:w="5103"/>
-            <w:shd w:fill="FFFFFF" w:val="clear"/>
-            <w:tcBorders>
-              <w:top w:val="single" w:sz="4" w:space="0" w:color="BFBFBF"/>
-              <w:left w:val="single" w:sz="4" w:space="0" w:color="BFBFBF"/>
-              <w:bottom w:val="single" w:sz="4" w:space="0" w:color="BFBFBF"/>
-              <w:right w:val="single" w:sz="4" w:space="0" w:color="BFBFBF"/>
-            </w:tcBorders>
-            <w:vAlign w:val="center"/>
-          </w:tcPr>
-          <w:p>
-            <w:pPr>
-              <w:spacing w:before="40" w:after="40"/>
-              <w:jc w:val="center"/>
-            </w:pPr>
-            <w:r/>
-            <w:r>
-              <w:rPr>
-                <w:rFonts w:ascii="Times New Roman" w:hAnsi="Times New Roman" w:cs="Times New Roman" w:eastAsia="Times New Roman"/>
-                <w:b w:val="0"/>
-                <w:color w:val="000000"/>
-                <w:sz w:val="16"/>
-              </w:rPr>
-              <w:t>AnyIP (Astra Linux)</w:t>
-            </w:r>
-          </w:p>
-        </w:tc>
-        <w:tc>
-          <w:tcPr>
-            <w:tcW w:type="dxa" w:w="5103"/>
-            <w:shd w:fill="FFFFFF" w:val="clear"/>
-            <w:tcBorders>
-              <w:top w:val="single" w:sz="4" w:space="0" w:color="BFBFBF"/>
-              <w:left w:val="single" w:sz="4" w:space="0" w:color="BFBFBF"/>
-              <w:bottom w:val="single" w:sz="4" w:space="0" w:color="BFBFBF"/>
-              <w:right w:val="single" w:sz="4" w:space="0" w:color="BFBFBF"/>
-            </w:tcBorders>
-            <w:vAlign w:val="center"/>
-          </w:tcPr>
-          <w:p>
-            <w:pPr>
-              <w:spacing w:before="40" w:after="40"/>
-              <w:jc w:val="left"/>
-            </w:pPr>
-            <w:r/>
-            <w:r>
-              <w:rPr>
-                <w:rFonts w:ascii="Times New Roman" w:hAnsi="Times New Roman" w:cs="Times New Roman" w:eastAsia="Times New Roman"/>
-                <w:b w:val="0"/>
-                <w:color w:val="000000"/>
-                <w:sz w:val="16"/>
-              </w:rPr>
-              <w:t>код 95887</w:t>
+              <w:t>8 (800) 100-91-12, dssl.ru, NVR код 80222</w:t>
             </w:r>
           </w:p>
         </w:tc>
@@ -3939,7 +2998,7 @@
         <w:color w:val="595959"/>
         <w:sz w:val="16"/>
       </w:rPr>
-      <w:t xml:space="preserve">КП-2026-08-14-001  ·  ориентировочный расчёт  ·  цены с НДС 22%  ·  стр. </w:t>
+      <w:t xml:space="preserve">КП-2026-08-14-001 ред. 4  ·  две заявки ЭТП ГПБ  ·  цены с НДС 22%  ·  стр. </w:t>
     </w:r>
     <w:r>
       <w:rPr>

</xml_diff>